<commit_message>
docs: reflect CivicRecords org transfer
</commit_message>
<xml_diff>
--- a/USER-MANUAL.docx
+++ b/USER-MANUAL.docx
@@ -70,7 +70,7 @@
     </w:p>
     <w:p>
       <w:r>
-        <w:t>- **civicrecords-ai v1.4.0** — a working, shipping module for managing public records / FOIA requests. Cities can install this today. Repo: &lt;https://github.com/scottconverse/civicrecords-ai&gt;.</w:t>
+        <w:t>- **civicrecords-ai v1.4.0** — a working, shipping module for managing public records / FOIA requests. Cities can install this today. Repo: &lt;https://github.com/CivicSuite/civicrecords-ai&gt;.</w:t>
         <w:br/>
         <w:t>- **civiccore v0.2.0** — the shared "platform" package that every module uses. It is what the records module is built on. As of v0.2.0 it includes a shared LLM (large-language-model) abstraction layer. It is not a product on its own; you only "install" it as a dependency of a module. Repo: &lt;https://github.com/CivicSuite/civiccore&gt;.</w:t>
       </w:r>
@@ -197,7 +197,7 @@
         <w:br/>
         <w:t>|---|---|---|</w:t>
         <w:br/>
-        <w:t>| civicrecords-ai | &lt;https://github.com/scottconverse/civicrecords-ai&gt; | Shipping v1.4.0. Will be transferred to the `CivicSuite` GitHub org at a future date — until then, the canonical home is `scottconverse/civicrecords-ai`. |</w:t>
+        <w:t>| civicrecords-ai | &lt;https://github.com/CivicSuite/civicrecords-ai&gt; | Shipping v1.4.0. Transferred to the `CivicSuite` GitHub org on 2026-04-25; this is now the canonical home. |</w:t>
         <w:br/>
         <w:t>| civiccore | &lt;https://github.com/CivicSuite/civiccore&gt; | Shipping v0.2.0. Phase 2 (LLM module) just landed. |</w:t>
         <w:br/>
@@ -313,6 +313,11 @@
       </w:pPr>
       <w:r>
         <w:t>Part 3 — Architecture reference</w:t>
+      </w:r>
+    </w:p>
+    <w:p>
+      <w:r>
+        <w:t>![CivicSuite umbrella architecture](docs/diagrams/suite-architecture.svg)</w:t>
       </w:r>
     </w:p>
     <w:p>

</xml_diff>

<commit_message>
docs: embed suite architecture diagram in USER-MANUAL deliverables
Extends gen-user-manual.py to honor markdown image references and
embed PNG variants (SVG fallback) into both DOCX and PDF outputs.

Co-Authored-By: Claude Opus 4.7 (1M context) <noreply@anthropic.com>
</commit_message>
<xml_diff>
--- a/USER-MANUAL.docx
+++ b/USER-MANUAL.docx
@@ -317,7 +317,38 @@
     </w:p>
     <w:p>
       <w:r>
-        <w:t>![CivicSuite umbrella architecture](docs/diagrams/suite-architecture.svg)</w:t>
+        <w:drawing>
+          <wp:inline xmlns:a="http://schemas.openxmlformats.org/drawingml/2006/main" xmlns:pic="http://schemas.openxmlformats.org/drawingml/2006/picture">
+            <wp:extent cx="5486400" cy="2372308"/>
+            <wp:docPr id="1" name="Picture 1"/>
+            <wp:cNvGraphicFramePr>
+              <a:graphicFrameLocks noChangeAspect="1"/>
+            </wp:cNvGraphicFramePr>
+            <a:graphic>
+              <a:graphicData uri="http://schemas.openxmlformats.org/drawingml/2006/picture">
+                <pic:pic>
+                  <pic:nvPicPr>
+                    <pic:cNvPr id="0" name="suite-architecture.png"/>
+                    <pic:cNvPicPr/>
+                  </pic:nvPicPr>
+                  <pic:blipFill>
+                    <a:blip r:embed="rId9"/>
+                    <a:stretch>
+                      <a:fillRect/>
+                    </a:stretch>
+                  </pic:blipFill>
+                  <pic:spPr>
+                    <a:xfrm>
+                      <a:off x="0" y="0"/>
+                      <a:ext cx="5486400" cy="2372308"/>
+                    </a:xfrm>
+                    <a:prstGeom prst="rect"/>
+                  </pic:spPr>
+                </pic:pic>
+              </a:graphicData>
+            </a:graphic>
+          </wp:inline>
+        </w:drawing>
       </w:r>
     </w:p>
     <w:p>

</xml_diff>

<commit_message>
docs: architecture graphics and CivicRecords org transfer (#4)
* docs(governance): add civicrecords-ai org transfer runbook

* docs: reflect CivicRecords org transfer

* docs: embed suite architecture diagram in USER-MANUAL deliverables

Extends gen-user-manual.py to honor markdown image references and
embed PNG variants (SVG fallback) into both DOCX and PDF outputs.

Co-Authored-By: Claude Opus 4.7 (1M context) <noreply@anthropic.com>

---------

Co-authored-by: Scott Converse <scott@civicsuite.local>
Co-authored-by: Claude Opus 4.7 (1M context) <noreply@anthropic.com>
</commit_message>
<xml_diff>
--- a/USER-MANUAL.docx
+++ b/USER-MANUAL.docx
@@ -70,7 +70,7 @@
     </w:p>
     <w:p>
       <w:r>
-        <w:t>- **civicrecords-ai v1.4.0** — a working, shipping module for managing public records / FOIA requests. Cities can install this today. Repo: &lt;https://github.com/scottconverse/civicrecords-ai&gt;.</w:t>
+        <w:t>- **civicrecords-ai v1.4.0** — a working, shipping module for managing public records / FOIA requests. Cities can install this today. Repo: &lt;https://github.com/CivicSuite/civicrecords-ai&gt;.</w:t>
         <w:br/>
         <w:t>- **civiccore v0.2.0** — the shared "platform" package that every module uses. It is what the records module is built on. As of v0.2.0 it includes a shared LLM (large-language-model) abstraction layer. It is not a product on its own; you only "install" it as a dependency of a module. Repo: &lt;https://github.com/CivicSuite/civiccore&gt;.</w:t>
       </w:r>
@@ -197,7 +197,7 @@
         <w:br/>
         <w:t>|---|---|---|</w:t>
         <w:br/>
-        <w:t>| civicrecords-ai | &lt;https://github.com/scottconverse/civicrecords-ai&gt; | Shipping v1.4.0. Will be transferred to the `CivicSuite` GitHub org at a future date — until then, the canonical home is `scottconverse/civicrecords-ai`. |</w:t>
+        <w:t>| civicrecords-ai | &lt;https://github.com/CivicSuite/civicrecords-ai&gt; | Shipping v1.4.0. Transferred to the `CivicSuite` GitHub org on 2026-04-25; this is now the canonical home. |</w:t>
         <w:br/>
         <w:t>| civiccore | &lt;https://github.com/CivicSuite/civiccore&gt; | Shipping v0.2.0. Phase 2 (LLM module) just landed. |</w:t>
         <w:br/>
@@ -313,6 +313,42 @@
       </w:pPr>
       <w:r>
         <w:t>Part 3 — Architecture reference</w:t>
+      </w:r>
+    </w:p>
+    <w:p>
+      <w:r>
+        <w:drawing>
+          <wp:inline xmlns:a="http://schemas.openxmlformats.org/drawingml/2006/main" xmlns:pic="http://schemas.openxmlformats.org/drawingml/2006/picture">
+            <wp:extent cx="5486400" cy="2372308"/>
+            <wp:docPr id="1" name="Picture 1"/>
+            <wp:cNvGraphicFramePr>
+              <a:graphicFrameLocks noChangeAspect="1"/>
+            </wp:cNvGraphicFramePr>
+            <a:graphic>
+              <a:graphicData uri="http://schemas.openxmlformats.org/drawingml/2006/picture">
+                <pic:pic>
+                  <pic:nvPicPr>
+                    <pic:cNvPr id="0" name="suite-architecture.png"/>
+                    <pic:cNvPicPr/>
+                  </pic:nvPicPr>
+                  <pic:blipFill>
+                    <a:blip r:embed="rId9"/>
+                    <a:stretch>
+                      <a:fillRect/>
+                    </a:stretch>
+                  </pic:blipFill>
+                  <pic:spPr>
+                    <a:xfrm>
+                      <a:off x="0" y="0"/>
+                      <a:ext cx="5486400" cy="2372308"/>
+                    </a:xfrm>
+                    <a:prstGeom prst="rect"/>
+                  </pic:spPr>
+                </pic:pic>
+              </a:graphicData>
+            </a:graphic>
+          </wp:inline>
+        </w:drawing>
       </w:r>
     </w:p>
     <w:p>

</xml_diff>

<commit_message>
docs: register CivicClerk scaffold
</commit_message>
<xml_diff>
--- a/USER-MANUAL.docx
+++ b/USER-MANUAL.docx
@@ -80,13 +80,24 @@
         <w:pStyle w:val="Heading3"/>
       </w:pPr>
       <w:r>
+        <w:t>What's scaffolded but not installable yet</w:t>
+      </w:r>
+    </w:p>
+    <w:p>
+      <w:r>
+        <w:t>- **civicclerk** — meetings, agendas, packets, minutes, voting, and sunshine-law compliance. Repo scaffolded at &lt;https://github.com/CivicSuite/civicclerk&gt;; no runtime app or release yet.</w:t>
+      </w:r>
+    </w:p>
+    <w:p>
+      <w:pPr>
+        <w:pStyle w:val="Heading3"/>
+      </w:pPr>
+      <w:r>
         <w:t>What's planned but not started</w:t>
       </w:r>
     </w:p>
     <w:p>
       <w:r>
-        <w:t>- **civicclerk** — meetings, agendas, packets, minutes, voting, and sunshine-law compliance. Spec drafted, no code yet.</w:t>
-        <w:br/>
         <w:t>- **civiczone** — zoning code and parcel-aware planner workflows. Spec drafted, no code yet.</w:t>
         <w:br/>
         <w:t>- Twenty-plus additional modules across seven tiers — see the [module catalog](specs/01_catalog.md).</w:t>
@@ -201,7 +212,9 @@
         <w:br/>
         <w:t>| civiccore | &lt;https://github.com/CivicSuite/civiccore&gt; | Shipping v0.2.0. Phase 2 (LLM module) just landed. |</w:t>
         <w:br/>
-        <w:t>| civicclerk, civiczone, etc. | not created yet | Specs only. |</w:t>
+        <w:t>| civicclerk | &lt;https://github.com/CivicSuite/civicclerk&gt; | Scaffolded; documentation baseline only. |</w:t>
+        <w:br/>
+        <w:t>| civiczone, etc. | not created yet | Specs only. |</w:t>
       </w:r>
     </w:p>
     <w:p>
@@ -426,7 +439,7 @@
         <w:br/>
         <w:t xml:space="preserve">   | civicrecords-ai     |   |   civicclerk     |   |   civiczone      |</w:t>
         <w:br/>
-        <w:t xml:space="preserve">   |   v1.4.0 SHIPPING   |   |  PLANNED         |   |  PLANNED         |</w:t>
+        <w:t xml:space="preserve">   |   v1.4.0 SHIPPING   |   |  SCAFFOLDED      |   |  PLANNED         |</w:t>
         <w:br/>
         <w:t xml:space="preserve">   |   FOIA / public     |   |  meetings,       |   |  zoning, parcel  |</w:t>
         <w:br/>

</xml_diff>

<commit_message>
docs: register CivicClerk scaffold (#6)
Co-authored-by: Scott Converse <scott@civicsuite.local>
</commit_message>
<xml_diff>
--- a/USER-MANUAL.docx
+++ b/USER-MANUAL.docx
@@ -80,13 +80,24 @@
         <w:pStyle w:val="Heading3"/>
       </w:pPr>
       <w:r>
+        <w:t>What's scaffolded but not installable yet</w:t>
+      </w:r>
+    </w:p>
+    <w:p>
+      <w:r>
+        <w:t>- **civicclerk** — meetings, agendas, packets, minutes, voting, and sunshine-law compliance. Repo scaffolded at &lt;https://github.com/CivicSuite/civicclerk&gt;; no runtime app or release yet.</w:t>
+      </w:r>
+    </w:p>
+    <w:p>
+      <w:pPr>
+        <w:pStyle w:val="Heading3"/>
+      </w:pPr>
+      <w:r>
         <w:t>What's planned but not started</w:t>
       </w:r>
     </w:p>
     <w:p>
       <w:r>
-        <w:t>- **civicclerk** — meetings, agendas, packets, minutes, voting, and sunshine-law compliance. Spec drafted, no code yet.</w:t>
-        <w:br/>
         <w:t>- **civiczone** — zoning code and parcel-aware planner workflows. Spec drafted, no code yet.</w:t>
         <w:br/>
         <w:t>- Twenty-plus additional modules across seven tiers — see the [module catalog](specs/01_catalog.md).</w:t>
@@ -201,7 +212,9 @@
         <w:br/>
         <w:t>| civiccore | &lt;https://github.com/CivicSuite/civiccore&gt; | Shipping v0.2.0. Phase 2 (LLM module) just landed. |</w:t>
         <w:br/>
-        <w:t>| civicclerk, civiczone, etc. | not created yet | Specs only. |</w:t>
+        <w:t>| civicclerk | &lt;https://github.com/CivicSuite/civicclerk&gt; | Scaffolded; documentation baseline only. |</w:t>
+        <w:br/>
+        <w:t>| civiczone, etc. | not created yet | Specs only. |</w:t>
       </w:r>
     </w:p>
     <w:p>
@@ -426,7 +439,7 @@
         <w:br/>
         <w:t xml:space="preserve">   | civicrecords-ai     |   |   civicclerk     |   |   civiczone      |</w:t>
         <w:br/>
-        <w:t xml:space="preserve">   |   v1.4.0 SHIPPING   |   |  PLANNED         |   |  PLANNED         |</w:t>
+        <w:t xml:space="preserve">   |   v1.4.0 SHIPPING   |   |  SCAFFOLDED      |   |  PLANNED         |</w:t>
         <w:br/>
         <w:t xml:space="preserve">   |   FOIA / public     |   |  meetings,       |   |  zoning, parcel  |</w:t>
         <w:br/>

</xml_diff>

<commit_message>
docs(compat): record CivicClerk v0.1.0 release
</commit_message>
<xml_diff>
--- a/USER-MANUAL.docx
+++ b/USER-MANUAL.docx
@@ -65,7 +65,7 @@
         <w:pStyle w:val="Heading3"/>
       </w:pPr>
       <w:r>
-        <w:t>What's available today (as of 2026-04-25)</w:t>
+        <w:t>What's available today (as of 2026-04-27)</w:t>
       </w:r>
     </w:p>
     <w:p>
@@ -73,19 +73,8 @@
         <w:t>- **civicrecords-ai v1.4.0** — a working, shipping module for managing public records / FOIA requests. Cities can install this today. Repo: &lt;https://github.com/CivicSuite/civicrecords-ai&gt;.</w:t>
         <w:br/>
         <w:t>- **civiccore v0.2.0** — the shared "platform" package that every module uses. It is what the records module is built on. As of v0.2.0 it includes a shared LLM (large-language-model) abstraction layer. It is not a product on its own; you only "install" it as a dependency of a module. Repo: &lt;https://github.com/CivicSuite/civiccore&gt;.</w:t>
-      </w:r>
-    </w:p>
-    <w:p>
-      <w:pPr>
-        <w:pStyle w:val="Heading3"/>
-      </w:pPr>
-      <w:r>
-        <w:t>What's scaffolded but not installable yet</w:t>
-      </w:r>
-    </w:p>
-    <w:p>
-      <w:r>
-        <w:t>- **civicclerk** — meetings, agendas, packets, minutes, voting, and sunshine-law compliance. Repo scaffolded at &lt;https://github.com/CivicSuite/civicclerk&gt;; no runtime app or release yet.</w:t>
+        <w:br/>
+        <w:t>- **civicclerk v0.1.0** — a runtime-foundation release for meetings, agendas, packets, minutes, voting, and sunshine-law compliance. It ships the API/schema foundation and compliance guardrails; full workflow UI screens are still planned. Repo: &lt;https://github.com/CivicSuite/civicclerk&gt;.</w:t>
       </w:r>
     </w:p>
     <w:p>
@@ -212,7 +201,7 @@
         <w:br/>
         <w:t>| civiccore | &lt;https://github.com/CivicSuite/civiccore&gt; | Shipping v0.2.0. Phase 2 (LLM module) just landed. |</w:t>
         <w:br/>
-        <w:t>| civicclerk | &lt;https://github.com/CivicSuite/civicclerk&gt; | Scaffolded; documentation baseline only. |</w:t>
+        <w:t>| civicclerk | &lt;https://github.com/CivicSuite/civicclerk&gt; | Shipping v0.1.0 runtime foundation. |</w:t>
         <w:br/>
         <w:t>| civiczone, etc. | not created yet | Specs only. |</w:t>
       </w:r>
@@ -332,7 +321,7 @@
       <w:r>
         <w:drawing>
           <wp:inline xmlns:a="http://schemas.openxmlformats.org/drawingml/2006/main" xmlns:pic="http://schemas.openxmlformats.org/drawingml/2006/picture">
-            <wp:extent cx="5486400" cy="2372308"/>
+            <wp:extent cx="5486400" cy="2323322"/>
             <wp:docPr id="1" name="Picture 1"/>
             <wp:cNvGraphicFramePr>
               <a:graphicFrameLocks noChangeAspect="1"/>
@@ -353,7 +342,7 @@
                   <pic:spPr>
                     <a:xfrm>
                       <a:off x="0" y="0"/>
-                      <a:ext cx="5486400" cy="2372308"/>
+                      <a:ext cx="5486400" cy="2323322"/>
                     </a:xfrm>
                     <a:prstGeom prst="rect"/>
                   </pic:spPr>
@@ -439,7 +428,7 @@
         <w:br/>
         <w:t xml:space="preserve">   | civicrecords-ai     |   |   civicclerk     |   |   civiczone      |</w:t>
         <w:br/>
-        <w:t xml:space="preserve">   |   v1.4.0 SHIPPING   |   |  SCAFFOLDED      |   |  PLANNED         |</w:t>
+        <w:t xml:space="preserve">   |   v1.4.0 SHIPPING   |   | v0.1.0 SHIPPING  |   |  PLANNED         |</w:t>
         <w:br/>
         <w:t xml:space="preserve">   |   FOIA / public     |   |  meetings,       |   |  zoning, parcel  |</w:t>
         <w:br/>

</xml_diff>

<commit_message>
docs(compat): record CivicClerk v0.1.0 release (#10)
Co-authored-by: Scott Converse <scott@civicsuite.local>
</commit_message>
<xml_diff>
--- a/USER-MANUAL.docx
+++ b/USER-MANUAL.docx
@@ -65,7 +65,7 @@
         <w:pStyle w:val="Heading3"/>
       </w:pPr>
       <w:r>
-        <w:t>What's available today (as of 2026-04-25)</w:t>
+        <w:t>What's available today (as of 2026-04-27)</w:t>
       </w:r>
     </w:p>
     <w:p>
@@ -73,19 +73,8 @@
         <w:t>- **civicrecords-ai v1.4.0** — a working, shipping module for managing public records / FOIA requests. Cities can install this today. Repo: &lt;https://github.com/CivicSuite/civicrecords-ai&gt;.</w:t>
         <w:br/>
         <w:t>- **civiccore v0.2.0** — the shared "platform" package that every module uses. It is what the records module is built on. As of v0.2.0 it includes a shared LLM (large-language-model) abstraction layer. It is not a product on its own; you only "install" it as a dependency of a module. Repo: &lt;https://github.com/CivicSuite/civiccore&gt;.</w:t>
-      </w:r>
-    </w:p>
-    <w:p>
-      <w:pPr>
-        <w:pStyle w:val="Heading3"/>
-      </w:pPr>
-      <w:r>
-        <w:t>What's scaffolded but not installable yet</w:t>
-      </w:r>
-    </w:p>
-    <w:p>
-      <w:r>
-        <w:t>- **civicclerk** — meetings, agendas, packets, minutes, voting, and sunshine-law compliance. Repo scaffolded at &lt;https://github.com/CivicSuite/civicclerk&gt;; no runtime app or release yet.</w:t>
+        <w:br/>
+        <w:t>- **civicclerk v0.1.0** — a runtime-foundation release for meetings, agendas, packets, minutes, voting, and sunshine-law compliance. It ships the API/schema foundation and compliance guardrails; full workflow UI screens are still planned. Repo: &lt;https://github.com/CivicSuite/civicclerk&gt;.</w:t>
       </w:r>
     </w:p>
     <w:p>
@@ -212,7 +201,7 @@
         <w:br/>
         <w:t>| civiccore | &lt;https://github.com/CivicSuite/civiccore&gt; | Shipping v0.2.0. Phase 2 (LLM module) just landed. |</w:t>
         <w:br/>
-        <w:t>| civicclerk | &lt;https://github.com/CivicSuite/civicclerk&gt; | Scaffolded; documentation baseline only. |</w:t>
+        <w:t>| civicclerk | &lt;https://github.com/CivicSuite/civicclerk&gt; | Shipping v0.1.0 runtime foundation. |</w:t>
         <w:br/>
         <w:t>| civiczone, etc. | not created yet | Specs only. |</w:t>
       </w:r>
@@ -332,7 +321,7 @@
       <w:r>
         <w:drawing>
           <wp:inline xmlns:a="http://schemas.openxmlformats.org/drawingml/2006/main" xmlns:pic="http://schemas.openxmlformats.org/drawingml/2006/picture">
-            <wp:extent cx="5486400" cy="2372308"/>
+            <wp:extent cx="5486400" cy="2323322"/>
             <wp:docPr id="1" name="Picture 1"/>
             <wp:cNvGraphicFramePr>
               <a:graphicFrameLocks noChangeAspect="1"/>
@@ -353,7 +342,7 @@
                   <pic:spPr>
                     <a:xfrm>
                       <a:off x="0" y="0"/>
-                      <a:ext cx="5486400" cy="2372308"/>
+                      <a:ext cx="5486400" cy="2323322"/>
                     </a:xfrm>
                     <a:prstGeom prst="rect"/>
                   </pic:spPr>
@@ -439,7 +428,7 @@
         <w:br/>
         <w:t xml:space="preserve">   | civicrecords-ai     |   |   civicclerk     |   |   civiczone      |</w:t>
         <w:br/>
-        <w:t xml:space="preserve">   |   v1.4.0 SHIPPING   |   |  SCAFFOLDED      |   |  PLANNED         |</w:t>
+        <w:t xml:space="preserve">   |   v1.4.0 SHIPPING   |   | v0.1.0 SHIPPING  |   |  PLANNED         |</w:t>
         <w:br/>
         <w:t xml:space="preserve">   |   FOIA / public     |   |  meetings,       |   |  zoning, parcel  |</w:t>
         <w:br/>

</xml_diff>

<commit_message>
docs: reflect CivicClerk staff UI foundation
</commit_message>
<xml_diff>
--- a/USER-MANUAL.docx
+++ b/USER-MANUAL.docx
@@ -74,7 +74,7 @@
         <w:br/>
         <w:t>- **civiccore v0.2.0** — the shared "platform" package that every module uses. It is what the records module is built on. As of v0.2.0 it includes a shared LLM (large-language-model) abstraction layer. It is not a product on its own; you only "install" it as a dependency of a module. Repo: &lt;https://github.com/CivicSuite/civiccore&gt;.</w:t>
         <w:br/>
-        <w:t>- **civicclerk v0.1.0** — a runtime-foundation release for meetings, agendas, packets, minutes, voting, and sunshine-law compliance. It ships the API/schema foundation and compliance guardrails; full workflow UI screens are still planned. Repo: &lt;https://github.com/CivicSuite/civicclerk&gt;.</w:t>
+        <w:t>- **civicclerk v0.1.0** — a runtime-foundation release for meetings, agendas, packets, minutes, voting, and sunshine-law compliance. It ships the API/schema foundation, compliance guardrails, and a browser-visible staff workflow foundation at `/staff`; full database-backed workflow screens are still planned. Repo: &lt;https://github.com/CivicSuite/civicclerk&gt;.</w:t>
       </w:r>
     </w:p>
     <w:p>
@@ -201,7 +201,7 @@
         <w:br/>
         <w:t>| civiccore | &lt;https://github.com/CivicSuite/civiccore&gt; | Shipping v0.2.0. Phase 2 (LLM module) just landed. |</w:t>
         <w:br/>
-        <w:t>| civicclerk | &lt;https://github.com/CivicSuite/civicclerk&gt; | Shipping v0.1.0 runtime foundation. |</w:t>
+        <w:t>| civicclerk | &lt;https://github.com/CivicSuite/civicclerk&gt; | Shipping v0.1.0 runtime foundation with `/staff` workflow UI foundation. |</w:t>
         <w:br/>
         <w:t>| civiczone, etc. | not created yet | Specs only. |</w:t>
       </w:r>

</xml_diff>

<commit_message>
docs: reflect CivicClerk staff UI foundation (#11)
Co-authored-by: Scott Converse <scott@civicsuite.local>
</commit_message>
<xml_diff>
--- a/USER-MANUAL.docx
+++ b/USER-MANUAL.docx
@@ -74,7 +74,7 @@
         <w:br/>
         <w:t>- **civiccore v0.2.0** — the shared "platform" package that every module uses. It is what the records module is built on. As of v0.2.0 it includes a shared LLM (large-language-model) abstraction layer. It is not a product on its own; you only "install" it as a dependency of a module. Repo: &lt;https://github.com/CivicSuite/civiccore&gt;.</w:t>
         <w:br/>
-        <w:t>- **civicclerk v0.1.0** — a runtime-foundation release for meetings, agendas, packets, minutes, voting, and sunshine-law compliance. It ships the API/schema foundation and compliance guardrails; full workflow UI screens are still planned. Repo: &lt;https://github.com/CivicSuite/civicclerk&gt;.</w:t>
+        <w:t>- **civicclerk v0.1.0** — a runtime-foundation release for meetings, agendas, packets, minutes, voting, and sunshine-law compliance. It ships the API/schema foundation, compliance guardrails, and a browser-visible staff workflow foundation at `/staff`; full database-backed workflow screens are still planned. Repo: &lt;https://github.com/CivicSuite/civicclerk&gt;.</w:t>
       </w:r>
     </w:p>
     <w:p>
@@ -201,7 +201,7 @@
         <w:br/>
         <w:t>| civiccore | &lt;https://github.com/CivicSuite/civiccore&gt; | Shipping v0.2.0. Phase 2 (LLM module) just landed. |</w:t>
         <w:br/>
-        <w:t>| civicclerk | &lt;https://github.com/CivicSuite/civicclerk&gt; | Shipping v0.1.0 runtime foundation. |</w:t>
+        <w:t>| civicclerk | &lt;https://github.com/CivicSuite/civicclerk&gt; | Shipping v0.1.0 runtime foundation with `/staff` workflow UI foundation. |</w:t>
         <w:br/>
         <w:t>| civiczone, etc. | not created yet | Specs only. |</w:t>
       </w:r>

</xml_diff>

<commit_message>
docs: set CivicCode as next module lane
</commit_message>
<xml_diff>
--- a/USER-MANUAL.docx
+++ b/USER-MANUAL.docx
@@ -87,6 +87,8 @@
     </w:p>
     <w:p>
       <w:r>
+        <w:t>- **civiccode** — municipal code and ordinance access. This is the next planning lane because CivicZone needs an authoritative code-section contract before zoning runtime work begins.</w:t>
+        <w:br/>
         <w:t>- **civiczone** — zoning code and parcel-aware planner workflows. Spec drafted, no code yet.</w:t>
         <w:br/>
         <w:t>- Twenty-plus additional modules across seven tiers — see the [module catalog](specs/01_catalog.md).</w:t>
@@ -202,6 +204,8 @@
         <w:t>| civiccore | &lt;https://github.com/CivicSuite/civiccore&gt; | Shipping v0.2.0. Phase 2 (LLM module) just landed. |</w:t>
         <w:br/>
         <w:t>| civicclerk | &lt;https://github.com/CivicSuite/civicclerk&gt; | Shipping v0.1.0 runtime foundation with `/staff` workflow UI foundation. |</w:t>
+        <w:br/>
+        <w:t>| civiccode | not created yet | Next planning lane; no runtime code. |</w:t>
         <w:br/>
         <w:t>| civiczone, etc. | not created yet | Specs only. |</w:t>
       </w:r>

</xml_diff>

<commit_message>
docs: set CivicCode as next module lane (#12)
Co-authored-by: Scott Converse <scott@civicsuite.local>
</commit_message>
<xml_diff>
--- a/USER-MANUAL.docx
+++ b/USER-MANUAL.docx
@@ -87,6 +87,8 @@
     </w:p>
     <w:p>
       <w:r>
+        <w:t>- **civiccode** — municipal code and ordinance access. This is the next planning lane because CivicZone needs an authoritative code-section contract before zoning runtime work begins.</w:t>
+        <w:br/>
         <w:t>- **civiczone** — zoning code and parcel-aware planner workflows. Spec drafted, no code yet.</w:t>
         <w:br/>
         <w:t>- Twenty-plus additional modules across seven tiers — see the [module catalog](specs/01_catalog.md).</w:t>
@@ -202,6 +204,8 @@
         <w:t>| civiccore | &lt;https://github.com/CivicSuite/civiccore&gt; | Shipping v0.2.0. Phase 2 (LLM module) just landed. |</w:t>
         <w:br/>
         <w:t>| civicclerk | &lt;https://github.com/CivicSuite/civicclerk&gt; | Shipping v0.1.0 runtime foundation with `/staff` workflow UI foundation. |</w:t>
+        <w:br/>
+        <w:t>| civiccode | not created yet | Next planning lane; no runtime code. |</w:t>
         <w:br/>
         <w:t>| civiczone, etc. | not created yet | Specs only. |</w:t>
       </w:r>

</xml_diff>

<commit_message>
docs: register CivicCode scaffold
</commit_message>
<xml_diff>
--- a/USER-MANUAL.docx
+++ b/USER-MANUAL.docx
@@ -87,7 +87,7 @@
     </w:p>
     <w:p>
       <w:r>
-        <w:t>- **civiccode** — municipal code and ordinance access. This is the next planning lane because CivicZone needs an authoritative code-section contract before zoning runtime work begins.</w:t>
+        <w:t>- **civiccode** — municipal code and ordinance access. The repo exists as a scaffold with Milestone 0 planning complete; no runtime code has shipped. This is the next planning lane because CivicZone needs an authoritative code-section contract before zoning runtime work begins.</w:t>
         <w:br/>
         <w:t>- **civiczone** — zoning code and parcel-aware planner workflows. Spec drafted, no code yet.</w:t>
         <w:br/>
@@ -205,7 +205,7 @@
         <w:br/>
         <w:t>| civicclerk | &lt;https://github.com/CivicSuite/civicclerk&gt; | Shipping v0.1.0 runtime foundation with `/staff` workflow UI foundation. |</w:t>
         <w:br/>
-        <w:t>| civiccode | not created yet | Next planning lane; no runtime code. |</w:t>
+        <w:t>| civiccode | &lt;https://github.com/CivicSuite/civiccode&gt; | Scaffold + Milestone 0 planning complete; no runtime code. |</w:t>
         <w:br/>
         <w:t>| civiczone, etc. | not created yet | Specs only. |</w:t>
       </w:r>

</xml_diff>

<commit_message>
docs: register CivicCode scaffold (#13)
Co-authored-by: Scott Converse <scott@civicsuite.local>
</commit_message>
<xml_diff>
--- a/USER-MANUAL.docx
+++ b/USER-MANUAL.docx
@@ -87,7 +87,7 @@
     </w:p>
     <w:p>
       <w:r>
-        <w:t>- **civiccode** — municipal code and ordinance access. This is the next planning lane because CivicZone needs an authoritative code-section contract before zoning runtime work begins.</w:t>
+        <w:t>- **civiccode** — municipal code and ordinance access. The repo exists as a scaffold with Milestone 0 planning complete; no runtime code has shipped. This is the next planning lane because CivicZone needs an authoritative code-section contract before zoning runtime work begins.</w:t>
         <w:br/>
         <w:t>- **civiczone** — zoning code and parcel-aware planner workflows. Spec drafted, no code yet.</w:t>
         <w:br/>
@@ -205,7 +205,7 @@
         <w:br/>
         <w:t>| civicclerk | &lt;https://github.com/CivicSuite/civicclerk&gt; | Shipping v0.1.0 runtime foundation with `/staff` workflow UI foundation. |</w:t>
         <w:br/>
-        <w:t>| civiccode | not created yet | Next planning lane; no runtime code. |</w:t>
+        <w:t>| civiccode | &lt;https://github.com/CivicSuite/civiccode&gt; | Scaffold + Milestone 0 planning complete; no runtime code. |</w:t>
         <w:br/>
         <w:t>| civiczone, etc. | not created yet | Specs only. |</w:t>
       </w:r>

</xml_diff>

<commit_message>
docs: update CivicCode v0.1.0 compatibility state
</commit_message>
<xml_diff>
--- a/USER-MANUAL.docx
+++ b/USER-MANUAL.docx
@@ -57,7 +57,7 @@
     </w:p>
     <w:p>
       <w:r>
-        <w:t>Today, only one module is shipping. The rest are either in early-platform stage or planned. We say so plainly below — no roadmap inflation, no vaporware.</w:t>
+        <w:t>Today, multiple modules are shipping at different maturity levels: CivicRecords AI is production-usable, while CivicClerk and CivicCode have runtime-foundation releases. The rest are planned. We say so plainly below — no roadmap inflation, no vaporware.</w:t>
       </w:r>
     </w:p>
     <w:p>
@@ -75,6 +75,8 @@
         <w:t>- **civiccore v0.2.0** — the shared "platform" package that every module uses. It is what the records module is built on. As of v0.2.0 it includes a shared LLM (large-language-model) abstraction layer. It is not a product on its own; you only "install" it as a dependency of a module. Repo: &lt;https://github.com/CivicSuite/civiccore&gt;.</w:t>
         <w:br/>
         <w:t>- **civicclerk v0.1.0** — a runtime-foundation release for meetings, agendas, packets, minutes, voting, and sunshine-law compliance. It ships the API/schema foundation, compliance guardrails, and a browser-visible staff workflow foundation at `/staff`; full database-backed workflow screens are still planned. Repo: &lt;https://github.com/CivicSuite/civicclerk&gt;.</w:t>
+        <w:br/>
+        <w:t>- **civiccode v0.1.0** — a runtime-foundation release for municipal code and ordinance access. It ships source registry, section/version lifecycle, search and permalinks, deterministic citations, citation-grounded Q&amp;A, staff notes, plain-language summaries, CivicClerk handoff intake, resident lookup pages, local import connectors, and records-ready exports. It still does not ship legal advice, live LLM calls, live codifier sync, or automatic ordinance codification. Repo: &lt;https://github.com/CivicSuite/civiccode&gt;.</w:t>
       </w:r>
     </w:p>
     <w:p>
@@ -87,8 +89,6 @@
     </w:p>
     <w:p>
       <w:r>
-        <w:t>- **civiccode** — municipal code and ordinance access. The repo exists as a scaffold with Milestone 0 planning complete; no runtime code has shipped. This is the next planning lane because CivicZone needs an authoritative code-section contract before zoning runtime work begins.</w:t>
-        <w:br/>
         <w:t>- **civiczone** — zoning code and parcel-aware planner workflows. Spec drafted, no code yet.</w:t>
         <w:br/>
         <w:t>- Twenty-plus additional modules across seven tiers — see the [module catalog](specs/01_catalog.md).</w:t>
@@ -205,7 +205,7 @@
         <w:br/>
         <w:t>| civicclerk | &lt;https://github.com/CivicSuite/civicclerk&gt; | Shipping v0.1.0 runtime foundation with `/staff` workflow UI foundation. |</w:t>
         <w:br/>
-        <w:t>| civiccode | &lt;https://github.com/CivicSuite/civiccode&gt; | Scaffold + Milestone 0 planning complete; no runtime code. |</w:t>
+        <w:t>| civiccode | &lt;https://github.com/CivicSuite/civiccode&gt; | Shipping v0.1.0 runtime foundation for municipal-code lookup, citations, local imports, and records-ready exports. |</w:t>
         <w:br/>
         <w:t>| civiczone, etc. | not created yet | Specs only. |</w:t>
       </w:r>

</xml_diff>

<commit_message>
docs: update CivicCode v0.1.0 compatibility state (#14)
Co-authored-by: Scott Converse <scott@civicsuite.local>
</commit_message>
<xml_diff>
--- a/USER-MANUAL.docx
+++ b/USER-MANUAL.docx
@@ -57,7 +57,7 @@
     </w:p>
     <w:p>
       <w:r>
-        <w:t>Today, only one module is shipping. The rest are either in early-platform stage or planned. We say so plainly below — no roadmap inflation, no vaporware.</w:t>
+        <w:t>Today, multiple modules are shipping at different maturity levels: CivicRecords AI is production-usable, while CivicClerk and CivicCode have runtime-foundation releases. The rest are planned. We say so plainly below — no roadmap inflation, no vaporware.</w:t>
       </w:r>
     </w:p>
     <w:p>
@@ -75,6 +75,8 @@
         <w:t>- **civiccore v0.2.0** — the shared "platform" package that every module uses. It is what the records module is built on. As of v0.2.0 it includes a shared LLM (large-language-model) abstraction layer. It is not a product on its own; you only "install" it as a dependency of a module. Repo: &lt;https://github.com/CivicSuite/civiccore&gt;.</w:t>
         <w:br/>
         <w:t>- **civicclerk v0.1.0** — a runtime-foundation release for meetings, agendas, packets, minutes, voting, and sunshine-law compliance. It ships the API/schema foundation, compliance guardrails, and a browser-visible staff workflow foundation at `/staff`; full database-backed workflow screens are still planned. Repo: &lt;https://github.com/CivicSuite/civicclerk&gt;.</w:t>
+        <w:br/>
+        <w:t>- **civiccode v0.1.0** — a runtime-foundation release for municipal code and ordinance access. It ships source registry, section/version lifecycle, search and permalinks, deterministic citations, citation-grounded Q&amp;A, staff notes, plain-language summaries, CivicClerk handoff intake, resident lookup pages, local import connectors, and records-ready exports. It still does not ship legal advice, live LLM calls, live codifier sync, or automatic ordinance codification. Repo: &lt;https://github.com/CivicSuite/civiccode&gt;.</w:t>
       </w:r>
     </w:p>
     <w:p>
@@ -87,8 +89,6 @@
     </w:p>
     <w:p>
       <w:r>
-        <w:t>- **civiccode** — municipal code and ordinance access. The repo exists as a scaffold with Milestone 0 planning complete; no runtime code has shipped. This is the next planning lane because CivicZone needs an authoritative code-section contract before zoning runtime work begins.</w:t>
-        <w:br/>
         <w:t>- **civiczone** — zoning code and parcel-aware planner workflows. Spec drafted, no code yet.</w:t>
         <w:br/>
         <w:t>- Twenty-plus additional modules across seven tiers — see the [module catalog](specs/01_catalog.md).</w:t>
@@ -205,7 +205,7 @@
         <w:br/>
         <w:t>| civicclerk | &lt;https://github.com/CivicSuite/civicclerk&gt; | Shipping v0.1.0 runtime foundation with `/staff` workflow UI foundation. |</w:t>
         <w:br/>
-        <w:t>| civiccode | &lt;https://github.com/CivicSuite/civiccode&gt; | Scaffold + Milestone 0 planning complete; no runtime code. |</w:t>
+        <w:t>| civiccode | &lt;https://github.com/CivicSuite/civiccode&gt; | Shipping v0.1.0 runtime foundation for municipal-code lookup, citations, local imports, and records-ready exports. |</w:t>
         <w:br/>
         <w:t>| civiczone, etc. | not created yet | Specs only. |</w:t>
       </w:r>

</xml_diff>

<commit_message>
docs: update CivicZone v0.1.0 compatibility state
</commit_message>
<xml_diff>
--- a/USER-MANUAL.docx
+++ b/USER-MANUAL.docx
@@ -77,6 +77,8 @@
         <w:t>- **civicclerk v0.1.0** — a runtime-foundation release for meetings, agendas, packets, minutes, voting, and sunshine-law compliance. It ships the API/schema foundation, compliance guardrails, and a browser-visible staff workflow foundation at `/staff`; full database-backed workflow screens are still planned. Repo: &lt;https://github.com/CivicSuite/civicclerk&gt;.</w:t>
         <w:br/>
         <w:t>- **civiccode v0.1.0** — a runtime-foundation release for municipal code and ordinance access. It ships source registry, section/version lifecycle, search and permalinks, deterministic citations, citation-grounded Q&amp;A, staff notes, plain-language summaries, CivicClerk handoff intake, resident lookup pages, local import connectors, and records-ready exports. It still does not ship legal advice, live LLM calls, live codifier sync, or automatic ordinance codification. Repo: &lt;https://github.com/CivicSuite/civiccode&gt;.</w:t>
+        <w:br/>
+        <w:t>- **civiczone v0.1.0** — a runtime-foundation release for parcel-aware zoning and land-use Q&amp;A. It ships canonical zoning schema, Alembic migrations, sample parcel and rule lookups, citation-grounded sample Q&amp;A, planner escalation, staff-context samples, and a public sample UI at `/civiczone`. It still does not ship live GIS ingestion, live LLM calls, authentication/RBAC, planner review queues, official zoning determinations, or legal advice. Repo: &lt;https://github.com/CivicSuite/civiczone&gt;.</w:t>
       </w:r>
     </w:p>
     <w:p>
@@ -89,8 +91,6 @@
     </w:p>
     <w:p>
       <w:r>
-        <w:t>- **civiczone** — zoning code and parcel-aware planner workflows. Spec drafted, no code yet.</w:t>
-        <w:br/>
         <w:t>- Twenty-plus additional modules across seven tiers — see the [module catalog](specs/01_catalog.md).</w:t>
       </w:r>
     </w:p>
@@ -207,7 +207,9 @@
         <w:br/>
         <w:t>| civiccode | &lt;https://github.com/CivicSuite/civiccode&gt; | Shipping v0.1.0 runtime foundation for municipal-code lookup, citations, local imports, and records-ready exports. |</w:t>
         <w:br/>
-        <w:t>| civiczone, etc. | not created yet | Specs only. |</w:t>
+        <w:t>| civiczone | &lt;https://github.com/CivicSuite/civiczone&gt; | Shipping v0.1.0 runtime foundation for parcel-aware zoning samples and public UI foundation. |</w:t>
+        <w:br/>
+        <w:t>| future modules | not created yet | Specs only. |</w:t>
       </w:r>
     </w:p>
     <w:p>
@@ -325,7 +327,7 @@
       <w:r>
         <w:drawing>
           <wp:inline xmlns:a="http://schemas.openxmlformats.org/drawingml/2006/main" xmlns:pic="http://schemas.openxmlformats.org/drawingml/2006/picture">
-            <wp:extent cx="5486400" cy="2323322"/>
+            <wp:extent cx="5486400" cy="3291840"/>
             <wp:docPr id="1" name="Picture 1"/>
             <wp:cNvGraphicFramePr>
               <a:graphicFrameLocks noChangeAspect="1"/>
@@ -346,7 +348,7 @@
                   <pic:spPr>
                     <a:xfrm>
                       <a:off x="0" y="0"/>
-                      <a:ext cx="5486400" cy="2323322"/>
+                      <a:ext cx="5486400" cy="3291840"/>
                     </a:xfrm>
                     <a:prstGeom prst="rect"/>
                   </pic:spPr>
@@ -432,7 +434,7 @@
         <w:br/>
         <w:t xml:space="preserve">   | civicrecords-ai     |   |   civicclerk     |   |   civiczone      |</w:t>
         <w:br/>
-        <w:t xml:space="preserve">   |   v1.4.0 SHIPPING   |   | v0.1.0 SHIPPING  |   |  PLANNED         |</w:t>
+        <w:t xml:space="preserve">   |   v1.4.0 SHIPPING   |   | v0.1.0 SHIPPING  |   | v0.1.0 SHIPPING |</w:t>
         <w:br/>
         <w:t xml:space="preserve">   |   FOIA / public     |   |  meetings,       |   |  zoning, parcel  |</w:t>
         <w:br/>

</xml_diff>

<commit_message>
docs: update CivicZone v0.1.0 compatibility state (#15)
Co-authored-by: Scott Converse <scott@civicsuite.local>
</commit_message>
<xml_diff>
--- a/USER-MANUAL.docx
+++ b/USER-MANUAL.docx
@@ -77,6 +77,8 @@
         <w:t>- **civicclerk v0.1.0** — a runtime-foundation release for meetings, agendas, packets, minutes, voting, and sunshine-law compliance. It ships the API/schema foundation, compliance guardrails, and a browser-visible staff workflow foundation at `/staff`; full database-backed workflow screens are still planned. Repo: &lt;https://github.com/CivicSuite/civicclerk&gt;.</w:t>
         <w:br/>
         <w:t>- **civiccode v0.1.0** — a runtime-foundation release for municipal code and ordinance access. It ships source registry, section/version lifecycle, search and permalinks, deterministic citations, citation-grounded Q&amp;A, staff notes, plain-language summaries, CivicClerk handoff intake, resident lookup pages, local import connectors, and records-ready exports. It still does not ship legal advice, live LLM calls, live codifier sync, or automatic ordinance codification. Repo: &lt;https://github.com/CivicSuite/civiccode&gt;.</w:t>
+        <w:br/>
+        <w:t>- **civiczone v0.1.0** — a runtime-foundation release for parcel-aware zoning and land-use Q&amp;A. It ships canonical zoning schema, Alembic migrations, sample parcel and rule lookups, citation-grounded sample Q&amp;A, planner escalation, staff-context samples, and a public sample UI at `/civiczone`. It still does not ship live GIS ingestion, live LLM calls, authentication/RBAC, planner review queues, official zoning determinations, or legal advice. Repo: &lt;https://github.com/CivicSuite/civiczone&gt;.</w:t>
       </w:r>
     </w:p>
     <w:p>
@@ -89,8 +91,6 @@
     </w:p>
     <w:p>
       <w:r>
-        <w:t>- **civiczone** — zoning code and parcel-aware planner workflows. Spec drafted, no code yet.</w:t>
-        <w:br/>
         <w:t>- Twenty-plus additional modules across seven tiers — see the [module catalog](specs/01_catalog.md).</w:t>
       </w:r>
     </w:p>
@@ -207,7 +207,9 @@
         <w:br/>
         <w:t>| civiccode | &lt;https://github.com/CivicSuite/civiccode&gt; | Shipping v0.1.0 runtime foundation for municipal-code lookup, citations, local imports, and records-ready exports. |</w:t>
         <w:br/>
-        <w:t>| civiczone, etc. | not created yet | Specs only. |</w:t>
+        <w:t>| civiczone | &lt;https://github.com/CivicSuite/civiczone&gt; | Shipping v0.1.0 runtime foundation for parcel-aware zoning samples and public UI foundation. |</w:t>
+        <w:br/>
+        <w:t>| future modules | not created yet | Specs only. |</w:t>
       </w:r>
     </w:p>
     <w:p>
@@ -325,7 +327,7 @@
       <w:r>
         <w:drawing>
           <wp:inline xmlns:a="http://schemas.openxmlformats.org/drawingml/2006/main" xmlns:pic="http://schemas.openxmlformats.org/drawingml/2006/picture">
-            <wp:extent cx="5486400" cy="2323322"/>
+            <wp:extent cx="5486400" cy="3291840"/>
             <wp:docPr id="1" name="Picture 1"/>
             <wp:cNvGraphicFramePr>
               <a:graphicFrameLocks noChangeAspect="1"/>
@@ -346,7 +348,7 @@
                   <pic:spPr>
                     <a:xfrm>
                       <a:off x="0" y="0"/>
-                      <a:ext cx="5486400" cy="2323322"/>
+                      <a:ext cx="5486400" cy="3291840"/>
                     </a:xfrm>
                     <a:prstGeom prst="rect"/>
                   </pic:spPr>
@@ -432,7 +434,7 @@
         <w:br/>
         <w:t xml:space="preserve">   | civicrecords-ai     |   |   civicclerk     |   |   civiczone      |</w:t>
         <w:br/>
-        <w:t xml:space="preserve">   |   v1.4.0 SHIPPING   |   | v0.1.0 SHIPPING  |   |  PLANNED         |</w:t>
+        <w:t xml:space="preserve">   |   v1.4.0 SHIPPING   |   | v0.1.0 SHIPPING  |   | v0.1.0 SHIPPING |</w:t>
         <w:br/>
         <w:t xml:space="preserve">   |   FOIA / public     |   |  meetings,       |   |  zoning, parcel  |</w:t>
         <w:br/>

</xml_diff>

<commit_message>
docs: update CivicAccess v0.1.0 compatibility state
</commit_message>
<xml_diff>
--- a/USER-MANUAL.docx
+++ b/USER-MANUAL.docx
@@ -57,7 +57,7 @@
     </w:p>
     <w:p>
       <w:r>
-        <w:t>Today, multiple modules are shipping at different maturity levels: CivicRecords AI is production-usable, while CivicClerk and CivicCode have runtime-foundation releases. The rest are planned. We say so plainly below — no roadmap inflation, no vaporware.</w:t>
+        <w:t>Today, multiple modules are shipping at different maturity levels: CivicRecords AI is production-usable, while CivicClerk, CivicCode, CivicZone, and CivicAccess have runtime-foundation releases. The rest are planned. We say so plainly below — no roadmap inflation, no vaporware.</w:t>
       </w:r>
     </w:p>
     <w:p>
@@ -79,6 +79,8 @@
         <w:t>- **civiccode v0.1.0** — a runtime-foundation release for municipal code and ordinance access. It ships source registry, section/version lifecycle, search and permalinks, deterministic citations, citation-grounded Q&amp;A, staff notes, plain-language summaries, CivicClerk handoff intake, resident lookup pages, local import connectors, and records-ready exports. It still does not ship legal advice, live LLM calls, live codifier sync, or automatic ordinance codification. Repo: &lt;https://github.com/CivicSuite/civiccode&gt;.</w:t>
         <w:br/>
         <w:t>- **civiczone v0.1.0** — a runtime-foundation release for parcel-aware zoning and land-use Q&amp;A. It ships canonical zoning schema, Alembic migrations, sample parcel and rule lookups, citation-grounded sample Q&amp;A, planner escalation, staff-context samples, and a public sample UI at `/civiczone`. It still does not ship live GIS ingestion, live LLM calls, authentication/RBAC, planner review queues, official zoning determinations, or legal advice. Repo: &lt;https://github.com/CivicSuite/civiczone&gt;.</w:t>
+        <w:br/>
+        <w:t>- **civicaccess v0.1.0** — a runtime-foundation release for accessibility, plain-language, multilingual, and ADA review support. It ships deterministic sample accessibility review, plain-language rewrite, multilingual variant, records-ready export checklist, and a public sample UI at `/civicaccess`. It still does not ship certified ADA compliance, legal advice, live LLM calls, production translation workflows, document ingestion, or suite-wide integration APIs. Repo: &lt;https://github.com/CivicSuite/civicaccess&gt;.</w:t>
       </w:r>
     </w:p>
     <w:p>
@@ -209,6 +211,8 @@
         <w:br/>
         <w:t>| civiczone | &lt;https://github.com/CivicSuite/civiczone&gt; | Shipping v0.1.0 runtime foundation for parcel-aware zoning samples and public UI foundation. |</w:t>
         <w:br/>
+        <w:t>| civicaccess | &lt;https://github.com/CivicSuite/civicaccess&gt; | Shipping v0.1.0 runtime foundation for accessibility review and public UI foundation. |</w:t>
+        <w:br/>
         <w:t>| future modules | not created yet | Specs only. |</w:t>
       </w:r>
     </w:p>
@@ -327,7 +331,7 @@
       <w:r>
         <w:drawing>
           <wp:inline xmlns:a="http://schemas.openxmlformats.org/drawingml/2006/main" xmlns:pic="http://schemas.openxmlformats.org/drawingml/2006/picture">
-            <wp:extent cx="5486400" cy="3291840"/>
+            <wp:extent cx="5486400" cy="3566160"/>
             <wp:docPr id="1" name="Picture 1"/>
             <wp:cNvGraphicFramePr>
               <a:graphicFrameLocks noChangeAspect="1"/>
@@ -348,7 +352,7 @@
                   <pic:spPr>
                     <a:xfrm>
                       <a:off x="0" y="0"/>
-                      <a:ext cx="5486400" cy="3291840"/>
+                      <a:ext cx="5486400" cy="3566160"/>
                     </a:xfrm>
                     <a:prstGeom prst="rect"/>
                   </pic:spPr>

</xml_diff>

<commit_message>
docs: update CivicAccess v0.1.0 compatibility state (#16)
Co-authored-by: Scott Converse <scott@civicsuite.local>
</commit_message>
<xml_diff>
--- a/USER-MANUAL.docx
+++ b/USER-MANUAL.docx
@@ -57,7 +57,7 @@
     </w:p>
     <w:p>
       <w:r>
-        <w:t>Today, multiple modules are shipping at different maturity levels: CivicRecords AI is production-usable, while CivicClerk and CivicCode have runtime-foundation releases. The rest are planned. We say so plainly below — no roadmap inflation, no vaporware.</w:t>
+        <w:t>Today, multiple modules are shipping at different maturity levels: CivicRecords AI is production-usable, while CivicClerk, CivicCode, CivicZone, and CivicAccess have runtime-foundation releases. The rest are planned. We say so plainly below — no roadmap inflation, no vaporware.</w:t>
       </w:r>
     </w:p>
     <w:p>
@@ -79,6 +79,8 @@
         <w:t>- **civiccode v0.1.0** — a runtime-foundation release for municipal code and ordinance access. It ships source registry, section/version lifecycle, search and permalinks, deterministic citations, citation-grounded Q&amp;A, staff notes, plain-language summaries, CivicClerk handoff intake, resident lookup pages, local import connectors, and records-ready exports. It still does not ship legal advice, live LLM calls, live codifier sync, or automatic ordinance codification. Repo: &lt;https://github.com/CivicSuite/civiccode&gt;.</w:t>
         <w:br/>
         <w:t>- **civiczone v0.1.0** — a runtime-foundation release for parcel-aware zoning and land-use Q&amp;A. It ships canonical zoning schema, Alembic migrations, sample parcel and rule lookups, citation-grounded sample Q&amp;A, planner escalation, staff-context samples, and a public sample UI at `/civiczone`. It still does not ship live GIS ingestion, live LLM calls, authentication/RBAC, planner review queues, official zoning determinations, or legal advice. Repo: &lt;https://github.com/CivicSuite/civiczone&gt;.</w:t>
+        <w:br/>
+        <w:t>- **civicaccess v0.1.0** — a runtime-foundation release for accessibility, plain-language, multilingual, and ADA review support. It ships deterministic sample accessibility review, plain-language rewrite, multilingual variant, records-ready export checklist, and a public sample UI at `/civicaccess`. It still does not ship certified ADA compliance, legal advice, live LLM calls, production translation workflows, document ingestion, or suite-wide integration APIs. Repo: &lt;https://github.com/CivicSuite/civicaccess&gt;.</w:t>
       </w:r>
     </w:p>
     <w:p>
@@ -209,6 +211,8 @@
         <w:br/>
         <w:t>| civiczone | &lt;https://github.com/CivicSuite/civiczone&gt; | Shipping v0.1.0 runtime foundation for parcel-aware zoning samples and public UI foundation. |</w:t>
         <w:br/>
+        <w:t>| civicaccess | &lt;https://github.com/CivicSuite/civicaccess&gt; | Shipping v0.1.0 runtime foundation for accessibility review and public UI foundation. |</w:t>
+        <w:br/>
         <w:t>| future modules | not created yet | Specs only. |</w:t>
       </w:r>
     </w:p>
@@ -327,7 +331,7 @@
       <w:r>
         <w:drawing>
           <wp:inline xmlns:a="http://schemas.openxmlformats.org/drawingml/2006/main" xmlns:pic="http://schemas.openxmlformats.org/drawingml/2006/picture">
-            <wp:extent cx="5486400" cy="3291840"/>
+            <wp:extent cx="5486400" cy="3566160"/>
             <wp:docPr id="1" name="Picture 1"/>
             <wp:cNvGraphicFramePr>
               <a:graphicFrameLocks noChangeAspect="1"/>
@@ -348,7 +352,7 @@
                   <pic:spPr>
                     <a:xfrm>
                       <a:off x="0" y="0"/>
-                      <a:ext cx="5486400" cy="3291840"/>
+                      <a:ext cx="5486400" cy="3566160"/>
                     </a:xfrm>
                     <a:prstGeom prst="rect"/>
                   </pic:spPr>

</xml_diff>

<commit_message>
docs: update CivicPlan v0.1.0 compatibility state
</commit_message>
<xml_diff>
--- a/USER-MANUAL.docx
+++ b/USER-MANUAL.docx
@@ -57,7 +57,7 @@
     </w:p>
     <w:p>
       <w:r>
-        <w:t>Today, multiple modules are shipping at different maturity levels: CivicRecords AI is production-usable, while CivicClerk, CivicCode, CivicZone, and CivicAccess have runtime-foundation releases. The rest are planned. We say so plainly below — no roadmap inflation, no vaporware.</w:t>
+        <w:t>Today, multiple modules are shipping at different maturity levels: CivicRecords AI is production-usable, while CivicClerk, CivicCode, CivicZone, CivicAccess, and CivicPlan have runtime-foundation releases. The rest are planned. We say so plainly below — no roadmap inflation, no vaporware.</w:t>
       </w:r>
     </w:p>
     <w:p>
@@ -81,6 +81,8 @@
         <w:t>- **civiczone v0.1.0** — a runtime-foundation release for parcel-aware zoning and land-use Q&amp;A. It ships canonical zoning schema, Alembic migrations, sample parcel and rule lookups, citation-grounded sample Q&amp;A, planner escalation, staff-context samples, and a public sample UI at `/civiczone`. It still does not ship live GIS ingestion, live LLM calls, authentication/RBAC, planner review queues, official zoning determinations, or legal advice. Repo: &lt;https://github.com/CivicSuite/civiczone&gt;.</w:t>
         <w:br/>
         <w:t>- **civicaccess v0.1.0** — a runtime-foundation release for accessibility, plain-language, multilingual, and ADA review support. It ships deterministic sample accessibility review, plain-language rewrite, multilingual variant, records-ready export checklist, and a public sample UI at `/civicaccess`. It still does not ship certified ADA compliance, legal advice, live LLM calls, production translation workflows, document ingestion, or suite-wide integration APIs. Repo: &lt;https://github.com/CivicSuite/civicaccess&gt;.</w:t>
+        <w:br/>
+        <w:t>- **civicplan v0.1.0** — a runtime-foundation release for comprehensive-plan policy lookup and cited planning analysis support. It ships deterministic sample plan-policy lookup, policy-consistency support, staff-analysis outline helper, records-ready export checklist, and a public sample UI at `/civicplan`. It still does not ship official planning determinations, legal advice, live GIS, live LLM calls, plan document ingestion, permitting-system integrations, or production staff-review queues. Repo: &lt;https://github.com/CivicSuite/civicplan&gt;.</w:t>
       </w:r>
     </w:p>
     <w:p>
@@ -213,6 +215,8 @@
         <w:br/>
         <w:t>| civicaccess | &lt;https://github.com/CivicSuite/civicaccess&gt; | Shipping v0.1.0 runtime foundation for accessibility review and public UI foundation. |</w:t>
         <w:br/>
+        <w:t>| civicplan | &lt;https://github.com/CivicSuite/civicplan&gt; | Shipping v0.1.0 runtime foundation for cited plan-policy lookup and public UI foundation. |</w:t>
+        <w:br/>
         <w:t>| future modules | not created yet | Specs only. |</w:t>
       </w:r>
     </w:p>
@@ -331,7 +335,7 @@
       <w:r>
         <w:drawing>
           <wp:inline xmlns:a="http://schemas.openxmlformats.org/drawingml/2006/main" xmlns:pic="http://schemas.openxmlformats.org/drawingml/2006/picture">
-            <wp:extent cx="5486400" cy="3566160"/>
+            <wp:extent cx="5486400" cy="3749040"/>
             <wp:docPr id="1" name="Picture 1"/>
             <wp:cNvGraphicFramePr>
               <a:graphicFrameLocks noChangeAspect="1"/>
@@ -352,7 +356,7 @@
                   <pic:spPr>
                     <a:xfrm>
                       <a:off x="0" y="0"/>
-                      <a:ext cx="5486400" cy="3566160"/>
+                      <a:ext cx="5486400" cy="3749040"/>
                     </a:xfrm>
                     <a:prstGeom prst="rect"/>
                   </pic:spPr>

</xml_diff>

<commit_message>
docs: update CivicPlan v0.1.0 compatibility state (#18)
Co-authored-by: Scott Converse <scott@civicsuite.local>
</commit_message>
<xml_diff>
--- a/USER-MANUAL.docx
+++ b/USER-MANUAL.docx
@@ -57,7 +57,7 @@
     </w:p>
     <w:p>
       <w:r>
-        <w:t>Today, multiple modules are shipping at different maturity levels: CivicRecords AI is production-usable, while CivicClerk, CivicCode, CivicZone, and CivicAccess have runtime-foundation releases. The rest are planned. We say so plainly below — no roadmap inflation, no vaporware.</w:t>
+        <w:t>Today, multiple modules are shipping at different maturity levels: CivicRecords AI is production-usable, while CivicClerk, CivicCode, CivicZone, CivicAccess, and CivicPlan have runtime-foundation releases. The rest are planned. We say so plainly below — no roadmap inflation, no vaporware.</w:t>
       </w:r>
     </w:p>
     <w:p>
@@ -81,6 +81,8 @@
         <w:t>- **civiczone v0.1.0** — a runtime-foundation release for parcel-aware zoning and land-use Q&amp;A. It ships canonical zoning schema, Alembic migrations, sample parcel and rule lookups, citation-grounded sample Q&amp;A, planner escalation, staff-context samples, and a public sample UI at `/civiczone`. It still does not ship live GIS ingestion, live LLM calls, authentication/RBAC, planner review queues, official zoning determinations, or legal advice. Repo: &lt;https://github.com/CivicSuite/civiczone&gt;.</w:t>
         <w:br/>
         <w:t>- **civicaccess v0.1.0** — a runtime-foundation release for accessibility, plain-language, multilingual, and ADA review support. It ships deterministic sample accessibility review, plain-language rewrite, multilingual variant, records-ready export checklist, and a public sample UI at `/civicaccess`. It still does not ship certified ADA compliance, legal advice, live LLM calls, production translation workflows, document ingestion, or suite-wide integration APIs. Repo: &lt;https://github.com/CivicSuite/civicaccess&gt;.</w:t>
+        <w:br/>
+        <w:t>- **civicplan v0.1.0** — a runtime-foundation release for comprehensive-plan policy lookup and cited planning analysis support. It ships deterministic sample plan-policy lookup, policy-consistency support, staff-analysis outline helper, records-ready export checklist, and a public sample UI at `/civicplan`. It still does not ship official planning determinations, legal advice, live GIS, live LLM calls, plan document ingestion, permitting-system integrations, or production staff-review queues. Repo: &lt;https://github.com/CivicSuite/civicplan&gt;.</w:t>
       </w:r>
     </w:p>
     <w:p>
@@ -213,6 +215,8 @@
         <w:br/>
         <w:t>| civicaccess | &lt;https://github.com/CivicSuite/civicaccess&gt; | Shipping v0.1.0 runtime foundation for accessibility review and public UI foundation. |</w:t>
         <w:br/>
+        <w:t>| civicplan | &lt;https://github.com/CivicSuite/civicplan&gt; | Shipping v0.1.0 runtime foundation for cited plan-policy lookup and public UI foundation. |</w:t>
+        <w:br/>
         <w:t>| future modules | not created yet | Specs only. |</w:t>
       </w:r>
     </w:p>
@@ -331,7 +335,7 @@
       <w:r>
         <w:drawing>
           <wp:inline xmlns:a="http://schemas.openxmlformats.org/drawingml/2006/main" xmlns:pic="http://schemas.openxmlformats.org/drawingml/2006/picture">
-            <wp:extent cx="5486400" cy="3566160"/>
+            <wp:extent cx="5486400" cy="3749040"/>
             <wp:docPr id="1" name="Picture 1"/>
             <wp:cNvGraphicFramePr>
               <a:graphicFrameLocks noChangeAspect="1"/>
@@ -352,7 +356,7 @@
                   <pic:spPr>
                     <a:xfrm>
                       <a:off x="0" y="0"/>
-                      <a:ext cx="5486400" cy="3566160"/>
+                      <a:ext cx="5486400" cy="3749040"/>
                     </a:xfrm>
                     <a:prstGeom prst="rect"/>
                   </pic:spPr>

</xml_diff>

<commit_message>
docs: update CivicPermit v0.1.0 compatibility state
</commit_message>
<xml_diff>
--- a/USER-MANUAL.docx
+++ b/USER-MANUAL.docx
@@ -57,7 +57,7 @@
     </w:p>
     <w:p>
       <w:r>
-        <w:t>Today, multiple modules are shipping at different maturity levels: CivicRecords AI is production-usable, while CivicClerk, CivicCode, CivicZone, CivicAccess, and CivicPlan have runtime-foundation releases. The rest are planned. We say so plainly below — no roadmap inflation, no vaporware.</w:t>
+        <w:t>Today, multiple modules are shipping at different maturity levels: CivicRecords AI is production-usable, while CivicClerk, CivicCode, CivicZone, CivicAccess, CivicPlan, and CivicPermit have runtime-foundation releases. The rest are planned. We say so plainly below — no roadmap inflation, no vaporware.</w:t>
       </w:r>
     </w:p>
     <w:p>
@@ -83,6 +83,8 @@
         <w:t>- **civicaccess v0.1.0** — a runtime-foundation release for accessibility, plain-language, multilingual, and ADA review support. It ships deterministic sample accessibility review, plain-language rewrite, multilingual variant, records-ready export checklist, and a public sample UI at `/civicaccess`. It still does not ship certified ADA compliance, legal advice, live LLM calls, production translation workflows, document ingestion, or suite-wide integration APIs. Repo: &lt;https://github.com/CivicSuite/civicaccess&gt;.</w:t>
         <w:br/>
         <w:t>- **civicplan v0.1.0** — a runtime-foundation release for comprehensive-plan policy lookup and cited planning analysis support. It ships deterministic sample plan-policy lookup, policy-consistency support, staff-analysis outline helper, records-ready export checklist, and a public sample UI at `/civicplan`. It still does not ship official planning determinations, legal advice, live GIS, live LLM calls, plan document ingestion, permitting-system integrations, or production staff-review queues. Repo: &lt;https://github.com/CivicSuite/civicplan&gt;.</w:t>
+        <w:br/>
+        <w:t>- **civicpermit v0.1.0** — a runtime-foundation release for permit pre-application and intake-readiness support. It ships deterministic sample permit requirement lookup, intake-readiness review, submittal outline helper, records-ready export checklist, and a public sample UI at `/civicpermit`. It still does not ship permit approvals, legal advice, live GIS, live LLM calls, plan ingestion, production permitting-system integrations, or system-of-record behavior. Repo: &lt;https://github.com/CivicSuite/civicpermit&gt;.</w:t>
       </w:r>
     </w:p>
     <w:p>
@@ -95,7 +97,7 @@
     </w:p>
     <w:p>
       <w:r>
-        <w:t>- Twenty-plus additional modules across seven tiers — see the [module catalog](specs/01_catalog.md).</w:t>
+        <w:t>- Eighteen additional modules across seven tiers — see the [module catalog](specs/01_catalog.md).</w:t>
       </w:r>
     </w:p>
     <w:p>
@@ -216,6 +218,8 @@
         <w:t>| civicaccess | &lt;https://github.com/CivicSuite/civicaccess&gt; | Shipping v0.1.0 runtime foundation for accessibility review and public UI foundation. |</w:t>
         <w:br/>
         <w:t>| civicplan | &lt;https://github.com/CivicSuite/civicplan&gt; | Shipping v0.1.0 runtime foundation for cited plan-policy lookup and public UI foundation. |</w:t>
+        <w:br/>
+        <w:t>| civicpermit | &lt;https://github.com/CivicSuite/civicpermit&gt; | Shipping v0.1.0 runtime foundation for permit requirement lookup and public UI foundation. |</w:t>
         <w:br/>
         <w:t>| future modules | not created yet | Specs only. |</w:t>
       </w:r>

</xml_diff>

<commit_message>
docs: update CivicPermit v0.1.0 compatibility state (#19)
Co-authored-by: Scott Converse <scott@civicsuite.local>
</commit_message>
<xml_diff>
--- a/USER-MANUAL.docx
+++ b/USER-MANUAL.docx
@@ -57,7 +57,7 @@
     </w:p>
     <w:p>
       <w:r>
-        <w:t>Today, multiple modules are shipping at different maturity levels: CivicRecords AI is production-usable, while CivicClerk, CivicCode, CivicZone, CivicAccess, and CivicPlan have runtime-foundation releases. The rest are planned. We say so plainly below — no roadmap inflation, no vaporware.</w:t>
+        <w:t>Today, multiple modules are shipping at different maturity levels: CivicRecords AI is production-usable, while CivicClerk, CivicCode, CivicZone, CivicAccess, CivicPlan, and CivicPermit have runtime-foundation releases. The rest are planned. We say so plainly below — no roadmap inflation, no vaporware.</w:t>
       </w:r>
     </w:p>
     <w:p>
@@ -83,6 +83,8 @@
         <w:t>- **civicaccess v0.1.0** — a runtime-foundation release for accessibility, plain-language, multilingual, and ADA review support. It ships deterministic sample accessibility review, plain-language rewrite, multilingual variant, records-ready export checklist, and a public sample UI at `/civicaccess`. It still does not ship certified ADA compliance, legal advice, live LLM calls, production translation workflows, document ingestion, or suite-wide integration APIs. Repo: &lt;https://github.com/CivicSuite/civicaccess&gt;.</w:t>
         <w:br/>
         <w:t>- **civicplan v0.1.0** — a runtime-foundation release for comprehensive-plan policy lookup and cited planning analysis support. It ships deterministic sample plan-policy lookup, policy-consistency support, staff-analysis outline helper, records-ready export checklist, and a public sample UI at `/civicplan`. It still does not ship official planning determinations, legal advice, live GIS, live LLM calls, plan document ingestion, permitting-system integrations, or production staff-review queues. Repo: &lt;https://github.com/CivicSuite/civicplan&gt;.</w:t>
+        <w:br/>
+        <w:t>- **civicpermit v0.1.0** — a runtime-foundation release for permit pre-application and intake-readiness support. It ships deterministic sample permit requirement lookup, intake-readiness review, submittal outline helper, records-ready export checklist, and a public sample UI at `/civicpermit`. It still does not ship permit approvals, legal advice, live GIS, live LLM calls, plan ingestion, production permitting-system integrations, or system-of-record behavior. Repo: &lt;https://github.com/CivicSuite/civicpermit&gt;.</w:t>
       </w:r>
     </w:p>
     <w:p>
@@ -95,7 +97,7 @@
     </w:p>
     <w:p>
       <w:r>
-        <w:t>- Twenty-plus additional modules across seven tiers — see the [module catalog](specs/01_catalog.md).</w:t>
+        <w:t>- Eighteen additional modules across seven tiers — see the [module catalog](specs/01_catalog.md).</w:t>
       </w:r>
     </w:p>
     <w:p>
@@ -216,6 +218,8 @@
         <w:t>| civicaccess | &lt;https://github.com/CivicSuite/civicaccess&gt; | Shipping v0.1.0 runtime foundation for accessibility review and public UI foundation. |</w:t>
         <w:br/>
         <w:t>| civicplan | &lt;https://github.com/CivicSuite/civicplan&gt; | Shipping v0.1.0 runtime foundation for cited plan-policy lookup and public UI foundation. |</w:t>
+        <w:br/>
+        <w:t>| civicpermit | &lt;https://github.com/CivicSuite/civicpermit&gt; | Shipping v0.1.0 runtime foundation for permit requirement lookup and public UI foundation. |</w:t>
         <w:br/>
         <w:t>| future modules | not created yet | Specs only. |</w:t>
       </w:r>

</xml_diff>

<commit_message>
docs: update CivicInspect v0.1.0 compatibility state
</commit_message>
<xml_diff>
--- a/USER-MANUAL.docx
+++ b/USER-MANUAL.docx
@@ -57,7 +57,7 @@
     </w:p>
     <w:p>
       <w:r>
-        <w:t>Today, multiple modules are shipping at different maturity levels: CivicRecords AI is production-usable, while CivicClerk, CivicCode, CivicZone, CivicAccess, CivicPlan, and CivicPermit have runtime-foundation releases. The rest are planned. We say so plainly below — no roadmap inflation, no vaporware.</w:t>
+        <w:t>Today, multiple modules are shipping at different maturity levels: CivicRecords AI is production-usable, while CivicClerk, CivicCode, CivicZone, CivicAccess, CivicPlan, CivicPermit, and CivicInspect have runtime-foundation releases. The rest are planned. We say so plainly below — no roadmap inflation, no vaporware.</w:t>
       </w:r>
     </w:p>
     <w:p>
@@ -85,6 +85,8 @@
         <w:t>- **civicplan v0.1.0** — a runtime-foundation release for comprehensive-plan policy lookup and cited planning analysis support. It ships deterministic sample plan-policy lookup, policy-consistency support, staff-analysis outline helper, records-ready export checklist, and a public sample UI at `/civicplan`. It still does not ship official planning determinations, legal advice, live GIS, live LLM calls, plan document ingestion, permitting-system integrations, or production staff-review queues. Repo: &lt;https://github.com/CivicSuite/civicplan&gt;.</w:t>
         <w:br/>
         <w:t>- **civicpermit v0.1.0** — a runtime-foundation release for permit pre-application and intake-readiness support. It ships deterministic sample permit requirement lookup, intake-readiness review, submittal outline helper, records-ready export checklist, and a public sample UI at `/civicpermit`. It still does not ship permit approvals, legal advice, live GIS, live LLM calls, plan ingestion, production permitting-system integrations, or system-of-record behavior. Repo: &lt;https://github.com/CivicSuite/civicpermit&gt;.</w:t>
+        <w:br/>
+        <w:t>- **civicinspect v0.1.0** — a runtime-foundation release for inspection support. It ships deterministic sample repeat-case lookup, inspector-owned report draft helper, notice draft helper, records-ready export checklist, and a public sample UI at `/civicinspect`. It still does not ship official findings, citations, fines, notices, inspection scheduling, legal advice, live photo analysis, live LLM calls, or system-of-record integrations. Repo: &lt;https://github.com/CivicSuite/civicinspect&gt;.</w:t>
       </w:r>
     </w:p>
     <w:p>
@@ -97,7 +99,7 @@
     </w:p>
     <w:p>
       <w:r>
-        <w:t>- Eighteen additional modules across seven tiers — see the [module catalog](specs/01_catalog.md).</w:t>
+        <w:t>- Seventeen additional modules across seven tiers — see the [module catalog](specs/01_catalog.md).</w:t>
       </w:r>
     </w:p>
     <w:p>
@@ -220,6 +222,8 @@
         <w:t>| civicplan | &lt;https://github.com/CivicSuite/civicplan&gt; | Shipping v0.1.0 runtime foundation for cited plan-policy lookup and public UI foundation. |</w:t>
         <w:br/>
         <w:t>| civicpermit | &lt;https://github.com/CivicSuite/civicpermit&gt; | Shipping v0.1.0 runtime foundation for permit requirement lookup and public UI foundation. |</w:t>
+        <w:br/>
+        <w:t>| civicinspect | &lt;https://github.com/CivicSuite/civicinspect&gt; | Shipping v0.1.0 runtime foundation for repeat-case lookup, report drafts, notice drafts, and public UI foundation. |</w:t>
         <w:br/>
         <w:t>| future modules | not created yet | Specs only. |</w:t>
       </w:r>

</xml_diff>

<commit_message>
docs: update CivicInspect v0.1.0 compatibility state (#20)
Co-authored-by: Scott Converse <scott@civicsuite.local>
</commit_message>
<xml_diff>
--- a/USER-MANUAL.docx
+++ b/USER-MANUAL.docx
@@ -57,7 +57,7 @@
     </w:p>
     <w:p>
       <w:r>
-        <w:t>Today, multiple modules are shipping at different maturity levels: CivicRecords AI is production-usable, while CivicClerk, CivicCode, CivicZone, CivicAccess, CivicPlan, and CivicPermit have runtime-foundation releases. The rest are planned. We say so plainly below — no roadmap inflation, no vaporware.</w:t>
+        <w:t>Today, multiple modules are shipping at different maturity levels: CivicRecords AI is production-usable, while CivicClerk, CivicCode, CivicZone, CivicAccess, CivicPlan, CivicPermit, and CivicInspect have runtime-foundation releases. The rest are planned. We say so plainly below — no roadmap inflation, no vaporware.</w:t>
       </w:r>
     </w:p>
     <w:p>
@@ -85,6 +85,8 @@
         <w:t>- **civicplan v0.1.0** — a runtime-foundation release for comprehensive-plan policy lookup and cited planning analysis support. It ships deterministic sample plan-policy lookup, policy-consistency support, staff-analysis outline helper, records-ready export checklist, and a public sample UI at `/civicplan`. It still does not ship official planning determinations, legal advice, live GIS, live LLM calls, plan document ingestion, permitting-system integrations, or production staff-review queues. Repo: &lt;https://github.com/CivicSuite/civicplan&gt;.</w:t>
         <w:br/>
         <w:t>- **civicpermit v0.1.0** — a runtime-foundation release for permit pre-application and intake-readiness support. It ships deterministic sample permit requirement lookup, intake-readiness review, submittal outline helper, records-ready export checklist, and a public sample UI at `/civicpermit`. It still does not ship permit approvals, legal advice, live GIS, live LLM calls, plan ingestion, production permitting-system integrations, or system-of-record behavior. Repo: &lt;https://github.com/CivicSuite/civicpermit&gt;.</w:t>
+        <w:br/>
+        <w:t>- **civicinspect v0.1.0** — a runtime-foundation release for inspection support. It ships deterministic sample repeat-case lookup, inspector-owned report draft helper, notice draft helper, records-ready export checklist, and a public sample UI at `/civicinspect`. It still does not ship official findings, citations, fines, notices, inspection scheduling, legal advice, live photo analysis, live LLM calls, or system-of-record integrations. Repo: &lt;https://github.com/CivicSuite/civicinspect&gt;.</w:t>
       </w:r>
     </w:p>
     <w:p>
@@ -97,7 +99,7 @@
     </w:p>
     <w:p>
       <w:r>
-        <w:t>- Eighteen additional modules across seven tiers — see the [module catalog](specs/01_catalog.md).</w:t>
+        <w:t>- Seventeen additional modules across seven tiers — see the [module catalog](specs/01_catalog.md).</w:t>
       </w:r>
     </w:p>
     <w:p>
@@ -220,6 +222,8 @@
         <w:t>| civicplan | &lt;https://github.com/CivicSuite/civicplan&gt; | Shipping v0.1.0 runtime foundation for cited plan-policy lookup and public UI foundation. |</w:t>
         <w:br/>
         <w:t>| civicpermit | &lt;https://github.com/CivicSuite/civicpermit&gt; | Shipping v0.1.0 runtime foundation for permit requirement lookup and public UI foundation. |</w:t>
+        <w:br/>
+        <w:t>| civicinspect | &lt;https://github.com/CivicSuite/civicinspect&gt; | Shipping v0.1.0 runtime foundation for repeat-case lookup, report drafts, notice drafts, and public UI foundation. |</w:t>
         <w:br/>
         <w:t>| future modules | not created yet | Specs only. |</w:t>
       </w:r>

</xml_diff>

<commit_message>
docs: update CivicGrants v0.1.0 compatibility state
</commit_message>
<xml_diff>
--- a/USER-MANUAL.docx
+++ b/USER-MANUAL.docx
@@ -57,7 +57,7 @@
     </w:p>
     <w:p>
       <w:r>
-        <w:t>Today, multiple modules are shipping at different maturity levels: CivicRecords AI is production-usable, while CivicClerk, CivicCode, CivicZone, CivicAccess, CivicPlan, CivicPermit, and CivicInspect have runtime-foundation releases. The rest are planned. We say so plainly below — no roadmap inflation, no vaporware.</w:t>
+        <w:t>Today, multiple modules are shipping at different maturity levels: CivicRecords AI is production-usable, while CivicClerk, CivicCode, CivicZone, CivicAccess, CivicPlan, CivicPermit, CivicInspect, and CivicGrants have runtime-foundation releases. The rest are planned. We say so plainly below — no roadmap inflation, no vaporware.</w:t>
       </w:r>
     </w:p>
     <w:p>
@@ -87,6 +87,8 @@
         <w:t>- **civicpermit v0.1.0** — a runtime-foundation release for permit pre-application and intake-readiness support. It ships deterministic sample permit requirement lookup, intake-readiness review, submittal outline helper, records-ready export checklist, and a public sample UI at `/civicpermit`. It still does not ship permit approvals, legal advice, live GIS, live LLM calls, plan ingestion, production permitting-system integrations, or system-of-record behavior. Repo: &lt;https://github.com/CivicSuite/civicpermit&gt;.</w:t>
         <w:br/>
         <w:t>- **civicinspect v0.1.0** — a runtime-foundation release for inspection support. It ships deterministic sample repeat-case lookup, inspector-owned report draft helper, notice draft helper, records-ready export checklist, and a public sample UI at `/civicinspect`. It still does not ship official findings, citations, fines, notices, inspection scheduling, legal advice, live photo analysis, live LLM calls, or system-of-record integrations. Repo: &lt;https://github.com/CivicSuite/civicinspect&gt;.</w:t>
+        <w:br/>
+        <w:t>- **civicgrants v0.1.0** — a runtime-foundation release for grant opportunity and compliance support. It ships deterministic sample opportunity triage, eligibility-factor matching, application outline helper, compliance calendar helper, audit-ready export checklist, and a public sample UI at `/civicgrants`. It still does not ship live funder feeds, official eligibility decisions, legal advice, live LLM calls, submission portals, or grant system-of-record integrations. Repo: &lt;https://github.com/CivicSuite/civicgrants&gt;.</w:t>
       </w:r>
     </w:p>
     <w:p>
@@ -99,7 +101,7 @@
     </w:p>
     <w:p>
       <w:r>
-        <w:t>- Seventeen additional modules across seven tiers — see the [module catalog](specs/01_catalog.md).</w:t>
+        <w:t>- Sixteen additional modules across seven tiers — see the [module catalog](specs/01_catalog.md).</w:t>
       </w:r>
     </w:p>
     <w:p>
@@ -224,6 +226,8 @@
         <w:t>| civicpermit | &lt;https://github.com/CivicSuite/civicpermit&gt; | Shipping v0.1.0 runtime foundation for permit requirement lookup and public UI foundation. |</w:t>
         <w:br/>
         <w:t>| civicinspect | &lt;https://github.com/CivicSuite/civicinspect&gt; | Shipping v0.1.0 runtime foundation for repeat-case lookup, report drafts, notice drafts, and public UI foundation. |</w:t>
+        <w:br/>
+        <w:t>| civicgrants | &lt;https://github.com/CivicSuite/civicgrants&gt; | Shipping v0.1.0 runtime foundation for opportunity triage, eligibility matching, compliance calendars, and public UI foundation. |</w:t>
         <w:br/>
         <w:t>| future modules | not created yet | Specs only. |</w:t>
       </w:r>

</xml_diff>

<commit_message>
docs: update CivicGrants v0.1.0 compatibility state (#21)
Co-authored-by: Scott Converse <scott@civicsuite.local>
</commit_message>
<xml_diff>
--- a/USER-MANUAL.docx
+++ b/USER-MANUAL.docx
@@ -57,7 +57,7 @@
     </w:p>
     <w:p>
       <w:r>
-        <w:t>Today, multiple modules are shipping at different maturity levels: CivicRecords AI is production-usable, while CivicClerk, CivicCode, CivicZone, CivicAccess, CivicPlan, CivicPermit, and CivicInspect have runtime-foundation releases. The rest are planned. We say so plainly below — no roadmap inflation, no vaporware.</w:t>
+        <w:t>Today, multiple modules are shipping at different maturity levels: CivicRecords AI is production-usable, while CivicClerk, CivicCode, CivicZone, CivicAccess, CivicPlan, CivicPermit, CivicInspect, and CivicGrants have runtime-foundation releases. The rest are planned. We say so plainly below — no roadmap inflation, no vaporware.</w:t>
       </w:r>
     </w:p>
     <w:p>
@@ -87,6 +87,8 @@
         <w:t>- **civicpermit v0.1.0** — a runtime-foundation release for permit pre-application and intake-readiness support. It ships deterministic sample permit requirement lookup, intake-readiness review, submittal outline helper, records-ready export checklist, and a public sample UI at `/civicpermit`. It still does not ship permit approvals, legal advice, live GIS, live LLM calls, plan ingestion, production permitting-system integrations, or system-of-record behavior. Repo: &lt;https://github.com/CivicSuite/civicpermit&gt;.</w:t>
         <w:br/>
         <w:t>- **civicinspect v0.1.0** — a runtime-foundation release for inspection support. It ships deterministic sample repeat-case lookup, inspector-owned report draft helper, notice draft helper, records-ready export checklist, and a public sample UI at `/civicinspect`. It still does not ship official findings, citations, fines, notices, inspection scheduling, legal advice, live photo analysis, live LLM calls, or system-of-record integrations. Repo: &lt;https://github.com/CivicSuite/civicinspect&gt;.</w:t>
+        <w:br/>
+        <w:t>- **civicgrants v0.1.0** — a runtime-foundation release for grant opportunity and compliance support. It ships deterministic sample opportunity triage, eligibility-factor matching, application outline helper, compliance calendar helper, audit-ready export checklist, and a public sample UI at `/civicgrants`. It still does not ship live funder feeds, official eligibility decisions, legal advice, live LLM calls, submission portals, or grant system-of-record integrations. Repo: &lt;https://github.com/CivicSuite/civicgrants&gt;.</w:t>
       </w:r>
     </w:p>
     <w:p>
@@ -99,7 +101,7 @@
     </w:p>
     <w:p>
       <w:r>
-        <w:t>- Seventeen additional modules across seven tiers — see the [module catalog](specs/01_catalog.md).</w:t>
+        <w:t>- Sixteen additional modules across seven tiers — see the [module catalog](specs/01_catalog.md).</w:t>
       </w:r>
     </w:p>
     <w:p>
@@ -224,6 +226,8 @@
         <w:t>| civicpermit | &lt;https://github.com/CivicSuite/civicpermit&gt; | Shipping v0.1.0 runtime foundation for permit requirement lookup and public UI foundation. |</w:t>
         <w:br/>
         <w:t>| civicinspect | &lt;https://github.com/CivicSuite/civicinspect&gt; | Shipping v0.1.0 runtime foundation for repeat-case lookup, report drafts, notice drafts, and public UI foundation. |</w:t>
+        <w:br/>
+        <w:t>| civicgrants | &lt;https://github.com/CivicSuite/civicgrants&gt; | Shipping v0.1.0 runtime foundation for opportunity triage, eligibility matching, compliance calendars, and public UI foundation. |</w:t>
         <w:br/>
         <w:t>| future modules | not created yet | Specs only. |</w:t>
       </w:r>

</xml_diff>

<commit_message>
docs: update CivicProcure v0.1.0 compatibility state
</commit_message>
<xml_diff>
--- a/USER-MANUAL.docx
+++ b/USER-MANUAL.docx
@@ -57,7 +57,7 @@
     </w:p>
     <w:p>
       <w:r>
-        <w:t>Today, multiple modules are shipping at different maturity levels: CivicRecords AI is production-usable, while CivicClerk, CivicCode, CivicZone, CivicAccess, CivicPlan, CivicPermit, CivicInspect, and CivicGrants have runtime-foundation releases. The rest are planned. We say so plainly below — no roadmap inflation, no vaporware.</w:t>
+        <w:t>Today, multiple modules are shipping at different maturity levels: CivicRecords AI is production-usable, while CivicClerk, CivicCode, CivicZone, CivicAccess, CivicPlan, CivicPermit, CivicInspect, CivicGrants, and CivicProcure have runtime-foundation releases. The rest are planned. We say so plainly below — no roadmap inflation, no vaporware.</w:t>
       </w:r>
     </w:p>
     <w:p>
@@ -89,6 +89,8 @@
         <w:t>- **civicinspect v0.1.0** — a runtime-foundation release for inspection support. It ships deterministic sample repeat-case lookup, inspector-owned report draft helper, notice draft helper, records-ready export checklist, and a public sample UI at `/civicinspect`. It still does not ship official findings, citations, fines, notices, inspection scheduling, legal advice, live photo analysis, live LLM calls, or system-of-record integrations. Repo: &lt;https://github.com/CivicSuite/civicinspect&gt;.</w:t>
         <w:br/>
         <w:t>- **civicgrants v0.1.0** — a runtime-foundation release for grant opportunity and compliance support. It ships deterministic sample opportunity triage, eligibility-factor matching, application outline helper, compliance calendar helper, audit-ready export checklist, and a public sample UI at `/civicgrants`. It still does not ship live funder feeds, official eligibility decisions, legal advice, live LLM calls, submission portals, or grant system-of-record integrations. Repo: &lt;https://github.com/CivicSuite/civicgrants&gt;.</w:t>
+        <w:br/>
+        <w:t>- **civicprocure v0.1.0** — a runtime-foundation release for procurement drafting and award-packet support. It ships deterministic sample RFP drafting, proposal comparison, exception extraction, scoring summary helper, award-packet checklist, and a public sample UI at `/civicprocure`. It still does not ship live vendor portals, official vendor evaluation decisions, legal advice, live LLM calls, e-procurement submission portals, or procurement system-of-record integrations. Repo: &lt;https://github.com/CivicSuite/civicprocure&gt;.</w:t>
       </w:r>
     </w:p>
     <w:p>
@@ -101,7 +103,7 @@
     </w:p>
     <w:p>
       <w:r>
-        <w:t>- Sixteen additional modules across seven tiers — see the [module catalog](specs/01_catalog.md).</w:t>
+        <w:t>- Fifteen additional modules across seven tiers — see the [module catalog](specs/01_catalog.md).</w:t>
       </w:r>
     </w:p>
     <w:p>
@@ -228,6 +230,8 @@
         <w:t>| civicinspect | &lt;https://github.com/CivicSuite/civicinspect&gt; | Shipping v0.1.0 runtime foundation for repeat-case lookup, report drafts, notice drafts, and public UI foundation. |</w:t>
         <w:br/>
         <w:t>| civicgrants | &lt;https://github.com/CivicSuite/civicgrants&gt; | Shipping v0.1.0 runtime foundation for opportunity triage, eligibility matching, compliance calendars, and public UI foundation. |</w:t>
+        <w:br/>
+        <w:t>| civicprocure | &lt;https://github.com/CivicSuite/civicprocure&gt; | Shipping v0.1.0 runtime foundation for RFP drafting, proposal comparison, exception extraction, scoring summaries, award-packet checklists, and public UI foundation. |</w:t>
         <w:br/>
         <w:t>| future modules | not created yet | Specs only. |</w:t>
       </w:r>

</xml_diff>

<commit_message>
docs: update CivicProcure v0.1.0 compatibility state (#22)
Co-authored-by: Scott Converse <scott@civicsuite.local>
</commit_message>
<xml_diff>
--- a/USER-MANUAL.docx
+++ b/USER-MANUAL.docx
@@ -57,7 +57,7 @@
     </w:p>
     <w:p>
       <w:r>
-        <w:t>Today, multiple modules are shipping at different maturity levels: CivicRecords AI is production-usable, while CivicClerk, CivicCode, CivicZone, CivicAccess, CivicPlan, CivicPermit, CivicInspect, and CivicGrants have runtime-foundation releases. The rest are planned. We say so plainly below — no roadmap inflation, no vaporware.</w:t>
+        <w:t>Today, multiple modules are shipping at different maturity levels: CivicRecords AI is production-usable, while CivicClerk, CivicCode, CivicZone, CivicAccess, CivicPlan, CivicPermit, CivicInspect, CivicGrants, and CivicProcure have runtime-foundation releases. The rest are planned. We say so plainly below — no roadmap inflation, no vaporware.</w:t>
       </w:r>
     </w:p>
     <w:p>
@@ -89,6 +89,8 @@
         <w:t>- **civicinspect v0.1.0** — a runtime-foundation release for inspection support. It ships deterministic sample repeat-case lookup, inspector-owned report draft helper, notice draft helper, records-ready export checklist, and a public sample UI at `/civicinspect`. It still does not ship official findings, citations, fines, notices, inspection scheduling, legal advice, live photo analysis, live LLM calls, or system-of-record integrations. Repo: &lt;https://github.com/CivicSuite/civicinspect&gt;.</w:t>
         <w:br/>
         <w:t>- **civicgrants v0.1.0** — a runtime-foundation release for grant opportunity and compliance support. It ships deterministic sample opportunity triage, eligibility-factor matching, application outline helper, compliance calendar helper, audit-ready export checklist, and a public sample UI at `/civicgrants`. It still does not ship live funder feeds, official eligibility decisions, legal advice, live LLM calls, submission portals, or grant system-of-record integrations. Repo: &lt;https://github.com/CivicSuite/civicgrants&gt;.</w:t>
+        <w:br/>
+        <w:t>- **civicprocure v0.1.0** — a runtime-foundation release for procurement drafting and award-packet support. It ships deterministic sample RFP drafting, proposal comparison, exception extraction, scoring summary helper, award-packet checklist, and a public sample UI at `/civicprocure`. It still does not ship live vendor portals, official vendor evaluation decisions, legal advice, live LLM calls, e-procurement submission portals, or procurement system-of-record integrations. Repo: &lt;https://github.com/CivicSuite/civicprocure&gt;.</w:t>
       </w:r>
     </w:p>
     <w:p>
@@ -101,7 +103,7 @@
     </w:p>
     <w:p>
       <w:r>
-        <w:t>- Sixteen additional modules across seven tiers — see the [module catalog](specs/01_catalog.md).</w:t>
+        <w:t>- Fifteen additional modules across seven tiers — see the [module catalog](specs/01_catalog.md).</w:t>
       </w:r>
     </w:p>
     <w:p>
@@ -228,6 +230,8 @@
         <w:t>| civicinspect | &lt;https://github.com/CivicSuite/civicinspect&gt; | Shipping v0.1.0 runtime foundation for repeat-case lookup, report drafts, notice drafts, and public UI foundation. |</w:t>
         <w:br/>
         <w:t>| civicgrants | &lt;https://github.com/CivicSuite/civicgrants&gt; | Shipping v0.1.0 runtime foundation for opportunity triage, eligibility matching, compliance calendars, and public UI foundation. |</w:t>
+        <w:br/>
+        <w:t>| civicprocure | &lt;https://github.com/CivicSuite/civicprocure&gt; | Shipping v0.1.0 runtime foundation for RFP drafting, proposal comparison, exception extraction, scoring summaries, award-packet checklists, and public UI foundation. |</w:t>
         <w:br/>
         <w:t>| future modules | not created yet | Specs only. |</w:t>
       </w:r>

</xml_diff>

<commit_message>
docs: update CivicContracts v0.1.0 compatibility state
</commit_message>
<xml_diff>
--- a/USER-MANUAL.docx
+++ b/USER-MANUAL.docx
@@ -57,7 +57,7 @@
     </w:p>
     <w:p>
       <w:r>
-        <w:t>Today, multiple modules are shipping at different maturity levels: CivicRecords AI is production-usable, while CivicClerk, CivicCode, CivicZone, CivicAccess, CivicPlan, CivicPermit, CivicInspect, CivicGrants, and CivicProcure have runtime-foundation releases. The rest are planned. We say so plainly below — no roadmap inflation, no vaporware.</w:t>
+        <w:t>Today, multiple modules are shipping at different maturity levels: CivicRecords AI is production-usable, while CivicClerk, CivicCode, CivicZone, CivicAccess, CivicPlan, CivicPermit, CivicInspect, CivicGrants, CivicProcure, and CivicContracts have runtime-foundation releases. The rest are planned. We say so plainly below — no roadmap inflation, no vaporware.</w:t>
       </w:r>
     </w:p>
     <w:p>
@@ -91,6 +91,8 @@
         <w:t>- **civicgrants v0.1.0** — a runtime-foundation release for grant opportunity and compliance support. It ships deterministic sample opportunity triage, eligibility-factor matching, application outline helper, compliance calendar helper, audit-ready export checklist, and a public sample UI at `/civicgrants`. It still does not ship live funder feeds, official eligibility decisions, legal advice, live LLM calls, submission portals, or grant system-of-record integrations. Repo: &lt;https://github.com/CivicSuite/civicgrants&gt;.</w:t>
         <w:br/>
         <w:t>- **civicprocure v0.1.0** — a runtime-foundation release for procurement drafting and award-packet support. It ships deterministic sample RFP drafting, proposal comparison, exception extraction, scoring summary helper, award-packet checklist, and a public sample UI at `/civicprocure`. It still does not ship live vendor portals, official vendor evaluation decisions, legal advice, live LLM calls, e-procurement submission portals, or procurement system-of-record integrations. Repo: &lt;https://github.com/CivicSuite/civicprocure&gt;.</w:t>
+        <w:br/>
+        <w:t>- **civiccontracts v0.1.0** - a runtime-foundation release for contract repository and renewal visibility support. It ships deterministic sample contract registry, clause topic lookup, expiration tracking, renewal visibility, public-records export checklist, and a public sample UI at `/civiccontracts`. It still does not ship live contract management platforms, official legal interpretation, legal advice, renewal approvals, contract execution workflows, live LLM calls, or contract system-of-record integrations. Repo: &lt;https://github.com/CivicSuite/civiccontracts&gt;.</w:t>
       </w:r>
     </w:p>
     <w:p>
@@ -103,7 +105,7 @@
     </w:p>
     <w:p>
       <w:r>
-        <w:t>- Fifteen additional modules across seven tiers — see the [module catalog](specs/01_catalog.md).</w:t>
+        <w:t>- Fourteen additional modules across seven tiers — see the [module catalog](specs/01_catalog.md).</w:t>
       </w:r>
     </w:p>
     <w:p>
@@ -233,6 +235,8 @@
         <w:br/>
         <w:t>| civicprocure | &lt;https://github.com/CivicSuite/civicprocure&gt; | Shipping v0.1.0 runtime foundation for RFP drafting, proposal comparison, exception extraction, scoring summaries, award-packet checklists, and public UI foundation. |</w:t>
         <w:br/>
+        <w:t>| civiccontracts | &lt;https://github.com/CivicSuite/civiccontracts&gt; | Shipping v0.1.0 runtime foundation for contract registry, clause topic lookup, expiration tracking, renewal visibility, public-records exports, and public UI foundation. |</w:t>
+        <w:br/>
         <w:t>| future modules | not created yet | Specs only. |</w:t>
       </w:r>
     </w:p>
@@ -351,7 +355,7 @@
       <w:r>
         <w:drawing>
           <wp:inline xmlns:a="http://schemas.openxmlformats.org/drawingml/2006/main" xmlns:pic="http://schemas.openxmlformats.org/drawingml/2006/picture">
-            <wp:extent cx="5486400" cy="3749040"/>
+            <wp:extent cx="5486400" cy="5486400"/>
             <wp:docPr id="1" name="Picture 1"/>
             <wp:cNvGraphicFramePr>
               <a:graphicFrameLocks noChangeAspect="1"/>
@@ -372,7 +376,7 @@
                   <pic:spPr>
                     <a:xfrm>
                       <a:off x="0" y="0"/>
-                      <a:ext cx="5486400" cy="3749040"/>
+                      <a:ext cx="5486400" cy="5486400"/>
                     </a:xfrm>
                     <a:prstGeom prst="rect"/>
                   </pic:spPr>

</xml_diff>

<commit_message>
docs: update CivicContracts v0.1.0 compatibility state (#23)
Co-authored-by: Scott Converse <scott@civicsuite.local>
</commit_message>
<xml_diff>
--- a/USER-MANUAL.docx
+++ b/USER-MANUAL.docx
@@ -57,7 +57,7 @@
     </w:p>
     <w:p>
       <w:r>
-        <w:t>Today, multiple modules are shipping at different maturity levels: CivicRecords AI is production-usable, while CivicClerk, CivicCode, CivicZone, CivicAccess, CivicPlan, CivicPermit, CivicInspect, CivicGrants, and CivicProcure have runtime-foundation releases. The rest are planned. We say so plainly below — no roadmap inflation, no vaporware.</w:t>
+        <w:t>Today, multiple modules are shipping at different maturity levels: CivicRecords AI is production-usable, while CivicClerk, CivicCode, CivicZone, CivicAccess, CivicPlan, CivicPermit, CivicInspect, CivicGrants, CivicProcure, and CivicContracts have runtime-foundation releases. The rest are planned. We say so plainly below — no roadmap inflation, no vaporware.</w:t>
       </w:r>
     </w:p>
     <w:p>
@@ -91,6 +91,8 @@
         <w:t>- **civicgrants v0.1.0** — a runtime-foundation release for grant opportunity and compliance support. It ships deterministic sample opportunity triage, eligibility-factor matching, application outline helper, compliance calendar helper, audit-ready export checklist, and a public sample UI at `/civicgrants`. It still does not ship live funder feeds, official eligibility decisions, legal advice, live LLM calls, submission portals, or grant system-of-record integrations. Repo: &lt;https://github.com/CivicSuite/civicgrants&gt;.</w:t>
         <w:br/>
         <w:t>- **civicprocure v0.1.0** — a runtime-foundation release for procurement drafting and award-packet support. It ships deterministic sample RFP drafting, proposal comparison, exception extraction, scoring summary helper, award-packet checklist, and a public sample UI at `/civicprocure`. It still does not ship live vendor portals, official vendor evaluation decisions, legal advice, live LLM calls, e-procurement submission portals, or procurement system-of-record integrations. Repo: &lt;https://github.com/CivicSuite/civicprocure&gt;.</w:t>
+        <w:br/>
+        <w:t>- **civiccontracts v0.1.0** - a runtime-foundation release for contract repository and renewal visibility support. It ships deterministic sample contract registry, clause topic lookup, expiration tracking, renewal visibility, public-records export checklist, and a public sample UI at `/civiccontracts`. It still does not ship live contract management platforms, official legal interpretation, legal advice, renewal approvals, contract execution workflows, live LLM calls, or contract system-of-record integrations. Repo: &lt;https://github.com/CivicSuite/civiccontracts&gt;.</w:t>
       </w:r>
     </w:p>
     <w:p>
@@ -103,7 +105,7 @@
     </w:p>
     <w:p>
       <w:r>
-        <w:t>- Fifteen additional modules across seven tiers — see the [module catalog](specs/01_catalog.md).</w:t>
+        <w:t>- Fourteen additional modules across seven tiers — see the [module catalog](specs/01_catalog.md).</w:t>
       </w:r>
     </w:p>
     <w:p>
@@ -233,6 +235,8 @@
         <w:br/>
         <w:t>| civicprocure | &lt;https://github.com/CivicSuite/civicprocure&gt; | Shipping v0.1.0 runtime foundation for RFP drafting, proposal comparison, exception extraction, scoring summaries, award-packet checklists, and public UI foundation. |</w:t>
         <w:br/>
+        <w:t>| civiccontracts | &lt;https://github.com/CivicSuite/civiccontracts&gt; | Shipping v0.1.0 runtime foundation for contract registry, clause topic lookup, expiration tracking, renewal visibility, public-records exports, and public UI foundation. |</w:t>
+        <w:br/>
         <w:t>| future modules | not created yet | Specs only. |</w:t>
       </w:r>
     </w:p>
@@ -351,7 +355,7 @@
       <w:r>
         <w:drawing>
           <wp:inline xmlns:a="http://schemas.openxmlformats.org/drawingml/2006/main" xmlns:pic="http://schemas.openxmlformats.org/drawingml/2006/picture">
-            <wp:extent cx="5486400" cy="3749040"/>
+            <wp:extent cx="5486400" cy="5486400"/>
             <wp:docPr id="1" name="Picture 1"/>
             <wp:cNvGraphicFramePr>
               <a:graphicFrameLocks noChangeAspect="1"/>
@@ -372,7 +376,7 @@
                   <pic:spPr>
                     <a:xfrm>
                       <a:off x="0" y="0"/>
-                      <a:ext cx="5486400" cy="3749040"/>
+                      <a:ext cx="5486400" cy="5486400"/>
                     </a:xfrm>
                     <a:prstGeom prst="rect"/>
                   </pic:spPr>

</xml_diff>

<commit_message>
docs: update CivicBoards v0.1.0 compatibility state
</commit_message>
<xml_diff>
--- a/USER-MANUAL.docx
+++ b/USER-MANUAL.docx
@@ -57,7 +57,7 @@
     </w:p>
     <w:p>
       <w:r>
-        <w:t>Today, multiple modules are shipping at different maturity levels: CivicRecords AI is production-usable, while CivicClerk, CivicCode, CivicZone, CivicAccess, CivicPlan, CivicPermit, CivicInspect, CivicGrants, CivicProcure, and CivicContracts have runtime-foundation releases. The rest are planned. We say so plainly below — no roadmap inflation, no vaporware.</w:t>
+        <w:t>Today, multiple modules are shipping at different maturity levels: CivicRecords AI is production-usable, while CivicClerk, CivicCode, CivicZone, CivicAccess, CivicPlan, CivicPermit, CivicInspect, CivicGrants, CivicProcure, CivicContracts, and CivicBoards have runtime-foundation releases. The rest are planned. We say so plainly below — no roadmap inflation, no vaporware.</w:t>
       </w:r>
     </w:p>
     <w:p>
@@ -93,6 +93,8 @@
         <w:t>- **civicprocure v0.1.0** — a runtime-foundation release for procurement drafting and award-packet support. It ships deterministic sample RFP drafting, proposal comparison, exception extraction, scoring summary helper, award-packet checklist, and a public sample UI at `/civicprocure`. It still does not ship live vendor portals, official vendor evaluation decisions, legal advice, live LLM calls, e-procurement submission portals, or procurement system-of-record integrations. Repo: &lt;https://github.com/CivicSuite/civicprocure&gt;.</w:t>
         <w:br/>
         <w:t>- **civiccontracts v0.1.0** - a runtime-foundation release for contract repository and renewal visibility support. It ships deterministic sample contract registry, clause topic lookup, expiration tracking, renewal visibility, public-records export checklist, and a public sample UI at `/civiccontracts`. It still does not ship live contract management platforms, official legal interpretation, legal advice, renewal approvals, contract execution workflows, live LLM calls, or contract system-of-record integrations. Repo: &lt;https://github.com/CivicSuite/civiccontracts&gt;.</w:t>
+        <w:br/>
+        <w:t>- **civicboards v0.1.0** - a runtime-foundation release for board and commission administration. It ships deterministic sample board registry, term review plans, vacancy checklists, attendance summaries, notice/records export checklist, and a public sample UI at `/civicboards`. It still does not ship live agenda systems, appointment decisions, legal advice, official notice publication, meeting system write-back, live LLM calls, or board system-of-record integrations. Repo: &lt;https://github.com/CivicSuite/civicboards&gt;.</w:t>
       </w:r>
     </w:p>
     <w:p>
@@ -105,7 +107,7 @@
     </w:p>
     <w:p>
       <w:r>
-        <w:t>- Fourteen additional modules across seven tiers — see the [module catalog](specs/01_catalog.md).</w:t>
+        <w:t>- Thirteen additional modules across seven tiers — see the [module catalog](specs/01_catalog.md).</w:t>
       </w:r>
     </w:p>
     <w:p>
@@ -236,6 +238,8 @@
         <w:t>| civicprocure | &lt;https://github.com/CivicSuite/civicprocure&gt; | Shipping v0.1.0 runtime foundation for RFP drafting, proposal comparison, exception extraction, scoring summaries, award-packet checklists, and public UI foundation. |</w:t>
         <w:br/>
         <w:t>| civiccontracts | &lt;https://github.com/CivicSuite/civiccontracts&gt; | Shipping v0.1.0 runtime foundation for contract registry, clause topic lookup, expiration tracking, renewal visibility, public-records exports, and public UI foundation. |</w:t>
+        <w:br/>
+        <w:t>| civicboards | &lt;https://github.com/CivicSuite/civicboards&gt; | Shipping v0.1.0 runtime foundation for board registry, term tracking, vacancy tracking, attendance review, notice/records exports, and public UI foundation. |</w:t>
         <w:br/>
         <w:t>| future modules | not created yet | Specs only. |</w:t>
       </w:r>

</xml_diff>

<commit_message>
docs: update CivicBoards v0.1.0 compatibility state (#24)
Co-authored-by: Scott Converse <scott@civicsuite.local>
</commit_message>
<xml_diff>
--- a/USER-MANUAL.docx
+++ b/USER-MANUAL.docx
@@ -57,7 +57,7 @@
     </w:p>
     <w:p>
       <w:r>
-        <w:t>Today, multiple modules are shipping at different maturity levels: CivicRecords AI is production-usable, while CivicClerk, CivicCode, CivicZone, CivicAccess, CivicPlan, CivicPermit, CivicInspect, CivicGrants, CivicProcure, and CivicContracts have runtime-foundation releases. The rest are planned. We say so plainly below — no roadmap inflation, no vaporware.</w:t>
+        <w:t>Today, multiple modules are shipping at different maturity levels: CivicRecords AI is production-usable, while CivicClerk, CivicCode, CivicZone, CivicAccess, CivicPlan, CivicPermit, CivicInspect, CivicGrants, CivicProcure, CivicContracts, and CivicBoards have runtime-foundation releases. The rest are planned. We say so plainly below — no roadmap inflation, no vaporware.</w:t>
       </w:r>
     </w:p>
     <w:p>
@@ -93,6 +93,8 @@
         <w:t>- **civicprocure v0.1.0** — a runtime-foundation release for procurement drafting and award-packet support. It ships deterministic sample RFP drafting, proposal comparison, exception extraction, scoring summary helper, award-packet checklist, and a public sample UI at `/civicprocure`. It still does not ship live vendor portals, official vendor evaluation decisions, legal advice, live LLM calls, e-procurement submission portals, or procurement system-of-record integrations. Repo: &lt;https://github.com/CivicSuite/civicprocure&gt;.</w:t>
         <w:br/>
         <w:t>- **civiccontracts v0.1.0** - a runtime-foundation release for contract repository and renewal visibility support. It ships deterministic sample contract registry, clause topic lookup, expiration tracking, renewal visibility, public-records export checklist, and a public sample UI at `/civiccontracts`. It still does not ship live contract management platforms, official legal interpretation, legal advice, renewal approvals, contract execution workflows, live LLM calls, or contract system-of-record integrations. Repo: &lt;https://github.com/CivicSuite/civiccontracts&gt;.</w:t>
+        <w:br/>
+        <w:t>- **civicboards v0.1.0** - a runtime-foundation release for board and commission administration. It ships deterministic sample board registry, term review plans, vacancy checklists, attendance summaries, notice/records export checklist, and a public sample UI at `/civicboards`. It still does not ship live agenda systems, appointment decisions, legal advice, official notice publication, meeting system write-back, live LLM calls, or board system-of-record integrations. Repo: &lt;https://github.com/CivicSuite/civicboards&gt;.</w:t>
       </w:r>
     </w:p>
     <w:p>
@@ -105,7 +107,7 @@
     </w:p>
     <w:p>
       <w:r>
-        <w:t>- Fourteen additional modules across seven tiers — see the [module catalog](specs/01_catalog.md).</w:t>
+        <w:t>- Thirteen additional modules across seven tiers — see the [module catalog](specs/01_catalog.md).</w:t>
       </w:r>
     </w:p>
     <w:p>
@@ -236,6 +238,8 @@
         <w:t>| civicprocure | &lt;https://github.com/CivicSuite/civicprocure&gt; | Shipping v0.1.0 runtime foundation for RFP drafting, proposal comparison, exception extraction, scoring summaries, award-packet checklists, and public UI foundation. |</w:t>
         <w:br/>
         <w:t>| civiccontracts | &lt;https://github.com/CivicSuite/civiccontracts&gt; | Shipping v0.1.0 runtime foundation for contract registry, clause topic lookup, expiration tracking, renewal visibility, public-records exports, and public UI foundation. |</w:t>
+        <w:br/>
+        <w:t>| civicboards | &lt;https://github.com/CivicSuite/civicboards&gt; | Shipping v0.1.0 runtime foundation for board registry, term tracking, vacancy tracking, attendance review, notice/records exports, and public UI foundation. |</w:t>
         <w:br/>
         <w:t>| future modules | not created yet | Specs only. |</w:t>
       </w:r>

</xml_diff>

<commit_message>
docs: update CivicNotice v0.1.0 compatibility state
</commit_message>
<xml_diff>
--- a/USER-MANUAL.docx
+++ b/USER-MANUAL.docx
@@ -57,7 +57,7 @@
     </w:p>
     <w:p>
       <w:r>
-        <w:t>Today, multiple modules are shipping at different maturity levels: CivicRecords AI is production-usable, while CivicClerk, CivicCode, CivicZone, CivicAccess, CivicPlan, CivicPermit, CivicInspect, CivicGrants, CivicProcure, CivicContracts, and CivicBoards have runtime-foundation releases. The rest are planned. We say so plainly below — no roadmap inflation, no vaporware.</w:t>
+        <w:t>Today, multiple modules are shipping at different maturity levels: CivicRecords AI is production-usable, while CivicClerk, CivicCode, CivicZone, CivicAccess, CivicPlan, CivicPermit, CivicInspect, CivicGrants, CivicProcure, CivicContracts, CivicBoards, and CivicNotice have runtime-foundation releases. The rest are planned. We say so plainly below — no roadmap inflation, no vaporware.</w:t>
       </w:r>
     </w:p>
     <w:p>
@@ -95,6 +95,8 @@
         <w:t>- **civiccontracts v0.1.0** - a runtime-foundation release for contract repository and renewal visibility support. It ships deterministic sample contract registry, clause topic lookup, expiration tracking, renewal visibility, public-records export checklist, and a public sample UI at `/civiccontracts`. It still does not ship live contract management platforms, official legal interpretation, legal advice, renewal approvals, contract execution workflows, live LLM calls, or contract system-of-record integrations. Repo: &lt;https://github.com/CivicSuite/civiccontracts&gt;.</w:t>
         <w:br/>
         <w:t>- **civicboards v0.1.0** - a runtime-foundation release for board and commission administration. It ships deterministic sample board registry, term review plans, vacancy checklists, attendance summaries, notice/records export checklist, and a public sample UI at `/civicboards`. It still does not ship live agenda systems, appointment decisions, legal advice, official notice publication, meeting system write-back, live LLM calls, or board system-of-record integrations. Repo: &lt;https://github.com/CivicSuite/civicboards&gt;.</w:t>
+        <w:br/>
+        <w:t>- **civicnotice v0.1.0** - a runtime-foundation release for public notice compliance support. It ships deterministic sample notice registry, statutory deadline plans, publication-readiness checklists, channel planning, notice/records export checklist, and a public sample UI at /civicnotice. It still does not ship legal sufficiency decisions, legal advice, live LLM calls, official notice publication, publication-system write-back, or notice system-of-record integrations. Repo: &lt;https://github.com/CivicSuite/civicnotice&gt;.</w:t>
       </w:r>
     </w:p>
     <w:p>
@@ -107,7 +109,7 @@
     </w:p>
     <w:p>
       <w:r>
-        <w:t>- Thirteen additional modules across seven tiers — see the [module catalog](specs/01_catalog.md).</w:t>
+        <w:t>- Twelve additional modules across seven tiers — see the [module catalog](specs/01_catalog.md).</w:t>
       </w:r>
     </w:p>
     <w:p>
@@ -241,6 +243,8 @@
         <w:br/>
         <w:t>| civicboards | &lt;https://github.com/CivicSuite/civicboards&gt; | Shipping v0.1.0 runtime foundation for board registry, term tracking, vacancy tracking, attendance review, notice/records exports, and public UI foundation. |</w:t>
         <w:br/>
+        <w:t>| civicnotice | &lt;https://github.com/CivicSuite/civicnotice&gt; | Shipping v0.1.0 runtime foundation for notice registry, statutory deadlines, publication-readiness checks, channel planning, notice records exports, and public UI foundation. |</w:t>
+        <w:br/>
         <w:t>| future modules | not created yet | Specs only. |</w:t>
       </w:r>
     </w:p>
@@ -359,7 +363,7 @@
       <w:r>
         <w:drawing>
           <wp:inline xmlns:a="http://schemas.openxmlformats.org/drawingml/2006/main" xmlns:pic="http://schemas.openxmlformats.org/drawingml/2006/picture">
-            <wp:extent cx="5486400" cy="5486400"/>
+            <wp:extent cx="5486400" cy="587829"/>
             <wp:docPr id="1" name="Picture 1"/>
             <wp:cNvGraphicFramePr>
               <a:graphicFrameLocks noChangeAspect="1"/>
@@ -380,7 +384,7 @@
                   <pic:spPr>
                     <a:xfrm>
                       <a:off x="0" y="0"/>
-                      <a:ext cx="5486400" cy="5486400"/>
+                      <a:ext cx="5486400" cy="587829"/>
                     </a:xfrm>
                     <a:prstGeom prst="rect"/>
                   </pic:spPr>

</xml_diff>

<commit_message>
docs: update CivicNotice v0.1.0 compatibility state (#25)
Co-authored-by: Scott Converse <scott@civicsuite.local>
</commit_message>
<xml_diff>
--- a/USER-MANUAL.docx
+++ b/USER-MANUAL.docx
@@ -57,7 +57,7 @@
     </w:p>
     <w:p>
       <w:r>
-        <w:t>Today, multiple modules are shipping at different maturity levels: CivicRecords AI is production-usable, while CivicClerk, CivicCode, CivicZone, CivicAccess, CivicPlan, CivicPermit, CivicInspect, CivicGrants, CivicProcure, CivicContracts, and CivicBoards have runtime-foundation releases. The rest are planned. We say so plainly below — no roadmap inflation, no vaporware.</w:t>
+        <w:t>Today, multiple modules are shipping at different maturity levels: CivicRecords AI is production-usable, while CivicClerk, CivicCode, CivicZone, CivicAccess, CivicPlan, CivicPermit, CivicInspect, CivicGrants, CivicProcure, CivicContracts, CivicBoards, and CivicNotice have runtime-foundation releases. The rest are planned. We say so plainly below — no roadmap inflation, no vaporware.</w:t>
       </w:r>
     </w:p>
     <w:p>
@@ -95,6 +95,8 @@
         <w:t>- **civiccontracts v0.1.0** - a runtime-foundation release for contract repository and renewal visibility support. It ships deterministic sample contract registry, clause topic lookup, expiration tracking, renewal visibility, public-records export checklist, and a public sample UI at `/civiccontracts`. It still does not ship live contract management platforms, official legal interpretation, legal advice, renewal approvals, contract execution workflows, live LLM calls, or contract system-of-record integrations. Repo: &lt;https://github.com/CivicSuite/civiccontracts&gt;.</w:t>
         <w:br/>
         <w:t>- **civicboards v0.1.0** - a runtime-foundation release for board and commission administration. It ships deterministic sample board registry, term review plans, vacancy checklists, attendance summaries, notice/records export checklist, and a public sample UI at `/civicboards`. It still does not ship live agenda systems, appointment decisions, legal advice, official notice publication, meeting system write-back, live LLM calls, or board system-of-record integrations. Repo: &lt;https://github.com/CivicSuite/civicboards&gt;.</w:t>
+        <w:br/>
+        <w:t>- **civicnotice v0.1.0** - a runtime-foundation release for public notice compliance support. It ships deterministic sample notice registry, statutory deadline plans, publication-readiness checklists, channel planning, notice/records export checklist, and a public sample UI at /civicnotice. It still does not ship legal sufficiency decisions, legal advice, live LLM calls, official notice publication, publication-system write-back, or notice system-of-record integrations. Repo: &lt;https://github.com/CivicSuite/civicnotice&gt;.</w:t>
       </w:r>
     </w:p>
     <w:p>
@@ -107,7 +109,7 @@
     </w:p>
     <w:p>
       <w:r>
-        <w:t>- Thirteen additional modules across seven tiers — see the [module catalog](specs/01_catalog.md).</w:t>
+        <w:t>- Twelve additional modules across seven tiers — see the [module catalog](specs/01_catalog.md).</w:t>
       </w:r>
     </w:p>
     <w:p>
@@ -241,6 +243,8 @@
         <w:br/>
         <w:t>| civicboards | &lt;https://github.com/CivicSuite/civicboards&gt; | Shipping v0.1.0 runtime foundation for board registry, term tracking, vacancy tracking, attendance review, notice/records exports, and public UI foundation. |</w:t>
         <w:br/>
+        <w:t>| civicnotice | &lt;https://github.com/CivicSuite/civicnotice&gt; | Shipping v0.1.0 runtime foundation for notice registry, statutory deadlines, publication-readiness checks, channel planning, notice records exports, and public UI foundation. |</w:t>
+        <w:br/>
         <w:t>| future modules | not created yet | Specs only. |</w:t>
       </w:r>
     </w:p>
@@ -359,7 +363,7 @@
       <w:r>
         <w:drawing>
           <wp:inline xmlns:a="http://schemas.openxmlformats.org/drawingml/2006/main" xmlns:pic="http://schemas.openxmlformats.org/drawingml/2006/picture">
-            <wp:extent cx="5486400" cy="5486400"/>
+            <wp:extent cx="5486400" cy="587829"/>
             <wp:docPr id="1" name="Picture 1"/>
             <wp:cNvGraphicFramePr>
               <a:graphicFrameLocks noChangeAspect="1"/>
@@ -380,7 +384,7 @@
                   <pic:spPr>
                     <a:xfrm>
                       <a:off x="0" y="0"/>
-                      <a:ext cx="5486400" cy="5486400"/>
+                      <a:ext cx="5486400" cy="587829"/>
                     </a:xfrm>
                     <a:prstGeom prst="rect"/>
                   </pic:spPr>

</xml_diff>

<commit_message>
docs: update Civic311 v0.1.0 compatibility state
</commit_message>
<xml_diff>
--- a/USER-MANUAL.docx
+++ b/USER-MANUAL.docx
@@ -57,7 +57,7 @@
     </w:p>
     <w:p>
       <w:r>
-        <w:t>Today, multiple modules are shipping at different maturity levels: CivicRecords AI is production-usable, while CivicClerk, CivicCode, CivicZone, CivicAccess, CivicPlan, CivicPermit, CivicInspect, CivicGrants, CivicProcure, CivicContracts, CivicBoards, and CivicNotice have runtime-foundation releases. The rest are planned. We say so plainly below — no roadmap inflation, no vaporware.</w:t>
+        <w:t>Today, multiple modules are shipping at different maturity levels: CivicRecords AI is production-usable, while CivicClerk, CivicCode, CivicZone, CivicAccess, CivicPlan, CivicPermit, CivicInspect, CivicGrants, CivicProcure, CivicContracts, CivicBoards, CivicNotice, and Civic311 have runtime-foundation releases. The rest are planned. We say so plainly below — no roadmap inflation, no vaporware.</w:t>
       </w:r>
     </w:p>
     <w:p>
@@ -97,6 +97,8 @@
         <w:t>- **civicboards v0.1.0** - a runtime-foundation release for board and commission administration. It ships deterministic sample board registry, term review plans, vacancy checklists, attendance summaries, notice/records export checklist, and a public sample UI at `/civicboards`. It still does not ship live agenda systems, appointment decisions, legal advice, official notice publication, meeting system write-back, live LLM calls, or board system-of-record integrations. Repo: &lt;https://github.com/CivicSuite/civicboards&gt;.</w:t>
         <w:br/>
         <w:t>- **civicnotice v0.1.0** - a runtime-foundation release for public notice compliance support. It ships deterministic sample notice registry, statutory deadline plans, publication-readiness checklists, channel planning, notice/records export checklist, and a public sample UI at /civicnotice. It still does not ship legal sufficiency decisions, legal advice, live LLM calls, official notice publication, publication-system write-back, or notice system-of-record integrations. Repo: &lt;https://github.com/CivicSuite/civicnotice&gt;.</w:t>
+        <w:br/>
+        <w:t>- **civic311 v0.1.0** - a runtime-foundation release for resident service request support. It ships deterministic sample request intake, triage suggestions, duplicate-candidate review, department routing checklists, Open311-compatible export helper, and a public sample UI at /civic311. It still does not ship official dispatch, work-order creation, emergency response, legal advice, live LLM calls, 311 system write-back, or 311 system-of-record integrations. Repo: &lt;https://github.com/CivicSuite/civic311&gt;.</w:t>
       </w:r>
     </w:p>
     <w:p>
@@ -244,6 +246,8 @@
         <w:t>| civicboards | &lt;https://github.com/CivicSuite/civicboards&gt; | Shipping v0.1.0 runtime foundation for board registry, term tracking, vacancy tracking, attendance review, notice/records exports, and public UI foundation. |</w:t>
         <w:br/>
         <w:t>| civicnotice | &lt;https://github.com/CivicSuite/civicnotice&gt; | Shipping v0.1.0 runtime foundation for notice registry, statutory deadlines, publication-readiness checks, channel planning, notice records exports, and public UI foundation. |</w:t>
+        <w:br/>
+        <w:t>| civic311 | &lt;https://github.com/CivicSuite/civic311&gt; | Shipping v0.1.0 runtime foundation for request intake, triage suggestions, duplicate-candidate review, department routing, Open311-compatible exports, and public UI foundation. |</w:t>
         <w:br/>
         <w:t>| future modules | not created yet | Specs only. |</w:t>
       </w:r>

</xml_diff>

<commit_message>
docs: update Civic311 v0.1.0 compatibility state (#26)
Co-authored-by: Scott Converse <scott@civicsuite.local>
</commit_message>
<xml_diff>
--- a/USER-MANUAL.docx
+++ b/USER-MANUAL.docx
@@ -57,7 +57,7 @@
     </w:p>
     <w:p>
       <w:r>
-        <w:t>Today, multiple modules are shipping at different maturity levels: CivicRecords AI is production-usable, while CivicClerk, CivicCode, CivicZone, CivicAccess, CivicPlan, CivicPermit, CivicInspect, CivicGrants, CivicProcure, CivicContracts, CivicBoards, and CivicNotice have runtime-foundation releases. The rest are planned. We say so plainly below — no roadmap inflation, no vaporware.</w:t>
+        <w:t>Today, multiple modules are shipping at different maturity levels: CivicRecords AI is production-usable, while CivicClerk, CivicCode, CivicZone, CivicAccess, CivicPlan, CivicPermit, CivicInspect, CivicGrants, CivicProcure, CivicContracts, CivicBoards, CivicNotice, and Civic311 have runtime-foundation releases. The rest are planned. We say so plainly below — no roadmap inflation, no vaporware.</w:t>
       </w:r>
     </w:p>
     <w:p>
@@ -97,6 +97,8 @@
         <w:t>- **civicboards v0.1.0** - a runtime-foundation release for board and commission administration. It ships deterministic sample board registry, term review plans, vacancy checklists, attendance summaries, notice/records export checklist, and a public sample UI at `/civicboards`. It still does not ship live agenda systems, appointment decisions, legal advice, official notice publication, meeting system write-back, live LLM calls, or board system-of-record integrations. Repo: &lt;https://github.com/CivicSuite/civicboards&gt;.</w:t>
         <w:br/>
         <w:t>- **civicnotice v0.1.0** - a runtime-foundation release for public notice compliance support. It ships deterministic sample notice registry, statutory deadline plans, publication-readiness checklists, channel planning, notice/records export checklist, and a public sample UI at /civicnotice. It still does not ship legal sufficiency decisions, legal advice, live LLM calls, official notice publication, publication-system write-back, or notice system-of-record integrations. Repo: &lt;https://github.com/CivicSuite/civicnotice&gt;.</w:t>
+        <w:br/>
+        <w:t>- **civic311 v0.1.0** - a runtime-foundation release for resident service request support. It ships deterministic sample request intake, triage suggestions, duplicate-candidate review, department routing checklists, Open311-compatible export helper, and a public sample UI at /civic311. It still does not ship official dispatch, work-order creation, emergency response, legal advice, live LLM calls, 311 system write-back, or 311 system-of-record integrations. Repo: &lt;https://github.com/CivicSuite/civic311&gt;.</w:t>
       </w:r>
     </w:p>
     <w:p>
@@ -244,6 +246,8 @@
         <w:t>| civicboards | &lt;https://github.com/CivicSuite/civicboards&gt; | Shipping v0.1.0 runtime foundation for board registry, term tracking, vacancy tracking, attendance review, notice/records exports, and public UI foundation. |</w:t>
         <w:br/>
         <w:t>| civicnotice | &lt;https://github.com/CivicSuite/civicnotice&gt; | Shipping v0.1.0 runtime foundation for notice registry, statutory deadlines, publication-readiness checks, channel planning, notice records exports, and public UI foundation. |</w:t>
+        <w:br/>
+        <w:t>| civic311 | &lt;https://github.com/CivicSuite/civic311&gt; | Shipping v0.1.0 runtime foundation for request intake, triage suggestions, duplicate-candidate review, department routing, Open311-compatible exports, and public UI foundation. |</w:t>
         <w:br/>
         <w:t>| future modules | not created yet | Specs only. |</w:t>
       </w:r>

</xml_diff>

<commit_message>
docs: update CivicComms v0.1.0 compatibility state
</commit_message>
<xml_diff>
--- a/USER-MANUAL.docx
+++ b/USER-MANUAL.docx
@@ -57,7 +57,7 @@
     </w:p>
     <w:p>
       <w:r>
-        <w:t>Today, multiple modules are shipping at different maturity levels: CivicRecords AI is production-usable, while CivicClerk, CivicCode, CivicZone, CivicAccess, CivicPlan, CivicPermit, CivicInspect, CivicGrants, CivicProcure, CivicContracts, CivicBoards, CivicNotice, and Civic311 have runtime-foundation releases. The rest are planned. We say so plainly below — no roadmap inflation, no vaporware.</w:t>
+        <w:t>Today, multiple modules are shipping at different maturity levels: CivicRecords AI is production-usable, while CivicClerk, CivicCode, CivicZone, CivicAccess, CivicPlan, CivicPermit, CivicInspect, CivicGrants, CivicProcure, CivicContracts, CivicBoards, CivicNotice, Civic311, and CivicComms have runtime-foundation releases. The rest are planned. We say so plainly below — no roadmap inflation, no vaporware.</w:t>
       </w:r>
     </w:p>
     <w:p>
@@ -99,6 +99,8 @@
         <w:t>- **civicnotice v0.1.0** - a runtime-foundation release for public notice compliance support. It ships deterministic sample notice registry, statutory deadline plans, publication-readiness checklists, channel planning, notice/records export checklist, and a public sample UI at /civicnotice. It still does not ship legal sufficiency decisions, legal advice, live LLM calls, official notice publication, publication-system write-back, or notice system-of-record integrations. Repo: &lt;https://github.com/CivicSuite/civicnotice&gt;.</w:t>
         <w:br/>
         <w:t>- **civic311 v0.1.0** - a runtime-foundation release for resident service request support. It ships deterministic sample request intake, triage suggestions, duplicate-candidate review, department routing checklists, Open311-compatible export helper, and a public sample UI at /civic311. It still does not ship official dispatch, work-order creation, emergency response, legal advice, live LLM calls, 311 system write-back, or 311 system-of-record integrations. Repo: &lt;https://github.com/CivicSuite/civic311&gt;.</w:t>
+        <w:br/>
+        <w:t>- **civiccomms v0.1.0** - a runtime-foundation release for public communications support. It ships source-readiness review, meeting summary drafts, ordinance explainers, newsletter scaffolds, FAQ prompts, audience-variant drafts, and a public sample UI at /civiccomms. It still does not ship autonomous publication, campaign or advocacy content, legal advice, certified translation, live LLM calls, social media posting, or communications system-of-record integrations. Repo: &lt;https://github.com/CivicSuite/civiccomms&gt;.</w:t>
       </w:r>
     </w:p>
     <w:p>
@@ -249,6 +251,8 @@
         <w:br/>
         <w:t>| civic311 | &lt;https://github.com/CivicSuite/civic311&gt; | Shipping v0.1.0 runtime foundation for request intake, triage suggestions, duplicate-candidate review, department routing, Open311-compatible exports, and public UI foundation. |</w:t>
         <w:br/>
+        <w:t>| civiccomms | &lt;https://github.com/CivicSuite/civiccomms&gt; | Shipping v0.1.0 runtime foundation for source-readiness review, meeting summaries, ordinance explainers, newsletters, FAQs, audience variants, and public UI foundation. |</w:t>
+        <w:br/>
         <w:t>| future modules | not created yet | Specs only. |</w:t>
       </w:r>
     </w:p>
@@ -367,7 +371,7 @@
       <w:r>
         <w:drawing>
           <wp:inline xmlns:a="http://schemas.openxmlformats.org/drawingml/2006/main" xmlns:pic="http://schemas.openxmlformats.org/drawingml/2006/picture">
-            <wp:extent cx="5486400" cy="587829"/>
+            <wp:extent cx="5486400" cy="545840"/>
             <wp:docPr id="1" name="Picture 1"/>
             <wp:cNvGraphicFramePr>
               <a:graphicFrameLocks noChangeAspect="1"/>
@@ -388,7 +392,7 @@
                   <pic:spPr>
                     <a:xfrm>
                       <a:off x="0" y="0"/>
-                      <a:ext cx="5486400" cy="587829"/>
+                      <a:ext cx="5486400" cy="545840"/>
                     </a:xfrm>
                     <a:prstGeom prst="rect"/>
                   </pic:spPr>

</xml_diff>

<commit_message>
docs: update CivicComms v0.1.0 compatibility state (#27)
Co-authored-by: Scott Converse <scott@civicsuite.local>
</commit_message>
<xml_diff>
--- a/USER-MANUAL.docx
+++ b/USER-MANUAL.docx
@@ -57,7 +57,7 @@
     </w:p>
     <w:p>
       <w:r>
-        <w:t>Today, multiple modules are shipping at different maturity levels: CivicRecords AI is production-usable, while CivicClerk, CivicCode, CivicZone, CivicAccess, CivicPlan, CivicPermit, CivicInspect, CivicGrants, CivicProcure, CivicContracts, CivicBoards, CivicNotice, and Civic311 have runtime-foundation releases. The rest are planned. We say so plainly below — no roadmap inflation, no vaporware.</w:t>
+        <w:t>Today, multiple modules are shipping at different maturity levels: CivicRecords AI is production-usable, while CivicClerk, CivicCode, CivicZone, CivicAccess, CivicPlan, CivicPermit, CivicInspect, CivicGrants, CivicProcure, CivicContracts, CivicBoards, CivicNotice, Civic311, and CivicComms have runtime-foundation releases. The rest are planned. We say so plainly below — no roadmap inflation, no vaporware.</w:t>
       </w:r>
     </w:p>
     <w:p>
@@ -99,6 +99,8 @@
         <w:t>- **civicnotice v0.1.0** - a runtime-foundation release for public notice compliance support. It ships deterministic sample notice registry, statutory deadline plans, publication-readiness checklists, channel planning, notice/records export checklist, and a public sample UI at /civicnotice. It still does not ship legal sufficiency decisions, legal advice, live LLM calls, official notice publication, publication-system write-back, or notice system-of-record integrations. Repo: &lt;https://github.com/CivicSuite/civicnotice&gt;.</w:t>
         <w:br/>
         <w:t>- **civic311 v0.1.0** - a runtime-foundation release for resident service request support. It ships deterministic sample request intake, triage suggestions, duplicate-candidate review, department routing checklists, Open311-compatible export helper, and a public sample UI at /civic311. It still does not ship official dispatch, work-order creation, emergency response, legal advice, live LLM calls, 311 system write-back, or 311 system-of-record integrations. Repo: &lt;https://github.com/CivicSuite/civic311&gt;.</w:t>
+        <w:br/>
+        <w:t>- **civiccomms v0.1.0** - a runtime-foundation release for public communications support. It ships source-readiness review, meeting summary drafts, ordinance explainers, newsletter scaffolds, FAQ prompts, audience-variant drafts, and a public sample UI at /civiccomms. It still does not ship autonomous publication, campaign or advocacy content, legal advice, certified translation, live LLM calls, social media posting, or communications system-of-record integrations. Repo: &lt;https://github.com/CivicSuite/civiccomms&gt;.</w:t>
       </w:r>
     </w:p>
     <w:p>
@@ -249,6 +251,8 @@
         <w:br/>
         <w:t>| civic311 | &lt;https://github.com/CivicSuite/civic311&gt; | Shipping v0.1.0 runtime foundation for request intake, triage suggestions, duplicate-candidate review, department routing, Open311-compatible exports, and public UI foundation. |</w:t>
         <w:br/>
+        <w:t>| civiccomms | &lt;https://github.com/CivicSuite/civiccomms&gt; | Shipping v0.1.0 runtime foundation for source-readiness review, meeting summaries, ordinance explainers, newsletters, FAQs, audience variants, and public UI foundation. |</w:t>
+        <w:br/>
         <w:t>| future modules | not created yet | Specs only. |</w:t>
       </w:r>
     </w:p>
@@ -367,7 +371,7 @@
       <w:r>
         <w:drawing>
           <wp:inline xmlns:a="http://schemas.openxmlformats.org/drawingml/2006/main" xmlns:pic="http://schemas.openxmlformats.org/drawingml/2006/picture">
-            <wp:extent cx="5486400" cy="587829"/>
+            <wp:extent cx="5486400" cy="545840"/>
             <wp:docPr id="1" name="Picture 1"/>
             <wp:cNvGraphicFramePr>
               <a:graphicFrameLocks noChangeAspect="1"/>
@@ -388,7 +392,7 @@
                   <pic:spPr>
                     <a:xfrm>
                       <a:off x="0" y="0"/>
-                      <a:ext cx="5486400" cy="587829"/>
+                      <a:ext cx="5486400" cy="545840"/>
                     </a:xfrm>
                     <a:prstGeom prst="rect"/>
                   </pic:spPr>

</xml_diff>

<commit_message>
docs: update CivicData v0.1.0 compatibility state
</commit_message>
<xml_diff>
--- a/USER-MANUAL.docx
+++ b/USER-MANUAL.docx
@@ -57,7 +57,7 @@
     </w:p>
     <w:p>
       <w:r>
-        <w:t>Today, multiple modules are shipping at different maturity levels: CivicRecords AI is production-usable, while CivicClerk, CivicCode, CivicZone, CivicAccess, CivicPlan, CivicPermit, CivicInspect, CivicGrants, CivicProcure, CivicContracts, CivicBoards, CivicNotice, Civic311, and CivicComms have runtime-foundation releases. The rest are planned. We say so plainly below — no roadmap inflation, no vaporware.</w:t>
+        <w:t>Today, multiple modules are shipping at different maturity levels: CivicRecords AI is production-usable, while CivicClerk, CivicCode, CivicZone, CivicAccess, CivicPlan, CivicPermit, CivicInspect, CivicGrants, CivicProcure, CivicContracts, CivicBoards, CivicNotice, Civic311, CivicComms, and CivicData have runtime-foundation releases. The rest are planned. We say so plainly below — no roadmap inflation, no vaporware.</w:t>
       </w:r>
     </w:p>
     <w:p>
@@ -101,6 +101,8 @@
         <w:t>- **civic311 v0.1.0** - a runtime-foundation release for resident service request support. It ships deterministic sample request intake, triage suggestions, duplicate-candidate review, department routing checklists, Open311-compatible export helper, and a public sample UI at /civic311. It still does not ship official dispatch, work-order creation, emergency response, legal advice, live LLM calls, 311 system write-back, or 311 system-of-record integrations. Repo: &lt;https://github.com/CivicSuite/civic311&gt;.</w:t>
         <w:br/>
         <w:t>- **civiccomms v0.1.0** - a runtime-foundation release for public communications support. It ships source-readiness review, meeting summary drafts, ordinance explainers, newsletter scaffolds, FAQ prompts, audience-variant drafts, and a public sample UI at /civiccomms. It still does not ship autonomous publication, campaign or advocacy content, legal advice, certified translation, live LLM calls, social media posting, or communications system-of-record integrations. Repo: &lt;https://github.com/CivicSuite/civiccomms&gt;.</w:t>
+        <w:br/>
+        <w:t>- **civicdata v0.1.0** - a runtime-foundation release for open-data and transparency publishing support. It ships dataset normalization, data-dictionary drafts, CKAN package metadata drafts, PII/exemption preflight, archive-bundle checklists, publication planning, and a public sample UI at /civicdata. It still does not ship live CKAN publication, BI dashboards, data warehouse storage, autonomous redaction, or external connector runtime. Repo: &lt;https://github.com/CivicSuite/civicdata&gt;.</w:t>
       </w:r>
     </w:p>
     <w:p>
@@ -113,7 +115,7 @@
     </w:p>
     <w:p>
       <w:r>
-        <w:t>- Twelve additional modules across seven tiers — see the [module catalog](specs/01_catalog.md).</w:t>
+        <w:t>- Nine additional modules across seven tiers — see the [module catalog](specs/01_catalog.md).</w:t>
       </w:r>
     </w:p>
     <w:p>
@@ -253,6 +255,8 @@
         <w:br/>
         <w:t>| civiccomms | &lt;https://github.com/CivicSuite/civiccomms&gt; | Shipping v0.1.0 runtime foundation for source-readiness review, meeting summaries, ordinance explainers, newsletters, FAQs, audience variants, and public UI foundation. |</w:t>
         <w:br/>
+        <w:t>| civicdata | &lt;https://github.com/CivicSuite/civicdata&gt; | Shipping v0.1.0 runtime foundation for dataset normalization, data dictionaries, CKAN metadata drafts, redaction preflight, archive checklists, publication planning, and public UI foundation. |</w:t>
+        <w:br/>
         <w:t>| future modules | not created yet | Specs only. |</w:t>
       </w:r>
     </w:p>
@@ -371,7 +375,7 @@
       <w:r>
         <w:drawing>
           <wp:inline xmlns:a="http://schemas.openxmlformats.org/drawingml/2006/main" xmlns:pic="http://schemas.openxmlformats.org/drawingml/2006/picture">
-            <wp:extent cx="5486400" cy="545840"/>
+            <wp:extent cx="5486400" cy="4023360"/>
             <wp:docPr id="1" name="Picture 1"/>
             <wp:cNvGraphicFramePr>
               <a:graphicFrameLocks noChangeAspect="1"/>
@@ -392,7 +396,7 @@
                   <pic:spPr>
                     <a:xfrm>
                       <a:off x="0" y="0"/>
-                      <a:ext cx="5486400" cy="545840"/>
+                      <a:ext cx="5486400" cy="4023360"/>
                     </a:xfrm>
                     <a:prstGeom prst="rect"/>
                   </pic:spPr>

</xml_diff>

<commit_message>
docs: update CivicData v0.1.0 compatibility state (#28)
Co-authored-by: Scott Converse <scott@civicsuite.local>
</commit_message>
<xml_diff>
--- a/USER-MANUAL.docx
+++ b/USER-MANUAL.docx
@@ -57,7 +57,7 @@
     </w:p>
     <w:p>
       <w:r>
-        <w:t>Today, multiple modules are shipping at different maturity levels: CivicRecords AI is production-usable, while CivicClerk, CivicCode, CivicZone, CivicAccess, CivicPlan, CivicPermit, CivicInspect, CivicGrants, CivicProcure, CivicContracts, CivicBoards, CivicNotice, Civic311, and CivicComms have runtime-foundation releases. The rest are planned. We say so plainly below — no roadmap inflation, no vaporware.</w:t>
+        <w:t>Today, multiple modules are shipping at different maturity levels: CivicRecords AI is production-usable, while CivicClerk, CivicCode, CivicZone, CivicAccess, CivicPlan, CivicPermit, CivicInspect, CivicGrants, CivicProcure, CivicContracts, CivicBoards, CivicNotice, Civic311, CivicComms, and CivicData have runtime-foundation releases. The rest are planned. We say so plainly below — no roadmap inflation, no vaporware.</w:t>
       </w:r>
     </w:p>
     <w:p>
@@ -101,6 +101,8 @@
         <w:t>- **civic311 v0.1.0** - a runtime-foundation release for resident service request support. It ships deterministic sample request intake, triage suggestions, duplicate-candidate review, department routing checklists, Open311-compatible export helper, and a public sample UI at /civic311. It still does not ship official dispatch, work-order creation, emergency response, legal advice, live LLM calls, 311 system write-back, or 311 system-of-record integrations. Repo: &lt;https://github.com/CivicSuite/civic311&gt;.</w:t>
         <w:br/>
         <w:t>- **civiccomms v0.1.0** - a runtime-foundation release for public communications support. It ships source-readiness review, meeting summary drafts, ordinance explainers, newsletter scaffolds, FAQ prompts, audience-variant drafts, and a public sample UI at /civiccomms. It still does not ship autonomous publication, campaign or advocacy content, legal advice, certified translation, live LLM calls, social media posting, or communications system-of-record integrations. Repo: &lt;https://github.com/CivicSuite/civiccomms&gt;.</w:t>
+        <w:br/>
+        <w:t>- **civicdata v0.1.0** - a runtime-foundation release for open-data and transparency publishing support. It ships dataset normalization, data-dictionary drafts, CKAN package metadata drafts, PII/exemption preflight, archive-bundle checklists, publication planning, and a public sample UI at /civicdata. It still does not ship live CKAN publication, BI dashboards, data warehouse storage, autonomous redaction, or external connector runtime. Repo: &lt;https://github.com/CivicSuite/civicdata&gt;.</w:t>
       </w:r>
     </w:p>
     <w:p>
@@ -113,7 +115,7 @@
     </w:p>
     <w:p>
       <w:r>
-        <w:t>- Twelve additional modules across seven tiers — see the [module catalog](specs/01_catalog.md).</w:t>
+        <w:t>- Nine additional modules across seven tiers — see the [module catalog](specs/01_catalog.md).</w:t>
       </w:r>
     </w:p>
     <w:p>
@@ -253,6 +255,8 @@
         <w:br/>
         <w:t>| civiccomms | &lt;https://github.com/CivicSuite/civiccomms&gt; | Shipping v0.1.0 runtime foundation for source-readiness review, meeting summaries, ordinance explainers, newsletters, FAQs, audience variants, and public UI foundation. |</w:t>
         <w:br/>
+        <w:t>| civicdata | &lt;https://github.com/CivicSuite/civicdata&gt; | Shipping v0.1.0 runtime foundation for dataset normalization, data dictionaries, CKAN metadata drafts, redaction preflight, archive checklists, publication planning, and public UI foundation. |</w:t>
+        <w:br/>
         <w:t>| future modules | not created yet | Specs only. |</w:t>
       </w:r>
     </w:p>
@@ -371,7 +375,7 @@
       <w:r>
         <w:drawing>
           <wp:inline xmlns:a="http://schemas.openxmlformats.org/drawingml/2006/main" xmlns:pic="http://schemas.openxmlformats.org/drawingml/2006/picture">
-            <wp:extent cx="5486400" cy="545840"/>
+            <wp:extent cx="5486400" cy="4023360"/>
             <wp:docPr id="1" name="Picture 1"/>
             <wp:cNvGraphicFramePr>
               <a:graphicFrameLocks noChangeAspect="1"/>
@@ -392,7 +396,7 @@
                   <pic:spPr>
                     <a:xfrm>
                       <a:off x="0" y="0"/>
-                      <a:ext cx="5486400" cy="545840"/>
+                      <a:ext cx="5486400" cy="4023360"/>
                     </a:xfrm>
                     <a:prstGeom prst="rect"/>
                   </pic:spPr>

</xml_diff>

<commit_message>
docs: update CivicHR v0.1.0 compatibility state
</commit_message>
<xml_diff>
--- a/USER-MANUAL.docx
+++ b/USER-MANUAL.docx
@@ -57,7 +57,7 @@
     </w:p>
     <w:p>
       <w:r>
-        <w:t>Today, multiple modules are shipping at different maturity levels: CivicRecords AI is production-usable, while CivicClerk, CivicCode, CivicZone, CivicAccess, CivicPlan, CivicPermit, CivicInspect, CivicGrants, CivicProcure, CivicContracts, CivicBoards, CivicNotice, Civic311, CivicComms, and CivicData have runtime-foundation releases. The rest are planned. We say so plainly below — no roadmap inflation, no vaporware.</w:t>
+        <w:t>Today, multiple modules are shipping at different maturity levels: CivicRecords AI is production-usable, while CivicClerk, CivicCode, CivicZone, CivicAccess, CivicPlan, CivicPermit, CivicInspect, CivicGrants, CivicProcure, CivicContracts, CivicBoards, CivicNotice, Civic311, CivicComms, CivicData, and CivicHR have runtime-foundation releases. The rest are planned. We say so plainly below — no roadmap inflation, no vaporware.</w:t>
       </w:r>
     </w:p>
     <w:p>
@@ -103,6 +103,8 @@
         <w:t>- **civiccomms v0.1.0** - a runtime-foundation release for public communications support. It ships source-readiness review, meeting summary drafts, ordinance explainers, newsletter scaffolds, FAQ prompts, audience-variant drafts, and a public sample UI at /civiccomms. It still does not ship autonomous publication, campaign or advocacy content, legal advice, certified translation, live LLM calls, social media posting, or communications system-of-record integrations. Repo: &lt;https://github.com/CivicSuite/civiccomms&gt;.</w:t>
         <w:br/>
         <w:t>- **civicdata v0.1.0** - a runtime-foundation release for open-data and transparency publishing support. It ships dataset normalization, data-dictionary drafts, CKAN package metadata drafts, PII/exemption preflight, archive-bundle checklists, publication planning, and a public sample UI at /civicdata. It still does not ship live CKAN publication, BI dashboards, data warehouse storage, autonomous redaction, or external connector runtime. Repo: &lt;https://github.com/CivicSuite/civicdata&gt;.</w:t>
+        <w:br/>
+        <w:t>- **civichr v0.1.0** - a runtime-foundation release for HR policy support. It ships policy lookup outlines, handbook summaries, job-description drafts, classification references, onboarding/training checklists, intake templates, source review, and sensitive-topic preflight. It still does not ship HRIS, payroll, benefits administration, personnel records management, employment-law advice, personnel-file ingestion, live LLM calls, or external HR/payroll connectors. Repo: &lt;https://github.com/CivicSuite/civichr&gt;.</w:t>
       </w:r>
     </w:p>
     <w:p>
@@ -115,7 +117,7 @@
     </w:p>
     <w:p>
       <w:r>
-        <w:t>- Nine additional modules across seven tiers — see the [module catalog](specs/01_catalog.md).</w:t>
+        <w:t>- Eight additional modules across seven tiers — see the [module catalog](specs/01_catalog.md).</w:t>
       </w:r>
     </w:p>
     <w:p>
@@ -257,6 +259,8 @@
         <w:br/>
         <w:t>| civicdata | &lt;https://github.com/CivicSuite/civicdata&gt; | Shipping v0.1.0 runtime foundation for dataset normalization, data dictionaries, CKAN metadata drafts, redaction preflight, archive checklists, publication planning, and public UI foundation. |</w:t>
         <w:br/>
+        <w:t>| civichr | &lt;https://github.com/CivicSuite/civichr&gt; | Shipping v0.1.0 runtime foundation for HR policy lookup, handbook summaries, job descriptions, classification references, onboarding/training checklists, and intake templates. |</w:t>
+        <w:br/>
         <w:t>| future modules | not created yet | Specs only. |</w:t>
       </w:r>
     </w:p>
@@ -375,7 +379,7 @@
       <w:r>
         <w:drawing>
           <wp:inline xmlns:a="http://schemas.openxmlformats.org/drawingml/2006/main" xmlns:pic="http://schemas.openxmlformats.org/drawingml/2006/picture">
-            <wp:extent cx="5486400" cy="4023360"/>
+            <wp:extent cx="5486400" cy="4096512"/>
             <wp:docPr id="1" name="Picture 1"/>
             <wp:cNvGraphicFramePr>
               <a:graphicFrameLocks noChangeAspect="1"/>
@@ -396,7 +400,7 @@
                   <pic:spPr>
                     <a:xfrm>
                       <a:off x="0" y="0"/>
-                      <a:ext cx="5486400" cy="4023360"/>
+                      <a:ext cx="5486400" cy="4096512"/>
                     </a:xfrm>
                     <a:prstGeom prst="rect"/>
                   </pic:spPr>

</xml_diff>

<commit_message>
docs: update CivicHR v0.1.0 compatibility state (#29)
Co-authored-by: Scott Converse <scott@civicsuite.local>
</commit_message>
<xml_diff>
--- a/USER-MANUAL.docx
+++ b/USER-MANUAL.docx
@@ -57,7 +57,7 @@
     </w:p>
     <w:p>
       <w:r>
-        <w:t>Today, multiple modules are shipping at different maturity levels: CivicRecords AI is production-usable, while CivicClerk, CivicCode, CivicZone, CivicAccess, CivicPlan, CivicPermit, CivicInspect, CivicGrants, CivicProcure, CivicContracts, CivicBoards, CivicNotice, Civic311, CivicComms, and CivicData have runtime-foundation releases. The rest are planned. We say so plainly below — no roadmap inflation, no vaporware.</w:t>
+        <w:t>Today, multiple modules are shipping at different maturity levels: CivicRecords AI is production-usable, while CivicClerk, CivicCode, CivicZone, CivicAccess, CivicPlan, CivicPermit, CivicInspect, CivicGrants, CivicProcure, CivicContracts, CivicBoards, CivicNotice, Civic311, CivicComms, CivicData, and CivicHR have runtime-foundation releases. The rest are planned. We say so plainly below — no roadmap inflation, no vaporware.</w:t>
       </w:r>
     </w:p>
     <w:p>
@@ -103,6 +103,8 @@
         <w:t>- **civiccomms v0.1.0** - a runtime-foundation release for public communications support. It ships source-readiness review, meeting summary drafts, ordinance explainers, newsletter scaffolds, FAQ prompts, audience-variant drafts, and a public sample UI at /civiccomms. It still does not ship autonomous publication, campaign or advocacy content, legal advice, certified translation, live LLM calls, social media posting, or communications system-of-record integrations. Repo: &lt;https://github.com/CivicSuite/civiccomms&gt;.</w:t>
         <w:br/>
         <w:t>- **civicdata v0.1.0** - a runtime-foundation release for open-data and transparency publishing support. It ships dataset normalization, data-dictionary drafts, CKAN package metadata drafts, PII/exemption preflight, archive-bundle checklists, publication planning, and a public sample UI at /civicdata. It still does not ship live CKAN publication, BI dashboards, data warehouse storage, autonomous redaction, or external connector runtime. Repo: &lt;https://github.com/CivicSuite/civicdata&gt;.</w:t>
+        <w:br/>
+        <w:t>- **civichr v0.1.0** - a runtime-foundation release for HR policy support. It ships policy lookup outlines, handbook summaries, job-description drafts, classification references, onboarding/training checklists, intake templates, source review, and sensitive-topic preflight. It still does not ship HRIS, payroll, benefits administration, personnel records management, employment-law advice, personnel-file ingestion, live LLM calls, or external HR/payroll connectors. Repo: &lt;https://github.com/CivicSuite/civichr&gt;.</w:t>
       </w:r>
     </w:p>
     <w:p>
@@ -115,7 +117,7 @@
     </w:p>
     <w:p>
       <w:r>
-        <w:t>- Nine additional modules across seven tiers — see the [module catalog](specs/01_catalog.md).</w:t>
+        <w:t>- Eight additional modules across seven tiers — see the [module catalog](specs/01_catalog.md).</w:t>
       </w:r>
     </w:p>
     <w:p>
@@ -257,6 +259,8 @@
         <w:br/>
         <w:t>| civicdata | &lt;https://github.com/CivicSuite/civicdata&gt; | Shipping v0.1.0 runtime foundation for dataset normalization, data dictionaries, CKAN metadata drafts, redaction preflight, archive checklists, publication planning, and public UI foundation. |</w:t>
         <w:br/>
+        <w:t>| civichr | &lt;https://github.com/CivicSuite/civichr&gt; | Shipping v0.1.0 runtime foundation for HR policy lookup, handbook summaries, job descriptions, classification references, onboarding/training checklists, and intake templates. |</w:t>
+        <w:br/>
         <w:t>| future modules | not created yet | Specs only. |</w:t>
       </w:r>
     </w:p>
@@ -375,7 +379,7 @@
       <w:r>
         <w:drawing>
           <wp:inline xmlns:a="http://schemas.openxmlformats.org/drawingml/2006/main" xmlns:pic="http://schemas.openxmlformats.org/drawingml/2006/picture">
-            <wp:extent cx="5486400" cy="4023360"/>
+            <wp:extent cx="5486400" cy="4096512"/>
             <wp:docPr id="1" name="Picture 1"/>
             <wp:cNvGraphicFramePr>
               <a:graphicFrameLocks noChangeAspect="1"/>
@@ -396,7 +400,7 @@
                   <pic:spPr>
                     <a:xfrm>
                       <a:off x="0" y="0"/>
-                      <a:ext cx="5486400" cy="4023360"/>
+                      <a:ext cx="5486400" cy="4096512"/>
                     </a:xfrm>
                     <a:prstGeom prst="rect"/>
                   </pic:spPr>

</xml_diff>

<commit_message>
docs: update CivicBudget v0.1.0 compatibility state
</commit_message>
<xml_diff>
--- a/USER-MANUAL.docx
+++ b/USER-MANUAL.docx
@@ -57,7 +57,7 @@
     </w:p>
     <w:p>
       <w:r>
-        <w:t>Today, multiple modules are shipping at different maturity levels: CivicRecords AI is production-usable, while CivicClerk, CivicCode, CivicZone, CivicAccess, CivicPlan, CivicPermit, CivicInspect, CivicGrants, CivicProcure, CivicContracts, CivicBoards, CivicNotice, Civic311, CivicComms, CivicData, and CivicHR have runtime-foundation releases. The rest are planned. We say so plainly below — no roadmap inflation, no vaporware.</w:t>
+        <w:t>Today, multiple modules are shipping at different maturity levels: CivicRecords AI is production-usable, while CivicClerk, CivicCode, CivicZone, CivicAccess, CivicPlan, CivicPermit, CivicInspect, CivicGrants, CivicProcure, CivicContracts, CivicBoards, CivicNotice, Civic311, CivicComms, CivicData, CivicHR, and CivicBudget have runtime-foundation releases. The rest are planned. We say so plainly below — no roadmap inflation, no vaporware.</w:t>
       </w:r>
     </w:p>
     <w:p>
@@ -105,6 +105,8 @@
         <w:t>- **civicdata v0.1.0** - a runtime-foundation release for open-data and transparency publishing support. It ships dataset normalization, data-dictionary drafts, CKAN package metadata drafts, PII/exemption preflight, archive-bundle checklists, publication planning, and a public sample UI at /civicdata. It still does not ship live CKAN publication, BI dashboards, data warehouse storage, autonomous redaction, or external connector runtime. Repo: &lt;https://github.com/CivicSuite/civicdata&gt;.</w:t>
         <w:br/>
         <w:t>- **civichr v0.1.0** - a runtime-foundation release for HR policy support. It ships policy lookup outlines, handbook summaries, job-description drafts, classification references, onboarding/training checklists, intake templates, source review, and sensitive-topic preflight. It still does not ship HRIS, payroll, benefits administration, personnel records management, employment-law advice, personnel-file ingestion, live LLM calls, or external HR/payroll connectors. Repo: &lt;https://github.com/CivicSuite/civichr&gt;.</w:t>
+        <w:br/>
+        <w:t>- **civicbudget v0.1.0** - budget narrative and transparency support foundation. Ships line-item variance analysis, budget narrative drafts, department memo drafts, hearing packet checklists, resident summaries, optional GFOA checklist support, and accessible public sample UI at `/civicbudget`. ERP, budgeting system, accounting, payroll, fund accounting, budget adoption, official approvals, live LLM calls, and live finance-system connector runtime are still not shipped. Repo: &lt;https://github.com/CivicSuite/civicbudget&gt;.</w:t>
       </w:r>
     </w:p>
     <w:p>
@@ -117,7 +119,7 @@
     </w:p>
     <w:p>
       <w:r>
-        <w:t>- Eight additional modules across seven tiers — see the [module catalog](specs/01_catalog.md).</w:t>
+        <w:t>- Seven additional modules across seven tiers — see the [module catalog](specs/01_catalog.md).</w:t>
       </w:r>
     </w:p>
     <w:p>
@@ -261,6 +263,8 @@
         <w:br/>
         <w:t>| civichr | &lt;https://github.com/CivicSuite/civichr&gt; | Shipping v0.1.0 runtime foundation for HR policy lookup, handbook summaries, job descriptions, classification references, onboarding/training checklists, and intake templates. |</w:t>
         <w:br/>
+        <w:t>| civicbudget | &lt;https://github.com/CivicSuite/civicbudget&gt; | Shipping v0.1.0 runtime foundation for line-item analysis, budget narratives, department memos, hearing packet checklists, resident summaries, and GFOA checklist support. |</w:t>
+        <w:br/>
         <w:t>| future modules | not created yet | Specs only. |</w:t>
       </w:r>
     </w:p>
@@ -379,7 +383,7 @@
       <w:r>
         <w:drawing>
           <wp:inline xmlns:a="http://schemas.openxmlformats.org/drawingml/2006/main" xmlns:pic="http://schemas.openxmlformats.org/drawingml/2006/picture">
-            <wp:extent cx="5486400" cy="4096512"/>
+            <wp:extent cx="5486400" cy="433873"/>
             <wp:docPr id="1" name="Picture 1"/>
             <wp:cNvGraphicFramePr>
               <a:graphicFrameLocks noChangeAspect="1"/>
@@ -400,7 +404,7 @@
                   <pic:spPr>
                     <a:xfrm>
                       <a:off x="0" y="0"/>
-                      <a:ext cx="5486400" cy="4096512"/>
+                      <a:ext cx="5486400" cy="433873"/>
                     </a:xfrm>
                     <a:prstGeom prst="rect"/>
                   </pic:spPr>

</xml_diff>

<commit_message>
docs: update CivicBudget v0.1.0 compatibility state (#30)
Co-authored-by: Scott Converse <scott@civicsuite.local>
</commit_message>
<xml_diff>
--- a/USER-MANUAL.docx
+++ b/USER-MANUAL.docx
@@ -57,7 +57,7 @@
     </w:p>
     <w:p>
       <w:r>
-        <w:t>Today, multiple modules are shipping at different maturity levels: CivicRecords AI is production-usable, while CivicClerk, CivicCode, CivicZone, CivicAccess, CivicPlan, CivicPermit, CivicInspect, CivicGrants, CivicProcure, CivicContracts, CivicBoards, CivicNotice, Civic311, CivicComms, CivicData, and CivicHR have runtime-foundation releases. The rest are planned. We say so plainly below — no roadmap inflation, no vaporware.</w:t>
+        <w:t>Today, multiple modules are shipping at different maturity levels: CivicRecords AI is production-usable, while CivicClerk, CivicCode, CivicZone, CivicAccess, CivicPlan, CivicPermit, CivicInspect, CivicGrants, CivicProcure, CivicContracts, CivicBoards, CivicNotice, Civic311, CivicComms, CivicData, CivicHR, and CivicBudget have runtime-foundation releases. The rest are planned. We say so plainly below — no roadmap inflation, no vaporware.</w:t>
       </w:r>
     </w:p>
     <w:p>
@@ -105,6 +105,8 @@
         <w:t>- **civicdata v0.1.0** - a runtime-foundation release for open-data and transparency publishing support. It ships dataset normalization, data-dictionary drafts, CKAN package metadata drafts, PII/exemption preflight, archive-bundle checklists, publication planning, and a public sample UI at /civicdata. It still does not ship live CKAN publication, BI dashboards, data warehouse storage, autonomous redaction, or external connector runtime. Repo: &lt;https://github.com/CivicSuite/civicdata&gt;.</w:t>
         <w:br/>
         <w:t>- **civichr v0.1.0** - a runtime-foundation release for HR policy support. It ships policy lookup outlines, handbook summaries, job-description drafts, classification references, onboarding/training checklists, intake templates, source review, and sensitive-topic preflight. It still does not ship HRIS, payroll, benefits administration, personnel records management, employment-law advice, personnel-file ingestion, live LLM calls, or external HR/payroll connectors. Repo: &lt;https://github.com/CivicSuite/civichr&gt;.</w:t>
+        <w:br/>
+        <w:t>- **civicbudget v0.1.0** - budget narrative and transparency support foundation. Ships line-item variance analysis, budget narrative drafts, department memo drafts, hearing packet checklists, resident summaries, optional GFOA checklist support, and accessible public sample UI at `/civicbudget`. ERP, budgeting system, accounting, payroll, fund accounting, budget adoption, official approvals, live LLM calls, and live finance-system connector runtime are still not shipped. Repo: &lt;https://github.com/CivicSuite/civicbudget&gt;.</w:t>
       </w:r>
     </w:p>
     <w:p>
@@ -117,7 +119,7 @@
     </w:p>
     <w:p>
       <w:r>
-        <w:t>- Eight additional modules across seven tiers — see the [module catalog](specs/01_catalog.md).</w:t>
+        <w:t>- Seven additional modules across seven tiers — see the [module catalog](specs/01_catalog.md).</w:t>
       </w:r>
     </w:p>
     <w:p>
@@ -261,6 +263,8 @@
         <w:br/>
         <w:t>| civichr | &lt;https://github.com/CivicSuite/civichr&gt; | Shipping v0.1.0 runtime foundation for HR policy lookup, handbook summaries, job descriptions, classification references, onboarding/training checklists, and intake templates. |</w:t>
         <w:br/>
+        <w:t>| civicbudget | &lt;https://github.com/CivicSuite/civicbudget&gt; | Shipping v0.1.0 runtime foundation for line-item analysis, budget narratives, department memos, hearing packet checklists, resident summaries, and GFOA checklist support. |</w:t>
+        <w:br/>
         <w:t>| future modules | not created yet | Specs only. |</w:t>
       </w:r>
     </w:p>
@@ -379,7 +383,7 @@
       <w:r>
         <w:drawing>
           <wp:inline xmlns:a="http://schemas.openxmlformats.org/drawingml/2006/main" xmlns:pic="http://schemas.openxmlformats.org/drawingml/2006/picture">
-            <wp:extent cx="5486400" cy="4096512"/>
+            <wp:extent cx="5486400" cy="433873"/>
             <wp:docPr id="1" name="Picture 1"/>
             <wp:cNvGraphicFramePr>
               <a:graphicFrameLocks noChangeAspect="1"/>
@@ -400,7 +404,7 @@
                   <pic:spPr>
                     <a:xfrm>
                       <a:off x="0" y="0"/>
-                      <a:ext cx="5486400" cy="4096512"/>
+                      <a:ext cx="5486400" cy="433873"/>
                     </a:xfrm>
                     <a:prstGeom prst="rect"/>
                   </pic:spPr>

</xml_diff>

<commit_message>
docs: update CivicLegal v0.1.0 compatibility state
</commit_message>
<xml_diff>
--- a/USER-MANUAL.docx
+++ b/USER-MANUAL.docx
@@ -57,7 +57,7 @@
     </w:p>
     <w:p>
       <w:r>
-        <w:t>Today, multiple modules are shipping at different maturity levels: CivicRecords AI is production-usable, while CivicClerk, CivicCode, CivicZone, CivicAccess, CivicPlan, CivicPermit, CivicInspect, CivicGrants, CivicProcure, CivicContracts, CivicBoards, CivicNotice, Civic311, CivicComms, CivicData, CivicHR, and CivicBudget have runtime-foundation releases. The rest are planned. We say so plainly below — no roadmap inflation, no vaporware.</w:t>
+        <w:t>Today, multiple modules are shipping at different maturity levels: CivicRecords AI is production-usable, while CivicClerk, CivicCode, CivicZone, CivicAccess, CivicPlan, CivicPermit, CivicInspect, CivicGrants, CivicProcure, CivicContracts, CivicBoards, CivicNotice, Civic311, CivicComms, CivicData, CivicHR, CivicBudget, and CivicLegal have runtime-foundation releases. The rest are planned. We say so plainly below — no roadmap inflation, no vaporware.</w:t>
       </w:r>
     </w:p>
     <w:p>
@@ -107,6 +107,8 @@
         <w:t>- **civichr v0.1.0** - a runtime-foundation release for HR policy support. It ships policy lookup outlines, handbook summaries, job-description drafts, classification references, onboarding/training checklists, intake templates, source review, and sensitive-topic preflight. It still does not ship HRIS, payroll, benefits administration, personnel records management, employment-law advice, personnel-file ingestion, live LLM calls, or external HR/payroll connectors. Repo: &lt;https://github.com/CivicSuite/civichr&gt;.</w:t>
         <w:br/>
         <w:t>- **civicbudget v0.1.0** - budget narrative and transparency support foundation. Ships line-item variance analysis, budget narrative drafts, department memo drafts, hearing packet checklists, resident summaries, optional GFOA checklist support, and accessible public sample UI at `/civicbudget`. ERP, budgeting system, accounting, payroll, fund accounting, budget adoption, official approvals, live LLM calls, and live finance-system connector runtime are still not shipped. Repo: &lt;https://github.com/CivicSuite/civicbudget&gt;.</w:t>
+        <w:br/>
+        <w:t>- **civiclegal v0.1.0** - internal legal-record research support foundation. Ships privilege-aware corpus filtering, citation-first city-record search, prior-action lookup, attorney-reviewed memo scaffolds, ordinance comparison checklists, litigation-hold candidate flags, authority citation tracking, and accessible public sample UI at `/civiclegal`. Legal advice, Westlaw/Lexis replacement, autonomous legal conclusions, court filing, e-discovery management, live LLM calls, live privileged corpus ingestion, and external legal-system connector runtime are still not shipped. Repo: &lt;https://github.com/CivicSuite/civiclegal&gt;.</w:t>
       </w:r>
     </w:p>
     <w:p>
@@ -119,7 +121,7 @@
     </w:p>
     <w:p>
       <w:r>
-        <w:t>- Seven additional modules across seven tiers — see the [module catalog](specs/01_catalog.md).</w:t>
+        <w:t>- Six additional modules across seven tiers — see the [module catalog](specs/01_catalog.md).</w:t>
       </w:r>
     </w:p>
     <w:p>
@@ -265,6 +267,8 @@
         <w:br/>
         <w:t>| civicbudget | &lt;https://github.com/CivicSuite/civicbudget&gt; | Shipping v0.1.0 runtime foundation for line-item analysis, budget narratives, department memos, hearing packet checklists, resident summaries, and GFOA checklist support. |</w:t>
         <w:br/>
+        <w:t>| civiclegal | &lt;https://github.com/CivicSuite/civiclegal&gt; | Shipping v0.1.0 runtime foundation for privilege-aware legal-record search, prior-action lookup, memo scaffolds, ordinance comparison, litigation-hold flags, and citation tracking. |</w:t>
+        <w:br/>
         <w:t>| future modules | not created yet | Specs only. |</w:t>
       </w:r>
     </w:p>
@@ -383,7 +387,7 @@
       <w:r>
         <w:drawing>
           <wp:inline xmlns:a="http://schemas.openxmlformats.org/drawingml/2006/main" xmlns:pic="http://schemas.openxmlformats.org/drawingml/2006/picture">
-            <wp:extent cx="5486400" cy="433873"/>
+            <wp:extent cx="5486400" cy="412880"/>
             <wp:docPr id="1" name="Picture 1"/>
             <wp:cNvGraphicFramePr>
               <a:graphicFrameLocks noChangeAspect="1"/>
@@ -404,7 +408,7 @@
                   <pic:spPr>
                     <a:xfrm>
                       <a:off x="0" y="0"/>
-                      <a:ext cx="5486400" cy="433873"/>
+                      <a:ext cx="5486400" cy="412880"/>
                     </a:xfrm>
                     <a:prstGeom prst="rect"/>
                   </pic:spPr>

</xml_diff>

<commit_message>
docs: update CivicLegal v0.1.0 compatibility state (#31)
Co-authored-by: Scott Converse <scott@civicsuite.local>
</commit_message>
<xml_diff>
--- a/USER-MANUAL.docx
+++ b/USER-MANUAL.docx
@@ -57,7 +57,7 @@
     </w:p>
     <w:p>
       <w:r>
-        <w:t>Today, multiple modules are shipping at different maturity levels: CivicRecords AI is production-usable, while CivicClerk, CivicCode, CivicZone, CivicAccess, CivicPlan, CivicPermit, CivicInspect, CivicGrants, CivicProcure, CivicContracts, CivicBoards, CivicNotice, Civic311, CivicComms, CivicData, CivicHR, and CivicBudget have runtime-foundation releases. The rest are planned. We say so plainly below — no roadmap inflation, no vaporware.</w:t>
+        <w:t>Today, multiple modules are shipping at different maturity levels: CivicRecords AI is production-usable, while CivicClerk, CivicCode, CivicZone, CivicAccess, CivicPlan, CivicPermit, CivicInspect, CivicGrants, CivicProcure, CivicContracts, CivicBoards, CivicNotice, Civic311, CivicComms, CivicData, CivicHR, CivicBudget, and CivicLegal have runtime-foundation releases. The rest are planned. We say so plainly below — no roadmap inflation, no vaporware.</w:t>
       </w:r>
     </w:p>
     <w:p>
@@ -107,6 +107,8 @@
         <w:t>- **civichr v0.1.0** - a runtime-foundation release for HR policy support. It ships policy lookup outlines, handbook summaries, job-description drafts, classification references, onboarding/training checklists, intake templates, source review, and sensitive-topic preflight. It still does not ship HRIS, payroll, benefits administration, personnel records management, employment-law advice, personnel-file ingestion, live LLM calls, or external HR/payroll connectors. Repo: &lt;https://github.com/CivicSuite/civichr&gt;.</w:t>
         <w:br/>
         <w:t>- **civicbudget v0.1.0** - budget narrative and transparency support foundation. Ships line-item variance analysis, budget narrative drafts, department memo drafts, hearing packet checklists, resident summaries, optional GFOA checklist support, and accessible public sample UI at `/civicbudget`. ERP, budgeting system, accounting, payroll, fund accounting, budget adoption, official approvals, live LLM calls, and live finance-system connector runtime are still not shipped. Repo: &lt;https://github.com/CivicSuite/civicbudget&gt;.</w:t>
+        <w:br/>
+        <w:t>- **civiclegal v0.1.0** - internal legal-record research support foundation. Ships privilege-aware corpus filtering, citation-first city-record search, prior-action lookup, attorney-reviewed memo scaffolds, ordinance comparison checklists, litigation-hold candidate flags, authority citation tracking, and accessible public sample UI at `/civiclegal`. Legal advice, Westlaw/Lexis replacement, autonomous legal conclusions, court filing, e-discovery management, live LLM calls, live privileged corpus ingestion, and external legal-system connector runtime are still not shipped. Repo: &lt;https://github.com/CivicSuite/civiclegal&gt;.</w:t>
       </w:r>
     </w:p>
     <w:p>
@@ -119,7 +121,7 @@
     </w:p>
     <w:p>
       <w:r>
-        <w:t>- Seven additional modules across seven tiers — see the [module catalog](specs/01_catalog.md).</w:t>
+        <w:t>- Six additional modules across seven tiers — see the [module catalog](specs/01_catalog.md).</w:t>
       </w:r>
     </w:p>
     <w:p>
@@ -265,6 +267,8 @@
         <w:br/>
         <w:t>| civicbudget | &lt;https://github.com/CivicSuite/civicbudget&gt; | Shipping v0.1.0 runtime foundation for line-item analysis, budget narratives, department memos, hearing packet checklists, resident summaries, and GFOA checklist support. |</w:t>
         <w:br/>
+        <w:t>| civiclegal | &lt;https://github.com/CivicSuite/civiclegal&gt; | Shipping v0.1.0 runtime foundation for privilege-aware legal-record search, prior-action lookup, memo scaffolds, ordinance comparison, litigation-hold flags, and citation tracking. |</w:t>
+        <w:br/>
         <w:t>| future modules | not created yet | Specs only. |</w:t>
       </w:r>
     </w:p>
@@ -383,7 +387,7 @@
       <w:r>
         <w:drawing>
           <wp:inline xmlns:a="http://schemas.openxmlformats.org/drawingml/2006/main" xmlns:pic="http://schemas.openxmlformats.org/drawingml/2006/picture">
-            <wp:extent cx="5486400" cy="433873"/>
+            <wp:extent cx="5486400" cy="412880"/>
             <wp:docPr id="1" name="Picture 1"/>
             <wp:cNvGraphicFramePr>
               <a:graphicFrameLocks noChangeAspect="1"/>
@@ -404,7 +408,7 @@
                   <pic:spPr>
                     <a:xfrm>
                       <a:off x="0" y="0"/>
-                      <a:ext cx="5486400" cy="433873"/>
+                      <a:ext cx="5486400" cy="412880"/>
                     </a:xfrm>
                     <a:prstGeom prst="rect"/>
                   </pic:spPr>

</xml_diff>

<commit_message>
docs: update CivicElections v0.1.0 compatibility state
</commit_message>
<xml_diff>
--- a/USER-MANUAL.docx
+++ b/USER-MANUAL.docx
@@ -57,7 +57,7 @@
     </w:p>
     <w:p>
       <w:r>
-        <w:t>Today, multiple modules are shipping at different maturity levels: CivicRecords AI is production-usable, while CivicClerk, CivicCode, CivicZone, CivicAccess, CivicPlan, CivicPermit, CivicInspect, CivicGrants, CivicProcure, CivicContracts, CivicBoards, CivicNotice, Civic311, CivicComms, CivicData, CivicHR, CivicBudget, and CivicLegal have runtime-foundation releases. The rest are planned. We say so plainly below — no roadmap inflation, no vaporware.</w:t>
+        <w:t>Today, multiple modules are shipping at different maturity levels: CivicRecords AI is production-usable, while CivicClerk, CivicCode, CivicZone, CivicAccess, CivicPlan, CivicPermit, CivicInspect, CivicGrants, CivicProcure, CivicContracts, CivicBoards, CivicNotice, Civic311, CivicComms, CivicData, CivicHR, CivicBudget, CivicLegal, and CivicElections have runtime-foundation releases. The rest are planned. We say so plainly below — no roadmap inflation, no vaporware.</w:t>
       </w:r>
     </w:p>
     <w:p>
@@ -109,6 +109,8 @@
         <w:t>- **civicbudget v0.1.0** - budget narrative and transparency support foundation. Ships line-item variance analysis, budget narrative drafts, department memo drafts, hearing packet checklists, resident summaries, optional GFOA checklist support, and accessible public sample UI at `/civicbudget`. ERP, budgeting system, accounting, payroll, fund accounting, budget adoption, official approvals, live LLM calls, and live finance-system connector runtime are still not shipped. Repo: &lt;https://github.com/CivicSuite/civicbudget&gt;.</w:t>
         <w:br/>
         <w:t>- **civiclegal v0.1.0** - internal legal-record research support foundation. Ships privilege-aware corpus filtering, citation-first city-record search, prior-action lookup, attorney-reviewed memo scaffolds, ordinance comparison checklists, litigation-hold candidate flags, authority citation tracking, and accessible public sample UI at `/civiclegal`. Legal advice, Westlaw/Lexis replacement, autonomous legal conclusions, court filing, e-discovery management, live LLM calls, live privileged corpus ingestion, and external legal-system connector runtime are still not shipped. Repo: &lt;https://github.com/CivicSuite/civiclegal&gt;.</w:t>
+        <w:br/>
+        <w:t>- **civicelections v0.1.0** - election administration support foundation. Ships cited voter guidance, candidate filing checklists, worker training Q&amp;A, ballot-summary drafts, campaign-finance summaries, canvass checklists, accessibility review, and accessible public sample UI at `/civicelections`. Voter registration, ballot marking, tabulation, election conduct automation, campaign finance system of record, official certification, live LLM calls, and election-system connector runtime are still not shipped. Repo: &lt;https://github.com/CivicSuite/civicelections&gt;.</w:t>
       </w:r>
     </w:p>
     <w:p>
@@ -121,7 +123,7 @@
     </w:p>
     <w:p>
       <w:r>
-        <w:t>- Six additional modules across seven tiers — see the [module catalog](specs/01_catalog.md).</w:t>
+        <w:t>- Five additional modules across seven tiers — see the [module catalog](specs/01_catalog.md).</w:t>
       </w:r>
     </w:p>
     <w:p>
@@ -269,6 +271,8 @@
         <w:br/>
         <w:t>| civiclegal | &lt;https://github.com/CivicSuite/civiclegal&gt; | Shipping v0.1.0 runtime foundation for privilege-aware legal-record search, prior-action lookup, memo scaffolds, ordinance comparison, litigation-hold flags, and citation tracking. |</w:t>
         <w:br/>
+        <w:t>| civicelections | &lt;https://github.com/CivicSuite/civicelections&gt; | Shipping v0.1.0 runtime foundation for voter guidance, filing checklists, worker training, ballot summaries, campaign-finance summaries, canvass checklists, and accessibility review. |</w:t>
+        <w:br/>
         <w:t>| future modules | not created yet | Specs only. |</w:t>
       </w:r>
     </w:p>
@@ -387,7 +391,7 @@
       <w:r>
         <w:drawing>
           <wp:inline xmlns:a="http://schemas.openxmlformats.org/drawingml/2006/main" xmlns:pic="http://schemas.openxmlformats.org/drawingml/2006/picture">
-            <wp:extent cx="5486400" cy="412880"/>
+            <wp:extent cx="5486400" cy="398884"/>
             <wp:docPr id="1" name="Picture 1"/>
             <wp:cNvGraphicFramePr>
               <a:graphicFrameLocks noChangeAspect="1"/>
@@ -408,7 +412,7 @@
                   <pic:spPr>
                     <a:xfrm>
                       <a:off x="0" y="0"/>
-                      <a:ext cx="5486400" cy="412880"/>
+                      <a:ext cx="5486400" cy="398884"/>
                     </a:xfrm>
                     <a:prstGeom prst="rect"/>
                   </pic:spPr>

</xml_diff>

<commit_message>
docs: update CivicElections v0.1.0 compatibility state (#32)
Co-authored-by: Scott Converse <scott@civicsuite.local>
</commit_message>
<xml_diff>
--- a/USER-MANUAL.docx
+++ b/USER-MANUAL.docx
@@ -57,7 +57,7 @@
     </w:p>
     <w:p>
       <w:r>
-        <w:t>Today, multiple modules are shipping at different maturity levels: CivicRecords AI is production-usable, while CivicClerk, CivicCode, CivicZone, CivicAccess, CivicPlan, CivicPermit, CivicInspect, CivicGrants, CivicProcure, CivicContracts, CivicBoards, CivicNotice, Civic311, CivicComms, CivicData, CivicHR, CivicBudget, and CivicLegal have runtime-foundation releases. The rest are planned. We say so plainly below — no roadmap inflation, no vaporware.</w:t>
+        <w:t>Today, multiple modules are shipping at different maturity levels: CivicRecords AI is production-usable, while CivicClerk, CivicCode, CivicZone, CivicAccess, CivicPlan, CivicPermit, CivicInspect, CivicGrants, CivicProcure, CivicContracts, CivicBoards, CivicNotice, Civic311, CivicComms, CivicData, CivicHR, CivicBudget, CivicLegal, and CivicElections have runtime-foundation releases. The rest are planned. We say so plainly below — no roadmap inflation, no vaporware.</w:t>
       </w:r>
     </w:p>
     <w:p>
@@ -109,6 +109,8 @@
         <w:t>- **civicbudget v0.1.0** - budget narrative and transparency support foundation. Ships line-item variance analysis, budget narrative drafts, department memo drafts, hearing packet checklists, resident summaries, optional GFOA checklist support, and accessible public sample UI at `/civicbudget`. ERP, budgeting system, accounting, payroll, fund accounting, budget adoption, official approvals, live LLM calls, and live finance-system connector runtime are still not shipped. Repo: &lt;https://github.com/CivicSuite/civicbudget&gt;.</w:t>
         <w:br/>
         <w:t>- **civiclegal v0.1.0** - internal legal-record research support foundation. Ships privilege-aware corpus filtering, citation-first city-record search, prior-action lookup, attorney-reviewed memo scaffolds, ordinance comparison checklists, litigation-hold candidate flags, authority citation tracking, and accessible public sample UI at `/civiclegal`. Legal advice, Westlaw/Lexis replacement, autonomous legal conclusions, court filing, e-discovery management, live LLM calls, live privileged corpus ingestion, and external legal-system connector runtime are still not shipped. Repo: &lt;https://github.com/CivicSuite/civiclegal&gt;.</w:t>
+        <w:br/>
+        <w:t>- **civicelections v0.1.0** - election administration support foundation. Ships cited voter guidance, candidate filing checklists, worker training Q&amp;A, ballot-summary drafts, campaign-finance summaries, canvass checklists, accessibility review, and accessible public sample UI at `/civicelections`. Voter registration, ballot marking, tabulation, election conduct automation, campaign finance system of record, official certification, live LLM calls, and election-system connector runtime are still not shipped. Repo: &lt;https://github.com/CivicSuite/civicelections&gt;.</w:t>
       </w:r>
     </w:p>
     <w:p>
@@ -121,7 +123,7 @@
     </w:p>
     <w:p>
       <w:r>
-        <w:t>- Six additional modules across seven tiers — see the [module catalog](specs/01_catalog.md).</w:t>
+        <w:t>- Five additional modules across seven tiers — see the [module catalog](specs/01_catalog.md).</w:t>
       </w:r>
     </w:p>
     <w:p>
@@ -269,6 +271,8 @@
         <w:br/>
         <w:t>| civiclegal | &lt;https://github.com/CivicSuite/civiclegal&gt; | Shipping v0.1.0 runtime foundation for privilege-aware legal-record search, prior-action lookup, memo scaffolds, ordinance comparison, litigation-hold flags, and citation tracking. |</w:t>
         <w:br/>
+        <w:t>| civicelections | &lt;https://github.com/CivicSuite/civicelections&gt; | Shipping v0.1.0 runtime foundation for voter guidance, filing checklists, worker training, ballot summaries, campaign-finance summaries, canvass checklists, and accessibility review. |</w:t>
+        <w:br/>
         <w:t>| future modules | not created yet | Specs only. |</w:t>
       </w:r>
     </w:p>
@@ -387,7 +391,7 @@
       <w:r>
         <w:drawing>
           <wp:inline xmlns:a="http://schemas.openxmlformats.org/drawingml/2006/main" xmlns:pic="http://schemas.openxmlformats.org/drawingml/2006/picture">
-            <wp:extent cx="5486400" cy="412880"/>
+            <wp:extent cx="5486400" cy="398884"/>
             <wp:docPr id="1" name="Picture 1"/>
             <wp:cNvGraphicFramePr>
               <a:graphicFrameLocks noChangeAspect="1"/>
@@ -408,7 +412,7 @@
                   <pic:spPr>
                     <a:xfrm>
                       <a:off x="0" y="0"/>
-                      <a:ext cx="5486400" cy="412880"/>
+                      <a:ext cx="5486400" cy="398884"/>
                     </a:xfrm>
                     <a:prstGeom prst="rect"/>
                   </pic:spPr>

</xml_diff>

<commit_message>
docs: update suite state for civiccore v0.3.0
</commit_message>
<xml_diff>
--- a/USER-MANUAL.docx
+++ b/USER-MANUAL.docx
@@ -65,14 +65,14 @@
         <w:pStyle w:val="Heading3"/>
       </w:pPr>
       <w:r>
-        <w:t>What's available today (as of 2026-04-27)</w:t>
+        <w:t>What's available today (as of 2026-04-28)</w:t>
       </w:r>
     </w:p>
     <w:p>
       <w:r>
         <w:t>- **civicrecords-ai v1.4.0** — a working, shipping module for managing public records / FOIA requests. Cities can install this today. Repo: &lt;https://github.com/CivicSuite/civicrecords-ai&gt;.</w:t>
         <w:br/>
-        <w:t>- **civiccore v0.2.0** — the shared "platform" package that every module uses. It is what the records module is built on. As of v0.2.0 it includes a shared LLM (large-language-model) abstraction layer. It is not a product on its own; you only "install" it as a dependency of a module. Repo: &lt;https://github.com/CivicSuite/civiccore&gt;.</w:t>
+        <w:t>- **civiccore v0.3.0** — the shared "platform" package that every module uses. It now ships migrations, the shared SQLAlchemy `Base`, the LLM abstraction, hash-chained audit primitives, source/provenance contracts, offline import/export manifests, export-bundle helpers, and local city profile configuration. It is not a product on its own; you only "install" it as a dependency of a module. Repo: &lt;https://github.com/CivicSuite/civiccore&gt;.</w:t>
         <w:br/>
         <w:t>- **civicclerk v0.1.0** — a runtime-foundation release for meetings, agendas, packets, minutes, voting, and sunshine-law compliance. It ships the API/schema foundation, compliance guardrails, and a browser-visible staff workflow foundation at `/staff`; full database-backed workflow screens are still planned. Repo: &lt;https://github.com/CivicSuite/civicclerk&gt;.</w:t>
         <w:br/>
@@ -233,7 +233,7 @@
         <w:br/>
         <w:t>| civicrecords-ai | &lt;https://github.com/CivicSuite/civicrecords-ai&gt; | Shipping v1.4.0. Transferred to the `CivicSuite` GitHub org on 2026-04-25; this is now the canonical home. |</w:t>
         <w:br/>
-        <w:t>| civiccore | &lt;https://github.com/CivicSuite/civiccore&gt; | Shipping v0.2.0. Phase 2 (LLM module) just landed. |</w:t>
+        <w:t>| civiccore | &lt;https://github.com/CivicSuite/civiccore&gt; | Shipping v0.3.0 shared primitives: migrations, db.Base, LLM, audit, provenance, manifests, exports, and city profiles. |</w:t>
         <w:br/>
         <w:t>| civicclerk | &lt;https://github.com/CivicSuite/civicclerk&gt; | Shipping v0.1.0 runtime foundation with `/staff` workflow UI foundation. |</w:t>
         <w:br/>
@@ -322,7 +322,7 @@
     </w:p>
     <w:p>
       <w:r>
-        <w:t>When a city installs records-ai, civiccore is pulled in as a wheel. There is no monorepo, no submodule, no vendored copy. Civiccore is published to PyPI (or, until publication, distributed as a release wheel from its GitHub repo).</w:t>
+        <w:t>When a city installs a module, civiccore is pulled in as a wheel. There is no monorepo, no submodule, no vendored copy. The example above reflects currently shipped module pins that still require `civiccore==0.2.0`; CivicCore v0.3.0 is now published for new shared-primitives work and future consumer updates. Civiccore is published to PyPI (or, until publication, distributed as a release wheel from its GitHub repo).</w:t>
       </w:r>
     </w:p>
     <w:p>
@@ -391,7 +391,7 @@
       <w:r>
         <w:drawing>
           <wp:inline xmlns:a="http://schemas.openxmlformats.org/drawingml/2006/main" xmlns:pic="http://schemas.openxmlformats.org/drawingml/2006/picture">
-            <wp:extent cx="5486400" cy="398884"/>
+            <wp:extent cx="5486400" cy="328904"/>
             <wp:docPr id="1" name="Picture 1"/>
             <wp:cNvGraphicFramePr>
               <a:graphicFrameLocks noChangeAspect="1"/>
@@ -412,7 +412,7 @@
                   <pic:spPr>
                     <a:xfrm>
                       <a:off x="0" y="0"/>
-                      <a:ext cx="5486400" cy="398884"/>
+                      <a:ext cx="5486400" cy="328904"/>
                     </a:xfrm>
                     <a:prstGeom prst="rect"/>
                   </pic:spPr>
@@ -454,35 +454,31 @@
         <w:br/>
         <w:t xml:space="preserve">                        +---------------------------+</w:t>
         <w:br/>
-        <w:t xml:space="preserve">                        |     civiccore (v0.2.0)    |</w:t>
+        <w:t xml:space="preserve">                        |     civiccore (v0.3.0)    |</w:t>
         <w:br/>
         <w:t xml:space="preserve">                        |  SHIPPING TODAY:          |</w:t>
         <w:br/>
         <w:t xml:space="preserve">                        |  migrations, db.Base, llm |</w:t>
         <w:br/>
-        <w:t xml:space="preserve">                        |  (providers, templates,   |</w:t>
+        <w:t xml:space="preserve">                        |  audit, provenance,       |</w:t>
         <w:br/>
-        <w:t xml:space="preserve">                        |  registry, context,       |</w:t>
+        <w:t xml:space="preserve">                        |  manifests, exports,      |</w:t>
         <w:br/>
-        <w:t xml:space="preserve">                        |  structured output)       |</w:t>
+        <w:t xml:space="preserve">                        |  city profiles            |</w:t>
         <w:br/>
         <w:t xml:space="preserve">                        |                           |</w:t>
         <w:br/>
-        <w:t xml:space="preserve">                        |  PLACEHOLDER ONLY (empty  |</w:t>
+        <w:t xml:space="preserve">                        |  PLANNED / NOT SHIPPED:   |</w:t>
         <w:br/>
-        <w:t xml:space="preserve">                        |  __init__.py, no code):   |</w:t>
+        <w:t xml:space="preserve">                        |  auth/RBAC, ingestion,    |</w:t>
         <w:br/>
-        <w:t xml:space="preserve">                        |  auth, RBAC, audit,       |</w:t>
+        <w:t xml:space="preserve">                        |  search, notifications,   |</w:t>
         <w:br/>
-        <w:t xml:space="preserve">                        |  ingest, search,          |</w:t>
+        <w:t xml:space="preserve">                        |  onboarding, exemptions,  |</w:t>
         <w:br/>
-        <w:t xml:space="preserve">                        |  notifications,           |</w:t>
+        <w:t xml:space="preserve">                        |  verification, live       |</w:t>
         <w:br/>
-        <w:t xml:space="preserve">                        |  connectors, exemptions,  |</w:t>
-        <w:br/>
-        <w:t xml:space="preserve">                        |  onboarding, catalog,     |</w:t>
-        <w:br/>
-        <w:t xml:space="preserve">                        |  verification             |</w:t>
+        <w:t xml:space="preserve">                        |  connector sync           |</w:t>
         <w:br/>
         <w:t xml:space="preserve">                        +-------------+-------------+</w:t>
         <w:br/>
@@ -576,7 +572,7 @@
       <w:r>
         <w:t>- **ADR** — Architecture Decision Record; a short, dated document recording a significant architectural decision and its rationale.</w:t>
         <w:br/>
-        <w:t>- **Pinned version** — a specific exact version a module requires of civiccore (e.g. `==0.2.0`), as opposed to a range.</w:t>
+        <w:t>- **Pinned version** — a specific exact version a module requires of civiccore (for example `==0.2.0` for current foundation modules, or `==0.3.0` after a consumer explicitly upgrades), as opposed to a range.</w:t>
         <w:br/>
         <w:t>- **Wheel** — the standard Python package distribution format. civiccore is published as a wheel.</w:t>
         <w:br/>

</xml_diff>

<commit_message>
docs: update suite state for civiccore v0.3.0 (#47)
Co-authored-by: Scott Converse <scott@civicsuite.local>
</commit_message>
<xml_diff>
--- a/USER-MANUAL.docx
+++ b/USER-MANUAL.docx
@@ -65,14 +65,14 @@
         <w:pStyle w:val="Heading3"/>
       </w:pPr>
       <w:r>
-        <w:t>What's available today (as of 2026-04-27)</w:t>
+        <w:t>What's available today (as of 2026-04-28)</w:t>
       </w:r>
     </w:p>
     <w:p>
       <w:r>
         <w:t>- **civicrecords-ai v1.4.0** — a working, shipping module for managing public records / FOIA requests. Cities can install this today. Repo: &lt;https://github.com/CivicSuite/civicrecords-ai&gt;.</w:t>
         <w:br/>
-        <w:t>- **civiccore v0.2.0** — the shared "platform" package that every module uses. It is what the records module is built on. As of v0.2.0 it includes a shared LLM (large-language-model) abstraction layer. It is not a product on its own; you only "install" it as a dependency of a module. Repo: &lt;https://github.com/CivicSuite/civiccore&gt;.</w:t>
+        <w:t>- **civiccore v0.3.0** — the shared "platform" package that every module uses. It now ships migrations, the shared SQLAlchemy `Base`, the LLM abstraction, hash-chained audit primitives, source/provenance contracts, offline import/export manifests, export-bundle helpers, and local city profile configuration. It is not a product on its own; you only "install" it as a dependency of a module. Repo: &lt;https://github.com/CivicSuite/civiccore&gt;.</w:t>
         <w:br/>
         <w:t>- **civicclerk v0.1.0** — a runtime-foundation release for meetings, agendas, packets, minutes, voting, and sunshine-law compliance. It ships the API/schema foundation, compliance guardrails, and a browser-visible staff workflow foundation at `/staff`; full database-backed workflow screens are still planned. Repo: &lt;https://github.com/CivicSuite/civicclerk&gt;.</w:t>
         <w:br/>
@@ -233,7 +233,7 @@
         <w:br/>
         <w:t>| civicrecords-ai | &lt;https://github.com/CivicSuite/civicrecords-ai&gt; | Shipping v1.4.0. Transferred to the `CivicSuite` GitHub org on 2026-04-25; this is now the canonical home. |</w:t>
         <w:br/>
-        <w:t>| civiccore | &lt;https://github.com/CivicSuite/civiccore&gt; | Shipping v0.2.0. Phase 2 (LLM module) just landed. |</w:t>
+        <w:t>| civiccore | &lt;https://github.com/CivicSuite/civiccore&gt; | Shipping v0.3.0 shared primitives: migrations, db.Base, LLM, audit, provenance, manifests, exports, and city profiles. |</w:t>
         <w:br/>
         <w:t>| civicclerk | &lt;https://github.com/CivicSuite/civicclerk&gt; | Shipping v0.1.0 runtime foundation with `/staff` workflow UI foundation. |</w:t>
         <w:br/>
@@ -322,7 +322,7 @@
     </w:p>
     <w:p>
       <w:r>
-        <w:t>When a city installs records-ai, civiccore is pulled in as a wheel. There is no monorepo, no submodule, no vendored copy. Civiccore is published to PyPI (or, until publication, distributed as a release wheel from its GitHub repo).</w:t>
+        <w:t>When a city installs a module, civiccore is pulled in as a wheel. There is no monorepo, no submodule, no vendored copy. The example above reflects currently shipped module pins that still require `civiccore==0.2.0`; CivicCore v0.3.0 is now published for new shared-primitives work and future consumer updates. Civiccore is published to PyPI (or, until publication, distributed as a release wheel from its GitHub repo).</w:t>
       </w:r>
     </w:p>
     <w:p>
@@ -391,7 +391,7 @@
       <w:r>
         <w:drawing>
           <wp:inline xmlns:a="http://schemas.openxmlformats.org/drawingml/2006/main" xmlns:pic="http://schemas.openxmlformats.org/drawingml/2006/picture">
-            <wp:extent cx="5486400" cy="398884"/>
+            <wp:extent cx="5486400" cy="328904"/>
             <wp:docPr id="1" name="Picture 1"/>
             <wp:cNvGraphicFramePr>
               <a:graphicFrameLocks noChangeAspect="1"/>
@@ -412,7 +412,7 @@
                   <pic:spPr>
                     <a:xfrm>
                       <a:off x="0" y="0"/>
-                      <a:ext cx="5486400" cy="398884"/>
+                      <a:ext cx="5486400" cy="328904"/>
                     </a:xfrm>
                     <a:prstGeom prst="rect"/>
                   </pic:spPr>
@@ -454,35 +454,31 @@
         <w:br/>
         <w:t xml:space="preserve">                        +---------------------------+</w:t>
         <w:br/>
-        <w:t xml:space="preserve">                        |     civiccore (v0.2.0)    |</w:t>
+        <w:t xml:space="preserve">                        |     civiccore (v0.3.0)    |</w:t>
         <w:br/>
         <w:t xml:space="preserve">                        |  SHIPPING TODAY:          |</w:t>
         <w:br/>
         <w:t xml:space="preserve">                        |  migrations, db.Base, llm |</w:t>
         <w:br/>
-        <w:t xml:space="preserve">                        |  (providers, templates,   |</w:t>
+        <w:t xml:space="preserve">                        |  audit, provenance,       |</w:t>
         <w:br/>
-        <w:t xml:space="preserve">                        |  registry, context,       |</w:t>
+        <w:t xml:space="preserve">                        |  manifests, exports,      |</w:t>
         <w:br/>
-        <w:t xml:space="preserve">                        |  structured output)       |</w:t>
+        <w:t xml:space="preserve">                        |  city profiles            |</w:t>
         <w:br/>
         <w:t xml:space="preserve">                        |                           |</w:t>
         <w:br/>
-        <w:t xml:space="preserve">                        |  PLACEHOLDER ONLY (empty  |</w:t>
+        <w:t xml:space="preserve">                        |  PLANNED / NOT SHIPPED:   |</w:t>
         <w:br/>
-        <w:t xml:space="preserve">                        |  __init__.py, no code):   |</w:t>
+        <w:t xml:space="preserve">                        |  auth/RBAC, ingestion,    |</w:t>
         <w:br/>
-        <w:t xml:space="preserve">                        |  auth, RBAC, audit,       |</w:t>
+        <w:t xml:space="preserve">                        |  search, notifications,   |</w:t>
         <w:br/>
-        <w:t xml:space="preserve">                        |  ingest, search,          |</w:t>
+        <w:t xml:space="preserve">                        |  onboarding, exemptions,  |</w:t>
         <w:br/>
-        <w:t xml:space="preserve">                        |  notifications,           |</w:t>
+        <w:t xml:space="preserve">                        |  verification, live       |</w:t>
         <w:br/>
-        <w:t xml:space="preserve">                        |  connectors, exemptions,  |</w:t>
-        <w:br/>
-        <w:t xml:space="preserve">                        |  onboarding, catalog,     |</w:t>
-        <w:br/>
-        <w:t xml:space="preserve">                        |  verification             |</w:t>
+        <w:t xml:space="preserve">                        |  connector sync           |</w:t>
         <w:br/>
         <w:t xml:space="preserve">                        +-------------+-------------+</w:t>
         <w:br/>
@@ -576,7 +572,7 @@
       <w:r>
         <w:t>- **ADR** — Architecture Decision Record; a short, dated document recording a significant architectural decision and its rationale.</w:t>
         <w:br/>
-        <w:t>- **Pinned version** — a specific exact version a module requires of civiccore (e.g. `==0.2.0`), as opposed to a range.</w:t>
+        <w:t>- **Pinned version** — a specific exact version a module requires of civiccore (for example `==0.2.0` for current foundation modules, or `==0.3.0` after a consumer explicitly upgrades), as opposed to a range.</w:t>
         <w:br/>
         <w:t>- **Wheel** — the standard Python package distribution format. civiccore is published as a wheel.</w:t>
         <w:br/>

</xml_diff>

<commit_message>
docs: sync records-ai v1.4.1 suite state
</commit_message>
<xml_diff>
--- a/USER-MANUAL.docx
+++ b/USER-MANUAL.docx
@@ -57,7 +57,7 @@
     </w:p>
     <w:p>
       <w:r>
-        <w:t>Today, multiple modules are shipping at different maturity levels: CivicRecords AI is production-usable, while CivicClerk, CivicCode, CivicZone, CivicAccess, CivicPlan, CivicPermit, CivicInspect, CivicGrants, CivicProcure, CivicContracts, CivicBoards, CivicNotice, Civic311, CivicComms, CivicData, CivicHR, CivicBudget, CivicLegal, and CivicElections have runtime-foundation releases. The rest are planned. We say so plainly below — no roadmap inflation, no vaporware.</w:t>
+        <w:t>Today, modules are shipping at different maturity levels: CivicRecords AI is production-usable, CivicCore is the shared platform package, and all 26 catalog modules have runtime-foundation releases. all catalog modules have advanced to v0.1.1 for CivicCore v0.3.0 alignment. We say shipped and planned boundaries plainly below — no roadmap inflation, no vaporware.</w:t>
       </w:r>
     </w:p>
     <w:p>
@@ -70,47 +70,47 @@
     </w:p>
     <w:p>
       <w:r>
-        <w:t>- **civicrecords-ai v1.4.0** — a working, shipping module for managing public records / FOIA requests. Cities can install this today. Repo: &lt;https://github.com/CivicSuite/civicrecords-ai&gt;.</w:t>
+        <w:t>- **civicrecords-ai v1.4.1** — a working, shipping module for managing public records / FOIA requests, now aligned to `civiccore==0.3.0`. Cities can install this today. Repo: &lt;https://github.com/CivicSuite/civicrecords-ai&gt;.</w:t>
         <w:br/>
         <w:t>- **civiccore v0.3.0** — the shared "platform" package that every module uses. It now ships migrations, the shared SQLAlchemy `Base`, the LLM abstraction, hash-chained audit primitives, source/provenance contracts, offline import/export manifests, export-bundle helpers, and local city profile configuration. It is not a product on its own; you only "install" it as a dependency of a module. Repo: &lt;https://github.com/CivicSuite/civiccore&gt;.</w:t>
         <w:br/>
-        <w:t>- **civicclerk v0.1.0** — a runtime-foundation release for meetings, agendas, packets, minutes, voting, and sunshine-law compliance. It ships the API/schema foundation, compliance guardrails, and a browser-visible staff workflow foundation at `/staff`; full database-backed workflow screens are still planned. Repo: &lt;https://github.com/CivicSuite/civicclerk&gt;.</w:t>
+        <w:t>- **civicclerk v0.1.1** — a runtime-foundation release for meetings, agendas, packets, minutes, voting, and sunshine-law compliance. It ships the API/schema foundation, compliance guardrails, and live `/staff` workflow screens for intake, packet assembly/export, notice checklist, meeting outcomes, minutes draft, public archive, and connector import; full database persistence/authentication hardening is still planned. Repo: &lt;https://github.com/CivicSuite/civicclerk&gt;.</w:t>
         <w:br/>
-        <w:t>- **civiccode v0.1.0** — a runtime-foundation release for municipal code and ordinance access. It ships source registry, section/version lifecycle, search and permalinks, deterministic citations, citation-grounded Q&amp;A, staff notes, plain-language summaries, CivicClerk handoff intake, resident lookup pages, local import connectors, and records-ready exports. It still does not ship legal advice, live LLM calls, live codifier sync, or automatic ordinance codification. Repo: &lt;https://github.com/CivicSuite/civiccode&gt;.</w:t>
+        <w:t>- **civiccode v0.1.1** — a runtime-foundation release for municipal code and ordinance access, now aligned to `civiccore==0.3.0`. It ships source registry, section/version lifecycle, search and permalinks, deterministic citations, citation-grounded Q&amp;A, staff notes, plain-language summaries, CivicClerk handoff intake, resident lookup pages, local import connectors, and records-ready exports. It still does not ship legal advice, live LLM calls, live codifier sync, or automatic ordinance codification. Repo: &lt;https://github.com/CivicSuite/civiccode&gt;.</w:t>
         <w:br/>
-        <w:t>- **civiczone v0.1.0** — a runtime-foundation release for parcel-aware zoning and land-use Q&amp;A. It ships canonical zoning schema, Alembic migrations, sample parcel and rule lookups, citation-grounded sample Q&amp;A, planner escalation, staff-context samples, and a public sample UI at `/civiczone`. It still does not ship live GIS ingestion, live LLM calls, authentication/RBAC, planner review queues, official zoning determinations, or legal advice. Repo: &lt;https://github.com/CivicSuite/civiczone&gt;.</w:t>
+        <w:t>- **civiczone v0.1.1** — a runtime-foundation release for parcel-aware zoning and land-use Q&amp;A, now aligned to `civiccore==0.3.0`. It ships canonical zoning schema, Alembic migrations, sample parcel and rule lookups, citation-grounded sample Q&amp;A, planner escalation, staff-context samples, and a public sample UI at `/civiczone`. It still does not ship live GIS ingestion, live LLM calls, authentication/RBAC, planner review queues, official zoning determinations, or legal advice. Repo: &lt;https://github.com/CivicSuite/civiczone&gt;.</w:t>
         <w:br/>
-        <w:t>- **civicaccess v0.1.0** — a runtime-foundation release for accessibility, plain-language, multilingual, and ADA review support. It ships deterministic sample accessibility review, plain-language rewrite, multilingual variant, records-ready export checklist, and a public sample UI at `/civicaccess`. It still does not ship certified ADA compliance, legal advice, live LLM calls, production translation workflows, document ingestion, or suite-wide integration APIs. Repo: &lt;https://github.com/CivicSuite/civicaccess&gt;.</w:t>
+        <w:t>- **civicaccess v0.1.1** — a runtime-foundation release for accessibility, plain-language, multilingual, and ADA review support, now aligned to `civiccore==0.3.0`. It ships deterministic sample accessibility review, plain-language rewrite, multilingual variant, records-ready export checklist, and a public sample UI at `/civicaccess`. It still does not ship certified ADA compliance, legal advice, live LLM calls, production translation workflows, document ingestion, or suite-wide integration APIs. Repo: &lt;https://github.com/CivicSuite/civicaccess&gt;.</w:t>
         <w:br/>
-        <w:t>- **civicplan v0.1.0** — a runtime-foundation release for comprehensive-plan policy lookup and cited planning analysis support. It ships deterministic sample plan-policy lookup, policy-consistency support, staff-analysis outline helper, records-ready export checklist, and a public sample UI at `/civicplan`. It still does not ship official planning determinations, legal advice, live GIS, live LLM calls, plan document ingestion, permitting-system integrations, or production staff-review queues. Repo: &lt;https://github.com/CivicSuite/civicplan&gt;.</w:t>
+        <w:t>- **civicplan v0.1.1** — a runtime-foundation release for comprehensive-plan policy lookup and cited planning analysis support, now aligned to `civiccore==0.3.0`. It ships deterministic sample plan-policy lookup, policy-consistency support, staff-analysis outline helper, records-ready export checklist, and a public sample UI at `/civicplan`. It still does not ship official planning determinations, legal advice, live GIS, live LLM calls, plan document ingestion, permitting-system integrations, or production staff-review queues. Repo: &lt;https://github.com/CivicSuite/civicplan&gt;.</w:t>
         <w:br/>
-        <w:t>- **civicpermit v0.1.0** — a runtime-foundation release for permit pre-application and intake-readiness support. It ships deterministic sample permit requirement lookup, intake-readiness review, submittal outline helper, records-ready export checklist, and a public sample UI at `/civicpermit`. It still does not ship permit approvals, legal advice, live GIS, live LLM calls, plan ingestion, production permitting-system integrations, or system-of-record behavior. Repo: &lt;https://github.com/CivicSuite/civicpermit&gt;.</w:t>
+        <w:t>- **civicpermit v0.1.1** - a runtime-foundation release for permit pre-application and intake-readiness support, now aligned to `civiccore==0.3.0`. It ships deterministic sample permit requirement lookup, intake-readiness review, submittal outline helper, records-ready export checklist, and a public sample UI at `/civicpermit`. It still does not ship permit approvals, legal advice, live GIS, live LLM calls, plan ingestion, production permitting-system integrations, or system-of-record behavior. Repo: &lt;https://github.com/CivicSuite/civicpermit&gt;.</w:t>
         <w:br/>
-        <w:t>- **civicinspect v0.1.0** — a runtime-foundation release for inspection support. It ships deterministic sample repeat-case lookup, inspector-owned report draft helper, notice draft helper, records-ready export checklist, and a public sample UI at `/civicinspect`. It still does not ship official findings, citations, fines, notices, inspection scheduling, legal advice, live photo analysis, live LLM calls, or system-of-record integrations. Repo: &lt;https://github.com/CivicSuite/civicinspect&gt;.</w:t>
+        <w:t>- **civicinspect v0.1.1** - a runtime-foundation release for inspection support, now aligned to `civiccore==0.3.0`. It ships deterministic sample repeat-case lookup, inspector-owned report draft helper, notice draft helper, records-ready export checklist, and a public sample UI at `/civicinspect`. It still does not ship official findings, citations, fines, notices, inspection scheduling, legal advice, live photo analysis, live LLM calls, or system-of-record integrations. Repo: &lt;https://github.com/CivicSuite/civicinspect&gt;.</w:t>
         <w:br/>
-        <w:t>- **civicgrants v0.1.0** — a runtime-foundation release for grant opportunity and compliance support. It ships deterministic sample opportunity triage, eligibility-factor matching, application outline helper, compliance calendar helper, audit-ready export checklist, and a public sample UI at `/civicgrants`. It still does not ship live funder feeds, official eligibility decisions, legal advice, live LLM calls, submission portals, or grant system-of-record integrations. Repo: &lt;https://github.com/CivicSuite/civicgrants&gt;.</w:t>
+        <w:t>- **civicgrants v0.1.1** - a runtime-foundation release for grant opportunity and compliance support, now aligned to `civiccore==0.3.0`. It ships deterministic sample opportunity triage, eligibility-factor matching, application outline helper, compliance calendar helper, audit-ready export checklist, and a public sample UI at `/civicgrants`. It still does not ship live funder feeds, official eligibility decisions, legal advice, live LLM calls, submission portals, or grant system-of-record integrations. Repo: &lt;https://github.com/CivicSuite/civicgrants&gt;.</w:t>
         <w:br/>
-        <w:t>- **civicprocure v0.1.0** — a runtime-foundation release for procurement drafting and award-packet support. It ships deterministic sample RFP drafting, proposal comparison, exception extraction, scoring summary helper, award-packet checklist, and a public sample UI at `/civicprocure`. It still does not ship live vendor portals, official vendor evaluation decisions, legal advice, live LLM calls, e-procurement submission portals, or procurement system-of-record integrations. Repo: &lt;https://github.com/CivicSuite/civicprocure&gt;.</w:t>
+        <w:t>- **civicprocure v0.1.1** — a runtime-foundation release for procurement drafting and award-packet support, now aligned to `civiccore==0.3.0`. It ships deterministic sample RFP drafting, proposal comparison, exception extraction, scoring summary helper, award-packet checklist, and a public sample UI at `/civicprocure`. It still does not ship live vendor portals, official vendor evaluation decisions, legal advice, live LLM calls, e-procurement submission portals, or procurement system-of-record integrations. Repo: &lt;https://github.com/CivicSuite/civicprocure&gt;.</w:t>
         <w:br/>
-        <w:t>- **civiccontracts v0.1.0** - a runtime-foundation release for contract repository and renewal visibility support. It ships deterministic sample contract registry, clause topic lookup, expiration tracking, renewal visibility, public-records export checklist, and a public sample UI at `/civiccontracts`. It still does not ship live contract management platforms, official legal interpretation, legal advice, renewal approvals, contract execution workflows, live LLM calls, or contract system-of-record integrations. Repo: &lt;https://github.com/CivicSuite/civiccontracts&gt;.</w:t>
+        <w:t>- **civiccontracts v0.1.1** - a runtime-foundation release for contract repository and renewal visibility support, now aligned to `civiccore==0.3.0`. It ships deterministic sample contract registry, clause topic lookup, expiration tracking, renewal visibility, public-records export checklist, and a public sample UI at `/civiccontracts`. It still does not ship live contract management platforms, official legal interpretation, legal advice, renewal approvals, contract execution workflows, live LLM calls, or contract system-of-record integrations. Repo: &lt;https://github.com/CivicSuite/civiccontracts&gt;.</w:t>
         <w:br/>
-        <w:t>- **civicboards v0.1.0** - a runtime-foundation release for board and commission administration. It ships deterministic sample board registry, term review plans, vacancy checklists, attendance summaries, notice/records export checklist, and a public sample UI at `/civicboards`. It still does not ship live agenda systems, appointment decisions, legal advice, official notice publication, meeting system write-back, live LLM calls, or board system-of-record integrations. Repo: &lt;https://github.com/CivicSuite/civicboards&gt;.</w:t>
+        <w:t>- **civicboards v0.1.1** - a runtime-foundation release for board and commission administration, now aligned to `civiccore==0.3.0`. It ships deterministic sample board registry, term review plans, vacancy checklists, attendance summaries, notice/records export checklist, and a public sample UI at `/civicboards`. It still does not ship live agenda systems, appointment decisions, legal advice, official notice publication, meeting system write-back, live LLM calls, or board system-of-record integrations. Repo: &lt;https://github.com/CivicSuite/civicboards&gt;.</w:t>
         <w:br/>
-        <w:t>- **civicnotice v0.1.0** - a runtime-foundation release for public notice compliance support. It ships deterministic sample notice registry, statutory deadline plans, publication-readiness checklists, channel planning, notice/records export checklist, and a public sample UI at /civicnotice. It still does not ship legal sufficiency decisions, legal advice, live LLM calls, official notice publication, publication-system write-back, or notice system-of-record integrations. Repo: &lt;https://github.com/CivicSuite/civicnotice&gt;.</w:t>
+        <w:t>- **civicnotice v0.1.1** - a runtime-foundation release for public notice compliance support, now aligned to `civiccore==0.3.0`. It ships deterministic sample notice registry, statutory deadline plans, publication-readiness checklists, channel planning, notice/records export checklist, and a public sample UI at /civicnotice. It still does not ship legal sufficiency decisions, legal advice, live LLM calls, official notice publication, publication-system write-back, or notice system-of-record integrations. Repo: &lt;https://github.com/CivicSuite/civicnotice&gt;.</w:t>
         <w:br/>
-        <w:t>- **civic311 v0.1.0** - a runtime-foundation release for resident service request support. It ships deterministic sample request intake, triage suggestions, duplicate-candidate review, department routing checklists, Open311-compatible export helper, and a public sample UI at /civic311. It still does not ship official dispatch, work-order creation, emergency response, legal advice, live LLM calls, 311 system write-back, or 311 system-of-record integrations. Repo: &lt;https://github.com/CivicSuite/civic311&gt;.</w:t>
+        <w:t>- **civic311 v0.1.1** - a runtime-foundation release for resident service request support, now aligned to `civiccore==0.3.0`. It ships deterministic sample request intake, triage suggestions, duplicate-candidate review, department routing checklists, Open311-compatible export helper, and a public sample UI at /civic311. It still does not ship official dispatch, work-order creation, emergency response, legal advice, live LLM calls, 311 system write-back, or 311 system-of-record integrations. Repo: &lt;https://github.com/CivicSuite/civic311&gt;.</w:t>
         <w:br/>
-        <w:t>- **civiccomms v0.1.0** - a runtime-foundation release for public communications support. It ships source-readiness review, meeting summary drafts, ordinance explainers, newsletter scaffolds, FAQ prompts, audience-variant drafts, and a public sample UI at /civiccomms. It still does not ship autonomous publication, campaign or advocacy content, legal advice, certified translation, live LLM calls, social media posting, or communications system-of-record integrations. Repo: &lt;https://github.com/CivicSuite/civiccomms&gt;.</w:t>
+        <w:t>- **civiccomms v0.1.1** - a runtime-foundation release for public communications support. It ships source-readiness review, meeting summary drafts, ordinance explainers, newsletter scaffolds, FAQ prompts, audience-variant drafts, and a public sample UI at /civiccomms. It still does not ship autonomous publication, campaign or advocacy content, legal advice, certified translation, live LLM calls, social media posting, or communications system-of-record integrations, now aligned to `civiccore==0.3.0`. Repo: &lt;https://github.com/CivicSuite/civiccomms&gt;.</w:t>
         <w:br/>
-        <w:t>- **civicdata v0.1.0** - a runtime-foundation release for open-data and transparency publishing support. It ships dataset normalization, data-dictionary drafts, CKAN package metadata drafts, PII/exemption preflight, archive-bundle checklists, publication planning, and a public sample UI at /civicdata. It still does not ship live CKAN publication, BI dashboards, data warehouse storage, autonomous redaction, or external connector runtime. Repo: &lt;https://github.com/CivicSuite/civicdata&gt;.</w:t>
+        <w:t>- **civicdata v0.1.1** - a runtime-foundation release for open-data and transparency publishing support. It ships dataset normalization, data-dictionary drafts, CKAN package metadata drafts, PII/exemption preflight, archive-bundle checklists, publication planning, and a public sample UI at /civicdata. It still does not ship live CKAN publication, BI dashboards, data warehouse storage, autonomous redaction, or external connector runtime, now aligned to `civiccore==0.3.0`. Repo: &lt;https://github.com/CivicSuite/civicdata&gt;.</w:t>
         <w:br/>
-        <w:t>- **civichr v0.1.0** - a runtime-foundation release for HR policy support. It ships policy lookup outlines, handbook summaries, job-description drafts, classification references, onboarding/training checklists, intake templates, source review, and sensitive-topic preflight. It still does not ship HRIS, payroll, benefits administration, personnel records management, employment-law advice, personnel-file ingestion, live LLM calls, or external HR/payroll connectors. Repo: &lt;https://github.com/CivicSuite/civichr&gt;.</w:t>
+        <w:t>- **civichr v0.1.1** - a runtime-foundation release for HR policy support. It ships policy lookup outlines, handbook summaries, job-description drafts, classification references, onboarding/training checklists, intake templates, source review, and sensitive-topic preflight. It still does not ship HRIS, payroll, benefits administration, personnel records management, employment-law advice, personnel-file ingestion, live LLM calls, or external HR/payroll connectors, now aligned to `civiccore==0.3.0`. Repo: &lt;https://github.com/CivicSuite/civichr&gt;.</w:t>
         <w:br/>
-        <w:t>- **civicbudget v0.1.0** - budget narrative and transparency support foundation. Ships line-item variance analysis, budget narrative drafts, department memo drafts, hearing packet checklists, resident summaries, optional GFOA checklist support, and accessible public sample UI at `/civicbudget`. ERP, budgeting system, accounting, payroll, fund accounting, budget adoption, official approvals, live LLM calls, and live finance-system connector runtime are still not shipped. Repo: &lt;https://github.com/CivicSuite/civicbudget&gt;.</w:t>
+        <w:t>- **civicbudget v0.1.1** - budget narrative and transparency support foundation. Ships line-item variance analysis, budget narrative drafts, department memo drafts, hearing packet checklists, resident summaries, optional GFOA checklist support, and accessible public sample UI at `/civicbudget`. ERP, budgeting system, accounting, payroll, fund accounting, budget adoption, official approvals, live LLM calls, and live finance-system connector runtime are still not shipped, now aligned to `civiccore==0.3.0`. Repo: &lt;https://github.com/CivicSuite/civicbudget&gt;.</w:t>
         <w:br/>
-        <w:t>- **civiclegal v0.1.0** - internal legal-record research support foundation. Ships privilege-aware corpus filtering, citation-first city-record search, prior-action lookup, attorney-reviewed memo scaffolds, ordinance comparison checklists, litigation-hold candidate flags, authority citation tracking, and accessible public sample UI at `/civiclegal`. Legal advice, Westlaw/Lexis replacement, autonomous legal conclusions, court filing, e-discovery management, live LLM calls, live privileged corpus ingestion, and external legal-system connector runtime are still not shipped. Repo: &lt;https://github.com/CivicSuite/civiclegal&gt;.</w:t>
+        <w:t>- **civiclegal v0.1.1** - internal legal-record research support foundation. Ships privilege-aware corpus filtering, citation-first city-record search, prior-action lookup, attorney-reviewed memo scaffolds, ordinance comparison checklists, litigation-hold candidate flags, authority citation tracking, and accessible public sample UI at `/civiclegal`. Legal advice, Westlaw/Lexis replacement, autonomous legal conclusions, court filing, e-discovery management, live LLM calls, live privileged corpus ingestion, and external legal-system connector runtime are still not shipped, now aligned to `civiccore==0.3.0`. Repo: &lt;https://github.com/CivicSuite/civiclegal&gt;.</w:t>
         <w:br/>
-        <w:t>- **civicelections v0.1.0** - election administration support foundation. Ships cited voter guidance, candidate filing checklists, worker training Q&amp;A, ballot-summary drafts, campaign-finance summaries, canvass checklists, accessibility review, and accessible public sample UI at `/civicelections`. Voter registration, ballot marking, tabulation, election conduct automation, campaign finance system of record, official certification, live LLM calls, and election-system connector runtime are still not shipped. Repo: &lt;https://github.com/CivicSuite/civicelections&gt;.</w:t>
+        <w:t>- **civicelections v0.1.1** - election administration support foundation. Ships cited voter guidance, candidate filing checklists, worker training Q&amp;A, ballot-summary drafts, campaign-finance summaries, canvass checklists, accessibility review, and accessible public sample UI at `/civicelections`. Voter registration, ballot marking, tabulation, election conduct automation, campaign finance system of record, official certification, live LLM calls, and election-system connector runtime are still not shipped, now aligned to `civiccore==0.3.0`. Repo: &lt;https://github.com/CivicSuite/civicelections&gt;.</w:t>
       </w:r>
     </w:p>
     <w:p>
@@ -123,12 +123,12 @@
     </w:p>
     <w:p>
       <w:r>
-        <w:t>- Five additional modules across seven tiers — see the [module catalog](specs/01_catalog.md).</w:t>
+        <w:t>- 0 additional modules remain uncreated; all 26 catalog repos now exist. See the [module catalog](specs/01_catalog.md) for scope and planned depth.</w:t>
       </w:r>
     </w:p>
     <w:p>
       <w:r>
-        <w:t>If you don't see a module on this list with a version number, **it does not exist as code yet**. Specs are not products.</w:t>
+        <w:t>Every catalog module now has a repo and a version number. Specs still distinguish shipped foundations from planned production-depth behavior.</w:t>
       </w:r>
     </w:p>
     <w:p>
@@ -231,49 +231,49 @@
         <w:br/>
         <w:t>|---|---|---|</w:t>
         <w:br/>
-        <w:t>| civicrecords-ai | &lt;https://github.com/CivicSuite/civicrecords-ai&gt; | Shipping v1.4.0. Transferred to the `CivicSuite` GitHub org on 2026-04-25; this is now the canonical home. |</w:t>
+        <w:t>| civicrecords-ai | &lt;https://github.com/CivicSuite/civicrecords-ai&gt; | Shipping v1.4.1, aligned to `civiccore==0.3.0`. Transferred to the `CivicSuite` GitHub org on 2026-04-25; this is now the canonical home. |</w:t>
         <w:br/>
         <w:t>| civiccore | &lt;https://github.com/CivicSuite/civiccore&gt; | Shipping v0.3.0 shared primitives: migrations, db.Base, LLM, audit, provenance, manifests, exports, and city profiles. |</w:t>
         <w:br/>
-        <w:t>| civicclerk | &lt;https://github.com/CivicSuite/civicclerk&gt; | Shipping v0.1.0 runtime foundation with `/staff` workflow UI foundation. |</w:t>
+        <w:t>| civicclerk | &lt;https://github.com/CivicSuite/civicclerk&gt; | Shipping v0.1.1 runtime foundation with live `/staff` workflow screens for intake, packet export, notice, outcomes, minutes, archive, and connector import. |</w:t>
         <w:br/>
-        <w:t>| civiccode | &lt;https://github.com/CivicSuite/civiccode&gt; | Shipping v0.1.0 runtime foundation for municipal-code lookup, citations, local imports, and records-ready exports. |</w:t>
+        <w:t>| civiccode | &lt;https://github.com/CivicSuite/civiccode&gt; | Shipping v0.1.1 for municipal-code lookup, citations, local imports, records-ready exports, and `civiccore==0.3.0` alignment. |</w:t>
         <w:br/>
-        <w:t>| civiczone | &lt;https://github.com/CivicSuite/civiczone&gt; | Shipping v0.1.0 runtime foundation for parcel-aware zoning samples and public UI foundation. |</w:t>
+        <w:t>| civiczone | &lt;https://github.com/CivicSuite/civiczone&gt; | Shipping v0.1.1 for parcel-aware zoning samples, public UI foundation, and `civiccore==0.3.0` alignment. |</w:t>
         <w:br/>
-        <w:t>| civicaccess | &lt;https://github.com/CivicSuite/civicaccess&gt; | Shipping v0.1.0 runtime foundation for accessibility review and public UI foundation. |</w:t>
+        <w:t>| civicaccess | &lt;https://github.com/CivicSuite/civicaccess&gt; | Shipping v0.1.1 for accessibility review, public UI foundation, and `civiccore==0.3.0` alignment. |</w:t>
         <w:br/>
-        <w:t>| civicplan | &lt;https://github.com/CivicSuite/civicplan&gt; | Shipping v0.1.0 runtime foundation for cited plan-policy lookup and public UI foundation. |</w:t>
+        <w:t>| civicplan | &lt;https://github.com/CivicSuite/civicplan&gt; | Shipping v0.1.1 for cited plan-policy lookup, public UI foundation, and `civiccore==0.3.0` alignment. |</w:t>
         <w:br/>
-        <w:t>| civicpermit | &lt;https://github.com/CivicSuite/civicpermit&gt; | Shipping v0.1.0 runtime foundation for permit requirement lookup and public UI foundation. |</w:t>
+        <w:t>| civicpermit | &lt;https://github.com/CivicSuite/civicpermit&gt; | Shipping v0.1.1 for permit requirement lookup, intake-readiness review, public UI foundation, and `civiccore==0.3.0` alignment. |</w:t>
         <w:br/>
-        <w:t>| civicinspect | &lt;https://github.com/CivicSuite/civicinspect&gt; | Shipping v0.1.0 runtime foundation for repeat-case lookup, report drafts, notice drafts, and public UI foundation. |</w:t>
+        <w:t>| civicinspect | &lt;https://github.com/CivicSuite/civicinspect&gt; | Shipping v0.1.1 for repeat-case lookup, report drafts, notice drafts, public UI foundation, and `civiccore==0.3.0` alignment. |</w:t>
         <w:br/>
-        <w:t>| civicgrants | &lt;https://github.com/CivicSuite/civicgrants&gt; | Shipping v0.1.0 runtime foundation for opportunity triage, eligibility matching, compliance calendars, and public UI foundation. |</w:t>
+        <w:t>| civicgrants | &lt;https://github.com/CivicSuite/civicgrants&gt; | Shipping v0.1.1 for opportunity triage, eligibility matching, compliance calendars, public UI foundation, and `civiccore==0.3.0` alignment. |</w:t>
         <w:br/>
-        <w:t>| civicprocure | &lt;https://github.com/CivicSuite/civicprocure&gt; | Shipping v0.1.0 runtime foundation for RFP drafting, proposal comparison, exception extraction, scoring summaries, award-packet checklists, and public UI foundation. |</w:t>
+        <w:t>| civicprocure | &lt;https://github.com/CivicSuite/civicprocure&gt; | Shipping v0.1.1 for RFP drafting, proposal comparison, exception extraction, scoring summaries, award-packet checklists, public UI foundation, and `civiccore==0.3.0` alignment. |</w:t>
         <w:br/>
-        <w:t>| civiccontracts | &lt;https://github.com/CivicSuite/civiccontracts&gt; | Shipping v0.1.0 runtime foundation for contract registry, clause topic lookup, expiration tracking, renewal visibility, public-records exports, and public UI foundation. |</w:t>
+        <w:t>| civiccontracts | &lt;https://github.com/CivicSuite/civiccontracts&gt; | Shipping v0.1.1 for contract registry, clause topic lookup, expiration tracking, renewal visibility, public-records exports, public UI foundation, and `civiccore==0.3.0` alignment. |</w:t>
         <w:br/>
-        <w:t>| civicboards | &lt;https://github.com/CivicSuite/civicboards&gt; | Shipping v0.1.0 runtime foundation for board registry, term tracking, vacancy tracking, attendance review, notice/records exports, and public UI foundation. |</w:t>
+        <w:t>| civicboards | &lt;https://github.com/CivicSuite/civicboards&gt; | Shipping v0.1.1 runtime foundation for board registry, term tracking, vacancy tracking, attendance review, notice/records exports, public UI foundation, and `civiccore==0.3.0` alignment. |</w:t>
         <w:br/>
-        <w:t>| civicnotice | &lt;https://github.com/CivicSuite/civicnotice&gt; | Shipping v0.1.0 runtime foundation for notice registry, statutory deadlines, publication-readiness checks, channel planning, notice records exports, and public UI foundation. |</w:t>
+        <w:t>| civicnotice | &lt;https://github.com/CivicSuite/civicnotice&gt; | Shipping v0.1.1 runtime foundation for notice registry, statutory deadlines, publication-readiness checks, channel planning, notice records exports, public UI foundation, and `civiccore==0.3.0` alignment. |</w:t>
         <w:br/>
-        <w:t>| civic311 | &lt;https://github.com/CivicSuite/civic311&gt; | Shipping v0.1.0 runtime foundation for request intake, triage suggestions, duplicate-candidate review, department routing, Open311-compatible exports, and public UI foundation. |</w:t>
+        <w:t>| civic311 | &lt;https://github.com/CivicSuite/civic311&gt; | Shipping v0.1.1 runtime foundation for request intake, triage suggestions, duplicate-candidate review, department routing, Open311-compatible exports, public UI foundation, and `civiccore==0.3.0` alignment. |</w:t>
         <w:br/>
-        <w:t>| civiccomms | &lt;https://github.com/CivicSuite/civiccomms&gt; | Shipping v0.1.0 runtime foundation for source-readiness review, meeting summaries, ordinance explainers, newsletters, FAQs, audience variants, and public UI foundation. |</w:t>
+        <w:t>| civiccomms | &lt;https://github.com/CivicSuite/civiccomms&gt; | Shipping v0.1.1 runtime foundation for source-readiness review, meeting summaries, ordinance explainers, newsletters, FAQs, audience variants, and public UI foundation. |</w:t>
         <w:br/>
-        <w:t>| civicdata | &lt;https://github.com/CivicSuite/civicdata&gt; | Shipping v0.1.0 runtime foundation for dataset normalization, data dictionaries, CKAN metadata drafts, redaction preflight, archive checklists, publication planning, and public UI foundation. |</w:t>
+        <w:t>| civicdata | &lt;https://github.com/CivicSuite/civicdata&gt; | Shipping v0.1.1 runtime foundation for dataset normalization, data dictionaries, CKAN metadata drafts, redaction preflight, archive checklists, publication planning, and public UI foundation. |</w:t>
         <w:br/>
-        <w:t>| civichr | &lt;https://github.com/CivicSuite/civichr&gt; | Shipping v0.1.0 runtime foundation for HR policy lookup, handbook summaries, job descriptions, classification references, onboarding/training checklists, and intake templates. |</w:t>
+        <w:t>| civichr | &lt;https://github.com/CivicSuite/civichr&gt; | Shipping v0.1.1 runtime foundation for HR policy lookup, handbook summaries, job descriptions, classification references, onboarding/training checklists, and intake templates. |</w:t>
         <w:br/>
-        <w:t>| civicbudget | &lt;https://github.com/CivicSuite/civicbudget&gt; | Shipping v0.1.0 runtime foundation for line-item analysis, budget narratives, department memos, hearing packet checklists, resident summaries, and GFOA checklist support. |</w:t>
+        <w:t>| civicbudget | &lt;https://github.com/CivicSuite/civicbudget&gt; | Shipping v0.1.1 runtime foundation for line-item analysis, budget narratives, department memos, hearing packet checklists, resident summaries, and GFOA checklist support. |</w:t>
         <w:br/>
-        <w:t>| civiclegal | &lt;https://github.com/CivicSuite/civiclegal&gt; | Shipping v0.1.0 runtime foundation for privilege-aware legal-record search, prior-action lookup, memo scaffolds, ordinance comparison, litigation-hold flags, and citation tracking. |</w:t>
+        <w:t>| civiclegal | &lt;https://github.com/CivicSuite/civiclegal&gt; | Shipping v0.1.1 runtime foundation for privilege-aware legal-record search, prior-action lookup, memo scaffolds, ordinance comparison, litigation-hold flags, and citation tracking. |</w:t>
         <w:br/>
-        <w:t>| civicelections | &lt;https://github.com/CivicSuite/civicelections&gt; | Shipping v0.1.0 runtime foundation for voter guidance, filing checklists, worker training, ballot summaries, campaign-finance summaries, canvass checklists, and accessibility review. |</w:t>
+        <w:t>| civicelections | &lt;https://github.com/CivicSuite/civicelections&gt; | Shipping v0.1.1 runtime foundation for voter guidance, filing checklists, worker training, ballot summaries, campaign-finance summaries, canvass checklists, and accessibility review. |</w:t>
         <w:br/>
-        <w:t>| future modules | not created yet | Specs only. |</w:t>
+        <w:t>| future module depth | planned per module | Production integrations, connectors, persistence hardening, auth/RBAC, and cross-module workflow depth land through module-specific releases. |</w:t>
       </w:r>
     </w:p>
     <w:p>
@@ -313,7 +313,7 @@
         </w:rPr>
         <w:t>dependencies = [</w:t>
         <w:br/>
-        <w:t xml:space="preserve">  "civiccore==0.2.0",</w:t>
+        <w:t xml:space="preserve">  "civiccore==0.3.0",</w:t>
         <w:br/>
         <w:t xml:space="preserve">  ...</w:t>
         <w:br/>
@@ -322,7 +322,7 @@
     </w:p>
     <w:p>
       <w:r>
-        <w:t>When a city installs a module, civiccore is pulled in as a wheel. There is no monorepo, no submodule, no vendored copy. The example above reflects currently shipped module pins that still require `civiccore==0.2.0`; CivicCore v0.3.0 is now published for new shared-primitives work and future consumer updates. Civiccore is published to PyPI (or, until publication, distributed as a release wheel from its GitHub repo).</w:t>
+        <w:t>When a city installs a module, civiccore is pulled in as a wheel. There is no monorepo, no submodule, no vendored copy. The example above reflects the current post-v0.3 consumer state: all catalog module releases now publish v0.1.1 with `civiccore==0.3.0`. Civiccore is published to PyPI (or, until publication, distributed as a release wheel from its GitHub repo).</w:t>
       </w:r>
     </w:p>
     <w:p>
@@ -494,7 +494,7 @@
         <w:br/>
         <w:t xml:space="preserve">   | civicrecords-ai     |   |   civicclerk     |   |   civiczone      |</w:t>
         <w:br/>
-        <w:t xml:space="preserve">   |   v1.4.0 SHIPPING   |   | v0.1.0 SHIPPING  |   | v0.1.0 SHIPPING |</w:t>
+        <w:t xml:space="preserve">   |   v1.4.0 SHIPPING   |   | v0.1.0 SHIPPING  |   | v0.1.1 SHIPPING |</w:t>
         <w:br/>
         <w:t xml:space="preserve">   |   FOIA / public     |   |  meetings,       |   |  zoning, parcel  |</w:t>
         <w:br/>
@@ -572,7 +572,7 @@
       <w:r>
         <w:t>- **ADR** — Architecture Decision Record; a short, dated document recording a significant architectural decision and its rationale.</w:t>
         <w:br/>
-        <w:t>- **Pinned version** — a specific exact version a module requires of civiccore (for example `==0.2.0` for current foundation modules, or `==0.3.0` after a consumer explicitly upgrades), as opposed to a range.</w:t>
+        <w:t>- **Pinned version** — a specific exact version a module requires of civiccore (for example `==0.3.0` for current foundation modules, or an older exact pin preserved for historical releases), as opposed to a range.</w:t>
         <w:br/>
         <w:t>- **Wheel** — the standard Python package distribution format. civiccore is published as a wheel.</w:t>
         <w:br/>

</xml_diff>

<commit_message>
docs: sync records-ai v1.4.1 suite state (#64)
Co-authored-by: Scott Converse <scott@civicsuite.local>
</commit_message>
<xml_diff>
--- a/USER-MANUAL.docx
+++ b/USER-MANUAL.docx
@@ -57,7 +57,7 @@
     </w:p>
     <w:p>
       <w:r>
-        <w:t>Today, multiple modules are shipping at different maturity levels: CivicRecords AI is production-usable, while CivicClerk, CivicCode, CivicZone, CivicAccess, CivicPlan, CivicPermit, CivicInspect, CivicGrants, CivicProcure, CivicContracts, CivicBoards, CivicNotice, Civic311, CivicComms, CivicData, CivicHR, CivicBudget, CivicLegal, and CivicElections have runtime-foundation releases. The rest are planned. We say so plainly below — no roadmap inflation, no vaporware.</w:t>
+        <w:t>Today, modules are shipping at different maturity levels: CivicRecords AI is production-usable, CivicCore is the shared platform package, and all 26 catalog modules have runtime-foundation releases. all catalog modules have advanced to v0.1.1 for CivicCore v0.3.0 alignment. We say shipped and planned boundaries plainly below — no roadmap inflation, no vaporware.</w:t>
       </w:r>
     </w:p>
     <w:p>
@@ -70,47 +70,47 @@
     </w:p>
     <w:p>
       <w:r>
-        <w:t>- **civicrecords-ai v1.4.0** — a working, shipping module for managing public records / FOIA requests. Cities can install this today. Repo: &lt;https://github.com/CivicSuite/civicrecords-ai&gt;.</w:t>
+        <w:t>- **civicrecords-ai v1.4.1** — a working, shipping module for managing public records / FOIA requests, now aligned to `civiccore==0.3.0`. Cities can install this today. Repo: &lt;https://github.com/CivicSuite/civicrecords-ai&gt;.</w:t>
         <w:br/>
         <w:t>- **civiccore v0.3.0** — the shared "platform" package that every module uses. It now ships migrations, the shared SQLAlchemy `Base`, the LLM abstraction, hash-chained audit primitives, source/provenance contracts, offline import/export manifests, export-bundle helpers, and local city profile configuration. It is not a product on its own; you only "install" it as a dependency of a module. Repo: &lt;https://github.com/CivicSuite/civiccore&gt;.</w:t>
         <w:br/>
-        <w:t>- **civicclerk v0.1.0** — a runtime-foundation release for meetings, agendas, packets, minutes, voting, and sunshine-law compliance. It ships the API/schema foundation, compliance guardrails, and a browser-visible staff workflow foundation at `/staff`; full database-backed workflow screens are still planned. Repo: &lt;https://github.com/CivicSuite/civicclerk&gt;.</w:t>
+        <w:t>- **civicclerk v0.1.1** — a runtime-foundation release for meetings, agendas, packets, minutes, voting, and sunshine-law compliance. It ships the API/schema foundation, compliance guardrails, and live `/staff` workflow screens for intake, packet assembly/export, notice checklist, meeting outcomes, minutes draft, public archive, and connector import; full database persistence/authentication hardening is still planned. Repo: &lt;https://github.com/CivicSuite/civicclerk&gt;.</w:t>
         <w:br/>
-        <w:t>- **civiccode v0.1.0** — a runtime-foundation release for municipal code and ordinance access. It ships source registry, section/version lifecycle, search and permalinks, deterministic citations, citation-grounded Q&amp;A, staff notes, plain-language summaries, CivicClerk handoff intake, resident lookup pages, local import connectors, and records-ready exports. It still does not ship legal advice, live LLM calls, live codifier sync, or automatic ordinance codification. Repo: &lt;https://github.com/CivicSuite/civiccode&gt;.</w:t>
+        <w:t>- **civiccode v0.1.1** — a runtime-foundation release for municipal code and ordinance access, now aligned to `civiccore==0.3.0`. It ships source registry, section/version lifecycle, search and permalinks, deterministic citations, citation-grounded Q&amp;A, staff notes, plain-language summaries, CivicClerk handoff intake, resident lookup pages, local import connectors, and records-ready exports. It still does not ship legal advice, live LLM calls, live codifier sync, or automatic ordinance codification. Repo: &lt;https://github.com/CivicSuite/civiccode&gt;.</w:t>
         <w:br/>
-        <w:t>- **civiczone v0.1.0** — a runtime-foundation release for parcel-aware zoning and land-use Q&amp;A. It ships canonical zoning schema, Alembic migrations, sample parcel and rule lookups, citation-grounded sample Q&amp;A, planner escalation, staff-context samples, and a public sample UI at `/civiczone`. It still does not ship live GIS ingestion, live LLM calls, authentication/RBAC, planner review queues, official zoning determinations, or legal advice. Repo: &lt;https://github.com/CivicSuite/civiczone&gt;.</w:t>
+        <w:t>- **civiczone v0.1.1** — a runtime-foundation release for parcel-aware zoning and land-use Q&amp;A, now aligned to `civiccore==0.3.0`. It ships canonical zoning schema, Alembic migrations, sample parcel and rule lookups, citation-grounded sample Q&amp;A, planner escalation, staff-context samples, and a public sample UI at `/civiczone`. It still does not ship live GIS ingestion, live LLM calls, authentication/RBAC, planner review queues, official zoning determinations, or legal advice. Repo: &lt;https://github.com/CivicSuite/civiczone&gt;.</w:t>
         <w:br/>
-        <w:t>- **civicaccess v0.1.0** — a runtime-foundation release for accessibility, plain-language, multilingual, and ADA review support. It ships deterministic sample accessibility review, plain-language rewrite, multilingual variant, records-ready export checklist, and a public sample UI at `/civicaccess`. It still does not ship certified ADA compliance, legal advice, live LLM calls, production translation workflows, document ingestion, or suite-wide integration APIs. Repo: &lt;https://github.com/CivicSuite/civicaccess&gt;.</w:t>
+        <w:t>- **civicaccess v0.1.1** — a runtime-foundation release for accessibility, plain-language, multilingual, and ADA review support, now aligned to `civiccore==0.3.0`. It ships deterministic sample accessibility review, plain-language rewrite, multilingual variant, records-ready export checklist, and a public sample UI at `/civicaccess`. It still does not ship certified ADA compliance, legal advice, live LLM calls, production translation workflows, document ingestion, or suite-wide integration APIs. Repo: &lt;https://github.com/CivicSuite/civicaccess&gt;.</w:t>
         <w:br/>
-        <w:t>- **civicplan v0.1.0** — a runtime-foundation release for comprehensive-plan policy lookup and cited planning analysis support. It ships deterministic sample plan-policy lookup, policy-consistency support, staff-analysis outline helper, records-ready export checklist, and a public sample UI at `/civicplan`. It still does not ship official planning determinations, legal advice, live GIS, live LLM calls, plan document ingestion, permitting-system integrations, or production staff-review queues. Repo: &lt;https://github.com/CivicSuite/civicplan&gt;.</w:t>
+        <w:t>- **civicplan v0.1.1** — a runtime-foundation release for comprehensive-plan policy lookup and cited planning analysis support, now aligned to `civiccore==0.3.0`. It ships deterministic sample plan-policy lookup, policy-consistency support, staff-analysis outline helper, records-ready export checklist, and a public sample UI at `/civicplan`. It still does not ship official planning determinations, legal advice, live GIS, live LLM calls, plan document ingestion, permitting-system integrations, or production staff-review queues. Repo: &lt;https://github.com/CivicSuite/civicplan&gt;.</w:t>
         <w:br/>
-        <w:t>- **civicpermit v0.1.0** — a runtime-foundation release for permit pre-application and intake-readiness support. It ships deterministic sample permit requirement lookup, intake-readiness review, submittal outline helper, records-ready export checklist, and a public sample UI at `/civicpermit`. It still does not ship permit approvals, legal advice, live GIS, live LLM calls, plan ingestion, production permitting-system integrations, or system-of-record behavior. Repo: &lt;https://github.com/CivicSuite/civicpermit&gt;.</w:t>
+        <w:t>- **civicpermit v0.1.1** - a runtime-foundation release for permit pre-application and intake-readiness support, now aligned to `civiccore==0.3.0`. It ships deterministic sample permit requirement lookup, intake-readiness review, submittal outline helper, records-ready export checklist, and a public sample UI at `/civicpermit`. It still does not ship permit approvals, legal advice, live GIS, live LLM calls, plan ingestion, production permitting-system integrations, or system-of-record behavior. Repo: &lt;https://github.com/CivicSuite/civicpermit&gt;.</w:t>
         <w:br/>
-        <w:t>- **civicinspect v0.1.0** — a runtime-foundation release for inspection support. It ships deterministic sample repeat-case lookup, inspector-owned report draft helper, notice draft helper, records-ready export checklist, and a public sample UI at `/civicinspect`. It still does not ship official findings, citations, fines, notices, inspection scheduling, legal advice, live photo analysis, live LLM calls, or system-of-record integrations. Repo: &lt;https://github.com/CivicSuite/civicinspect&gt;.</w:t>
+        <w:t>- **civicinspect v0.1.1** - a runtime-foundation release for inspection support, now aligned to `civiccore==0.3.0`. It ships deterministic sample repeat-case lookup, inspector-owned report draft helper, notice draft helper, records-ready export checklist, and a public sample UI at `/civicinspect`. It still does not ship official findings, citations, fines, notices, inspection scheduling, legal advice, live photo analysis, live LLM calls, or system-of-record integrations. Repo: &lt;https://github.com/CivicSuite/civicinspect&gt;.</w:t>
         <w:br/>
-        <w:t>- **civicgrants v0.1.0** — a runtime-foundation release for grant opportunity and compliance support. It ships deterministic sample opportunity triage, eligibility-factor matching, application outline helper, compliance calendar helper, audit-ready export checklist, and a public sample UI at `/civicgrants`. It still does not ship live funder feeds, official eligibility decisions, legal advice, live LLM calls, submission portals, or grant system-of-record integrations. Repo: &lt;https://github.com/CivicSuite/civicgrants&gt;.</w:t>
+        <w:t>- **civicgrants v0.1.1** - a runtime-foundation release for grant opportunity and compliance support, now aligned to `civiccore==0.3.0`. It ships deterministic sample opportunity triage, eligibility-factor matching, application outline helper, compliance calendar helper, audit-ready export checklist, and a public sample UI at `/civicgrants`. It still does not ship live funder feeds, official eligibility decisions, legal advice, live LLM calls, submission portals, or grant system-of-record integrations. Repo: &lt;https://github.com/CivicSuite/civicgrants&gt;.</w:t>
         <w:br/>
-        <w:t>- **civicprocure v0.1.0** — a runtime-foundation release for procurement drafting and award-packet support. It ships deterministic sample RFP drafting, proposal comparison, exception extraction, scoring summary helper, award-packet checklist, and a public sample UI at `/civicprocure`. It still does not ship live vendor portals, official vendor evaluation decisions, legal advice, live LLM calls, e-procurement submission portals, or procurement system-of-record integrations. Repo: &lt;https://github.com/CivicSuite/civicprocure&gt;.</w:t>
+        <w:t>- **civicprocure v0.1.1** — a runtime-foundation release for procurement drafting and award-packet support, now aligned to `civiccore==0.3.0`. It ships deterministic sample RFP drafting, proposal comparison, exception extraction, scoring summary helper, award-packet checklist, and a public sample UI at `/civicprocure`. It still does not ship live vendor portals, official vendor evaluation decisions, legal advice, live LLM calls, e-procurement submission portals, or procurement system-of-record integrations. Repo: &lt;https://github.com/CivicSuite/civicprocure&gt;.</w:t>
         <w:br/>
-        <w:t>- **civiccontracts v0.1.0** - a runtime-foundation release for contract repository and renewal visibility support. It ships deterministic sample contract registry, clause topic lookup, expiration tracking, renewal visibility, public-records export checklist, and a public sample UI at `/civiccontracts`. It still does not ship live contract management platforms, official legal interpretation, legal advice, renewal approvals, contract execution workflows, live LLM calls, or contract system-of-record integrations. Repo: &lt;https://github.com/CivicSuite/civiccontracts&gt;.</w:t>
+        <w:t>- **civiccontracts v0.1.1** - a runtime-foundation release for contract repository and renewal visibility support, now aligned to `civiccore==0.3.0`. It ships deterministic sample contract registry, clause topic lookup, expiration tracking, renewal visibility, public-records export checklist, and a public sample UI at `/civiccontracts`. It still does not ship live contract management platforms, official legal interpretation, legal advice, renewal approvals, contract execution workflows, live LLM calls, or contract system-of-record integrations. Repo: &lt;https://github.com/CivicSuite/civiccontracts&gt;.</w:t>
         <w:br/>
-        <w:t>- **civicboards v0.1.0** - a runtime-foundation release for board and commission administration. It ships deterministic sample board registry, term review plans, vacancy checklists, attendance summaries, notice/records export checklist, and a public sample UI at `/civicboards`. It still does not ship live agenda systems, appointment decisions, legal advice, official notice publication, meeting system write-back, live LLM calls, or board system-of-record integrations. Repo: &lt;https://github.com/CivicSuite/civicboards&gt;.</w:t>
+        <w:t>- **civicboards v0.1.1** - a runtime-foundation release for board and commission administration, now aligned to `civiccore==0.3.0`. It ships deterministic sample board registry, term review plans, vacancy checklists, attendance summaries, notice/records export checklist, and a public sample UI at `/civicboards`. It still does not ship live agenda systems, appointment decisions, legal advice, official notice publication, meeting system write-back, live LLM calls, or board system-of-record integrations. Repo: &lt;https://github.com/CivicSuite/civicboards&gt;.</w:t>
         <w:br/>
-        <w:t>- **civicnotice v0.1.0** - a runtime-foundation release for public notice compliance support. It ships deterministic sample notice registry, statutory deadline plans, publication-readiness checklists, channel planning, notice/records export checklist, and a public sample UI at /civicnotice. It still does not ship legal sufficiency decisions, legal advice, live LLM calls, official notice publication, publication-system write-back, or notice system-of-record integrations. Repo: &lt;https://github.com/CivicSuite/civicnotice&gt;.</w:t>
+        <w:t>- **civicnotice v0.1.1** - a runtime-foundation release for public notice compliance support, now aligned to `civiccore==0.3.0`. It ships deterministic sample notice registry, statutory deadline plans, publication-readiness checklists, channel planning, notice/records export checklist, and a public sample UI at /civicnotice. It still does not ship legal sufficiency decisions, legal advice, live LLM calls, official notice publication, publication-system write-back, or notice system-of-record integrations. Repo: &lt;https://github.com/CivicSuite/civicnotice&gt;.</w:t>
         <w:br/>
-        <w:t>- **civic311 v0.1.0** - a runtime-foundation release for resident service request support. It ships deterministic sample request intake, triage suggestions, duplicate-candidate review, department routing checklists, Open311-compatible export helper, and a public sample UI at /civic311. It still does not ship official dispatch, work-order creation, emergency response, legal advice, live LLM calls, 311 system write-back, or 311 system-of-record integrations. Repo: &lt;https://github.com/CivicSuite/civic311&gt;.</w:t>
+        <w:t>- **civic311 v0.1.1** - a runtime-foundation release for resident service request support, now aligned to `civiccore==0.3.0`. It ships deterministic sample request intake, triage suggestions, duplicate-candidate review, department routing checklists, Open311-compatible export helper, and a public sample UI at /civic311. It still does not ship official dispatch, work-order creation, emergency response, legal advice, live LLM calls, 311 system write-back, or 311 system-of-record integrations. Repo: &lt;https://github.com/CivicSuite/civic311&gt;.</w:t>
         <w:br/>
-        <w:t>- **civiccomms v0.1.0** - a runtime-foundation release for public communications support. It ships source-readiness review, meeting summary drafts, ordinance explainers, newsletter scaffolds, FAQ prompts, audience-variant drafts, and a public sample UI at /civiccomms. It still does not ship autonomous publication, campaign or advocacy content, legal advice, certified translation, live LLM calls, social media posting, or communications system-of-record integrations. Repo: &lt;https://github.com/CivicSuite/civiccomms&gt;.</w:t>
+        <w:t>- **civiccomms v0.1.1** - a runtime-foundation release for public communications support. It ships source-readiness review, meeting summary drafts, ordinance explainers, newsletter scaffolds, FAQ prompts, audience-variant drafts, and a public sample UI at /civiccomms. It still does not ship autonomous publication, campaign or advocacy content, legal advice, certified translation, live LLM calls, social media posting, or communications system-of-record integrations, now aligned to `civiccore==0.3.0`. Repo: &lt;https://github.com/CivicSuite/civiccomms&gt;.</w:t>
         <w:br/>
-        <w:t>- **civicdata v0.1.0** - a runtime-foundation release for open-data and transparency publishing support. It ships dataset normalization, data-dictionary drafts, CKAN package metadata drafts, PII/exemption preflight, archive-bundle checklists, publication planning, and a public sample UI at /civicdata. It still does not ship live CKAN publication, BI dashboards, data warehouse storage, autonomous redaction, or external connector runtime. Repo: &lt;https://github.com/CivicSuite/civicdata&gt;.</w:t>
+        <w:t>- **civicdata v0.1.1** - a runtime-foundation release for open-data and transparency publishing support. It ships dataset normalization, data-dictionary drafts, CKAN package metadata drafts, PII/exemption preflight, archive-bundle checklists, publication planning, and a public sample UI at /civicdata. It still does not ship live CKAN publication, BI dashboards, data warehouse storage, autonomous redaction, or external connector runtime, now aligned to `civiccore==0.3.0`. Repo: &lt;https://github.com/CivicSuite/civicdata&gt;.</w:t>
         <w:br/>
-        <w:t>- **civichr v0.1.0** - a runtime-foundation release for HR policy support. It ships policy lookup outlines, handbook summaries, job-description drafts, classification references, onboarding/training checklists, intake templates, source review, and sensitive-topic preflight. It still does not ship HRIS, payroll, benefits administration, personnel records management, employment-law advice, personnel-file ingestion, live LLM calls, or external HR/payroll connectors. Repo: &lt;https://github.com/CivicSuite/civichr&gt;.</w:t>
+        <w:t>- **civichr v0.1.1** - a runtime-foundation release for HR policy support. It ships policy lookup outlines, handbook summaries, job-description drafts, classification references, onboarding/training checklists, intake templates, source review, and sensitive-topic preflight. It still does not ship HRIS, payroll, benefits administration, personnel records management, employment-law advice, personnel-file ingestion, live LLM calls, or external HR/payroll connectors, now aligned to `civiccore==0.3.0`. Repo: &lt;https://github.com/CivicSuite/civichr&gt;.</w:t>
         <w:br/>
-        <w:t>- **civicbudget v0.1.0** - budget narrative and transparency support foundation. Ships line-item variance analysis, budget narrative drafts, department memo drafts, hearing packet checklists, resident summaries, optional GFOA checklist support, and accessible public sample UI at `/civicbudget`. ERP, budgeting system, accounting, payroll, fund accounting, budget adoption, official approvals, live LLM calls, and live finance-system connector runtime are still not shipped. Repo: &lt;https://github.com/CivicSuite/civicbudget&gt;.</w:t>
+        <w:t>- **civicbudget v0.1.1** - budget narrative and transparency support foundation. Ships line-item variance analysis, budget narrative drafts, department memo drafts, hearing packet checklists, resident summaries, optional GFOA checklist support, and accessible public sample UI at `/civicbudget`. ERP, budgeting system, accounting, payroll, fund accounting, budget adoption, official approvals, live LLM calls, and live finance-system connector runtime are still not shipped, now aligned to `civiccore==0.3.0`. Repo: &lt;https://github.com/CivicSuite/civicbudget&gt;.</w:t>
         <w:br/>
-        <w:t>- **civiclegal v0.1.0** - internal legal-record research support foundation. Ships privilege-aware corpus filtering, citation-first city-record search, prior-action lookup, attorney-reviewed memo scaffolds, ordinance comparison checklists, litigation-hold candidate flags, authority citation tracking, and accessible public sample UI at `/civiclegal`. Legal advice, Westlaw/Lexis replacement, autonomous legal conclusions, court filing, e-discovery management, live LLM calls, live privileged corpus ingestion, and external legal-system connector runtime are still not shipped. Repo: &lt;https://github.com/CivicSuite/civiclegal&gt;.</w:t>
+        <w:t>- **civiclegal v0.1.1** - internal legal-record research support foundation. Ships privilege-aware corpus filtering, citation-first city-record search, prior-action lookup, attorney-reviewed memo scaffolds, ordinance comparison checklists, litigation-hold candidate flags, authority citation tracking, and accessible public sample UI at `/civiclegal`. Legal advice, Westlaw/Lexis replacement, autonomous legal conclusions, court filing, e-discovery management, live LLM calls, live privileged corpus ingestion, and external legal-system connector runtime are still not shipped, now aligned to `civiccore==0.3.0`. Repo: &lt;https://github.com/CivicSuite/civiclegal&gt;.</w:t>
         <w:br/>
-        <w:t>- **civicelections v0.1.0** - election administration support foundation. Ships cited voter guidance, candidate filing checklists, worker training Q&amp;A, ballot-summary drafts, campaign-finance summaries, canvass checklists, accessibility review, and accessible public sample UI at `/civicelections`. Voter registration, ballot marking, tabulation, election conduct automation, campaign finance system of record, official certification, live LLM calls, and election-system connector runtime are still not shipped. Repo: &lt;https://github.com/CivicSuite/civicelections&gt;.</w:t>
+        <w:t>- **civicelections v0.1.1** - election administration support foundation. Ships cited voter guidance, candidate filing checklists, worker training Q&amp;A, ballot-summary drafts, campaign-finance summaries, canvass checklists, accessibility review, and accessible public sample UI at `/civicelections`. Voter registration, ballot marking, tabulation, election conduct automation, campaign finance system of record, official certification, live LLM calls, and election-system connector runtime are still not shipped, now aligned to `civiccore==0.3.0`. Repo: &lt;https://github.com/CivicSuite/civicelections&gt;.</w:t>
       </w:r>
     </w:p>
     <w:p>
@@ -123,12 +123,12 @@
     </w:p>
     <w:p>
       <w:r>
-        <w:t>- Five additional modules across seven tiers — see the [module catalog](specs/01_catalog.md).</w:t>
+        <w:t>- 0 additional modules remain uncreated; all 26 catalog repos now exist. See the [module catalog](specs/01_catalog.md) for scope and planned depth.</w:t>
       </w:r>
     </w:p>
     <w:p>
       <w:r>
-        <w:t>If you don't see a module on this list with a version number, **it does not exist as code yet**. Specs are not products.</w:t>
+        <w:t>Every catalog module now has a repo and a version number. Specs still distinguish shipped foundations from planned production-depth behavior.</w:t>
       </w:r>
     </w:p>
     <w:p>
@@ -231,49 +231,49 @@
         <w:br/>
         <w:t>|---|---|---|</w:t>
         <w:br/>
-        <w:t>| civicrecords-ai | &lt;https://github.com/CivicSuite/civicrecords-ai&gt; | Shipping v1.4.0. Transferred to the `CivicSuite` GitHub org on 2026-04-25; this is now the canonical home. |</w:t>
+        <w:t>| civicrecords-ai | &lt;https://github.com/CivicSuite/civicrecords-ai&gt; | Shipping v1.4.1, aligned to `civiccore==0.3.0`. Transferred to the `CivicSuite` GitHub org on 2026-04-25; this is now the canonical home. |</w:t>
         <w:br/>
         <w:t>| civiccore | &lt;https://github.com/CivicSuite/civiccore&gt; | Shipping v0.3.0 shared primitives: migrations, db.Base, LLM, audit, provenance, manifests, exports, and city profiles. |</w:t>
         <w:br/>
-        <w:t>| civicclerk | &lt;https://github.com/CivicSuite/civicclerk&gt; | Shipping v0.1.0 runtime foundation with `/staff` workflow UI foundation. |</w:t>
+        <w:t>| civicclerk | &lt;https://github.com/CivicSuite/civicclerk&gt; | Shipping v0.1.1 runtime foundation with live `/staff` workflow screens for intake, packet export, notice, outcomes, minutes, archive, and connector import. |</w:t>
         <w:br/>
-        <w:t>| civiccode | &lt;https://github.com/CivicSuite/civiccode&gt; | Shipping v0.1.0 runtime foundation for municipal-code lookup, citations, local imports, and records-ready exports. |</w:t>
+        <w:t>| civiccode | &lt;https://github.com/CivicSuite/civiccode&gt; | Shipping v0.1.1 for municipal-code lookup, citations, local imports, records-ready exports, and `civiccore==0.3.0` alignment. |</w:t>
         <w:br/>
-        <w:t>| civiczone | &lt;https://github.com/CivicSuite/civiczone&gt; | Shipping v0.1.0 runtime foundation for parcel-aware zoning samples and public UI foundation. |</w:t>
+        <w:t>| civiczone | &lt;https://github.com/CivicSuite/civiczone&gt; | Shipping v0.1.1 for parcel-aware zoning samples, public UI foundation, and `civiccore==0.3.0` alignment. |</w:t>
         <w:br/>
-        <w:t>| civicaccess | &lt;https://github.com/CivicSuite/civicaccess&gt; | Shipping v0.1.0 runtime foundation for accessibility review and public UI foundation. |</w:t>
+        <w:t>| civicaccess | &lt;https://github.com/CivicSuite/civicaccess&gt; | Shipping v0.1.1 for accessibility review, public UI foundation, and `civiccore==0.3.0` alignment. |</w:t>
         <w:br/>
-        <w:t>| civicplan | &lt;https://github.com/CivicSuite/civicplan&gt; | Shipping v0.1.0 runtime foundation for cited plan-policy lookup and public UI foundation. |</w:t>
+        <w:t>| civicplan | &lt;https://github.com/CivicSuite/civicplan&gt; | Shipping v0.1.1 for cited plan-policy lookup, public UI foundation, and `civiccore==0.3.0` alignment. |</w:t>
         <w:br/>
-        <w:t>| civicpermit | &lt;https://github.com/CivicSuite/civicpermit&gt; | Shipping v0.1.0 runtime foundation for permit requirement lookup and public UI foundation. |</w:t>
+        <w:t>| civicpermit | &lt;https://github.com/CivicSuite/civicpermit&gt; | Shipping v0.1.1 for permit requirement lookup, intake-readiness review, public UI foundation, and `civiccore==0.3.0` alignment. |</w:t>
         <w:br/>
-        <w:t>| civicinspect | &lt;https://github.com/CivicSuite/civicinspect&gt; | Shipping v0.1.0 runtime foundation for repeat-case lookup, report drafts, notice drafts, and public UI foundation. |</w:t>
+        <w:t>| civicinspect | &lt;https://github.com/CivicSuite/civicinspect&gt; | Shipping v0.1.1 for repeat-case lookup, report drafts, notice drafts, public UI foundation, and `civiccore==0.3.0` alignment. |</w:t>
         <w:br/>
-        <w:t>| civicgrants | &lt;https://github.com/CivicSuite/civicgrants&gt; | Shipping v0.1.0 runtime foundation for opportunity triage, eligibility matching, compliance calendars, and public UI foundation. |</w:t>
+        <w:t>| civicgrants | &lt;https://github.com/CivicSuite/civicgrants&gt; | Shipping v0.1.1 for opportunity triage, eligibility matching, compliance calendars, public UI foundation, and `civiccore==0.3.0` alignment. |</w:t>
         <w:br/>
-        <w:t>| civicprocure | &lt;https://github.com/CivicSuite/civicprocure&gt; | Shipping v0.1.0 runtime foundation for RFP drafting, proposal comparison, exception extraction, scoring summaries, award-packet checklists, and public UI foundation. |</w:t>
+        <w:t>| civicprocure | &lt;https://github.com/CivicSuite/civicprocure&gt; | Shipping v0.1.1 for RFP drafting, proposal comparison, exception extraction, scoring summaries, award-packet checklists, public UI foundation, and `civiccore==0.3.0` alignment. |</w:t>
         <w:br/>
-        <w:t>| civiccontracts | &lt;https://github.com/CivicSuite/civiccontracts&gt; | Shipping v0.1.0 runtime foundation for contract registry, clause topic lookup, expiration tracking, renewal visibility, public-records exports, and public UI foundation. |</w:t>
+        <w:t>| civiccontracts | &lt;https://github.com/CivicSuite/civiccontracts&gt; | Shipping v0.1.1 for contract registry, clause topic lookup, expiration tracking, renewal visibility, public-records exports, public UI foundation, and `civiccore==0.3.0` alignment. |</w:t>
         <w:br/>
-        <w:t>| civicboards | &lt;https://github.com/CivicSuite/civicboards&gt; | Shipping v0.1.0 runtime foundation for board registry, term tracking, vacancy tracking, attendance review, notice/records exports, and public UI foundation. |</w:t>
+        <w:t>| civicboards | &lt;https://github.com/CivicSuite/civicboards&gt; | Shipping v0.1.1 runtime foundation for board registry, term tracking, vacancy tracking, attendance review, notice/records exports, public UI foundation, and `civiccore==0.3.0` alignment. |</w:t>
         <w:br/>
-        <w:t>| civicnotice | &lt;https://github.com/CivicSuite/civicnotice&gt; | Shipping v0.1.0 runtime foundation for notice registry, statutory deadlines, publication-readiness checks, channel planning, notice records exports, and public UI foundation. |</w:t>
+        <w:t>| civicnotice | &lt;https://github.com/CivicSuite/civicnotice&gt; | Shipping v0.1.1 runtime foundation for notice registry, statutory deadlines, publication-readiness checks, channel planning, notice records exports, public UI foundation, and `civiccore==0.3.0` alignment. |</w:t>
         <w:br/>
-        <w:t>| civic311 | &lt;https://github.com/CivicSuite/civic311&gt; | Shipping v0.1.0 runtime foundation for request intake, triage suggestions, duplicate-candidate review, department routing, Open311-compatible exports, and public UI foundation. |</w:t>
+        <w:t>| civic311 | &lt;https://github.com/CivicSuite/civic311&gt; | Shipping v0.1.1 runtime foundation for request intake, triage suggestions, duplicate-candidate review, department routing, Open311-compatible exports, public UI foundation, and `civiccore==0.3.0` alignment. |</w:t>
         <w:br/>
-        <w:t>| civiccomms | &lt;https://github.com/CivicSuite/civiccomms&gt; | Shipping v0.1.0 runtime foundation for source-readiness review, meeting summaries, ordinance explainers, newsletters, FAQs, audience variants, and public UI foundation. |</w:t>
+        <w:t>| civiccomms | &lt;https://github.com/CivicSuite/civiccomms&gt; | Shipping v0.1.1 runtime foundation for source-readiness review, meeting summaries, ordinance explainers, newsletters, FAQs, audience variants, and public UI foundation. |</w:t>
         <w:br/>
-        <w:t>| civicdata | &lt;https://github.com/CivicSuite/civicdata&gt; | Shipping v0.1.0 runtime foundation for dataset normalization, data dictionaries, CKAN metadata drafts, redaction preflight, archive checklists, publication planning, and public UI foundation. |</w:t>
+        <w:t>| civicdata | &lt;https://github.com/CivicSuite/civicdata&gt; | Shipping v0.1.1 runtime foundation for dataset normalization, data dictionaries, CKAN metadata drafts, redaction preflight, archive checklists, publication planning, and public UI foundation. |</w:t>
         <w:br/>
-        <w:t>| civichr | &lt;https://github.com/CivicSuite/civichr&gt; | Shipping v0.1.0 runtime foundation for HR policy lookup, handbook summaries, job descriptions, classification references, onboarding/training checklists, and intake templates. |</w:t>
+        <w:t>| civichr | &lt;https://github.com/CivicSuite/civichr&gt; | Shipping v0.1.1 runtime foundation for HR policy lookup, handbook summaries, job descriptions, classification references, onboarding/training checklists, and intake templates. |</w:t>
         <w:br/>
-        <w:t>| civicbudget | &lt;https://github.com/CivicSuite/civicbudget&gt; | Shipping v0.1.0 runtime foundation for line-item analysis, budget narratives, department memos, hearing packet checklists, resident summaries, and GFOA checklist support. |</w:t>
+        <w:t>| civicbudget | &lt;https://github.com/CivicSuite/civicbudget&gt; | Shipping v0.1.1 runtime foundation for line-item analysis, budget narratives, department memos, hearing packet checklists, resident summaries, and GFOA checklist support. |</w:t>
         <w:br/>
-        <w:t>| civiclegal | &lt;https://github.com/CivicSuite/civiclegal&gt; | Shipping v0.1.0 runtime foundation for privilege-aware legal-record search, prior-action lookup, memo scaffolds, ordinance comparison, litigation-hold flags, and citation tracking. |</w:t>
+        <w:t>| civiclegal | &lt;https://github.com/CivicSuite/civiclegal&gt; | Shipping v0.1.1 runtime foundation for privilege-aware legal-record search, prior-action lookup, memo scaffolds, ordinance comparison, litigation-hold flags, and citation tracking. |</w:t>
         <w:br/>
-        <w:t>| civicelections | &lt;https://github.com/CivicSuite/civicelections&gt; | Shipping v0.1.0 runtime foundation for voter guidance, filing checklists, worker training, ballot summaries, campaign-finance summaries, canvass checklists, and accessibility review. |</w:t>
+        <w:t>| civicelections | &lt;https://github.com/CivicSuite/civicelections&gt; | Shipping v0.1.1 runtime foundation for voter guidance, filing checklists, worker training, ballot summaries, campaign-finance summaries, canvass checklists, and accessibility review. |</w:t>
         <w:br/>
-        <w:t>| future modules | not created yet | Specs only. |</w:t>
+        <w:t>| future module depth | planned per module | Production integrations, connectors, persistence hardening, auth/RBAC, and cross-module workflow depth land through module-specific releases. |</w:t>
       </w:r>
     </w:p>
     <w:p>
@@ -313,7 +313,7 @@
         </w:rPr>
         <w:t>dependencies = [</w:t>
         <w:br/>
-        <w:t xml:space="preserve">  "civiccore==0.2.0",</w:t>
+        <w:t xml:space="preserve">  "civiccore==0.3.0",</w:t>
         <w:br/>
         <w:t xml:space="preserve">  ...</w:t>
         <w:br/>
@@ -322,7 +322,7 @@
     </w:p>
     <w:p>
       <w:r>
-        <w:t>When a city installs a module, civiccore is pulled in as a wheel. There is no monorepo, no submodule, no vendored copy. The example above reflects currently shipped module pins that still require `civiccore==0.2.0`; CivicCore v0.3.0 is now published for new shared-primitives work and future consumer updates. Civiccore is published to PyPI (or, until publication, distributed as a release wheel from its GitHub repo).</w:t>
+        <w:t>When a city installs a module, civiccore is pulled in as a wheel. There is no monorepo, no submodule, no vendored copy. The example above reflects the current post-v0.3 consumer state: all catalog module releases now publish v0.1.1 with `civiccore==0.3.0`. Civiccore is published to PyPI (or, until publication, distributed as a release wheel from its GitHub repo).</w:t>
       </w:r>
     </w:p>
     <w:p>
@@ -494,7 +494,7 @@
         <w:br/>
         <w:t xml:space="preserve">   | civicrecords-ai     |   |   civicclerk     |   |   civiczone      |</w:t>
         <w:br/>
-        <w:t xml:space="preserve">   |   v1.4.0 SHIPPING   |   | v0.1.0 SHIPPING  |   | v0.1.0 SHIPPING |</w:t>
+        <w:t xml:space="preserve">   |   v1.4.0 SHIPPING   |   | v0.1.0 SHIPPING  |   | v0.1.1 SHIPPING |</w:t>
         <w:br/>
         <w:t xml:space="preserve">   |   FOIA / public     |   |  meetings,       |   |  zoning, parcel  |</w:t>
         <w:br/>
@@ -572,7 +572,7 @@
       <w:r>
         <w:t>- **ADR** — Architecture Decision Record; a short, dated document recording a significant architectural decision and its rationale.</w:t>
         <w:br/>
-        <w:t>- **Pinned version** — a specific exact version a module requires of civiccore (for example `==0.2.0` for current foundation modules, or `==0.3.0` after a consumer explicitly upgrades), as opposed to a range.</w:t>
+        <w:t>- **Pinned version** — a specific exact version a module requires of civiccore (for example `==0.3.0` for current foundation modules, or an older exact pin preserved for historical releases), as opposed to a range.</w:t>
         <w:br/>
         <w:t>- **Wheel** — the standard Python package distribution format. civiccore is published as a wheel.</w:t>
         <w:br/>

</xml_diff>

<commit_message>
docs: add CivicAPI and CivicRegWatch specs
</commit_message>
<xml_diff>
--- a/USER-MANUAL.docx
+++ b/USER-MANUAL.docx
@@ -7,26 +7,26 @@
         <w:pStyle w:val="Heading1"/>
       </w:pPr>
       <w:r>
-        <w:t>CivicSuite — User Manual</w:t>
+        <w:t>CivicSuite - User Manual</w:t>
       </w:r>
     </w:p>
     <w:p>
       <w:r>
-        <w:t>This is the orientation manual for the CivicSuite umbrella repo. It is written in three parts so different audiences can read only what's relevant to them:</w:t>
+        <w:t>This is the orientation manual for the CivicSuite umbrella repo. It is written in three parts so different audiences can read only what is relevant to them:</w:t>
       </w:r>
     </w:p>
     <w:p>
       <w:r>
-        <w:t>1. **For municipal decision-makers** — non-technical overview of what CivicSuite is, what's available today, and what the licensing and sovereignty posture means for your city.</w:t>
+        <w:t>1. **For municipal decision-makers** - a non-technical overview of what CivicSuite is, what is available today, and what the sovereignty posture means for your city.</w:t>
         <w:br/>
-        <w:t>2. **For developers and IT staff** — how the umbrella works, where each module lives, and how to evaluate or contribute.</w:t>
+        <w:t>2. **For developers and IT staff** - how the umbrella repo works, where each module lives, and how to evaluate or contribute.</w:t>
         <w:br/>
-        <w:t>3. **Architecture reference** — diagrams and dependency rules.</w:t>
+        <w:t>3. **Architecture reference** - the dependency rules, upgrade model, and suite topology.</w:t>
       </w:r>
     </w:p>
     <w:p>
       <w:r>
-        <w:t>A glossary at the end defines every technical term used.</w:t>
+        <w:t>A glossary at the end defines the technical terms used here.</w:t>
       </w:r>
     </w:p>
     <w:p>
@@ -39,7 +39,7 @@
         <w:pStyle w:val="Heading2"/>
       </w:pPr>
       <w:r>
-        <w:t>Part 1 — For municipal decision-makers</w:t>
+        <w:t>Part 1 - For municipal decision-makers</w:t>
       </w:r>
     </w:p>
     <w:p>
@@ -52,12 +52,23 @@
     </w:p>
     <w:p>
       <w:r>
-        <w:t>CivicSuite is an **open-source product family** for municipal records and civic operations. It's not one program — it's a planned collection of modules a city can install one at a time, on its own hardware, on its own schedule. Cities never have to send data to a vendor's cloud, never pay per user, and can read or modify the source code anytime.</w:t>
+        <w:t>CivicSuite is an **open-source municipal product family**. It is not one giant program. It is a planned collection of modules that a city can install one at a time, on its own hardware, on its own schedule. Cities do not need to send operational data to a vendor cloud, do not pay per seat, and can inspect or modify the source code at any time.</w:t>
       </w:r>
     </w:p>
     <w:p>
       <w:r>
-        <w:t>Today, modules are shipping at different maturity levels: CivicRecords AI is production-usable, CivicCore is the shared platform package, and all 26 catalog modules have runtime-foundation releases. all catalog modules have advanced to v0.1.1 for CivicCore v0.3.0 alignment. We say shipped and planned boundaries plainly below — no roadmap inflation, no vaporware.</w:t>
+        <w:t>The suite is intentionally honest about maturity:</w:t>
+      </w:r>
+    </w:p>
+    <w:p>
+      <w:r>
+        <w:t>- `civicrecords-ai` is the current production-usable shipping product.</w:t>
+        <w:br/>
+        <w:t>- `civicclerk` is the active second-product candidate.</w:t>
+        <w:br/>
+        <w:t>- The rest of the catalog is in the foundation/planned tier: real runtime work or implementation specs, not yet end-to-end products.</w:t>
+        <w:br/>
+        <w:t>- `civiccore` is the shared platform package under all of them.</w:t>
       </w:r>
     </w:p>
     <w:p>
@@ -65,70 +76,28 @@
         <w:pStyle w:val="Heading3"/>
       </w:pPr>
       <w:r>
-        <w:t>What's available today (as of 2026-04-28)</w:t>
+        <w:t>What is available today? (as of 2026-04-30)</w:t>
       </w:r>
     </w:p>
     <w:p>
       <w:r>
-        <w:t>- **civicrecords-ai v1.4.1** — a working, shipping module for managing public records / FOIA requests, now aligned to `civiccore==0.3.0`. Cities can install this today. Repo: &lt;https://github.com/CivicSuite/civicrecords-ai&gt;.</w:t>
+        <w:t>- **`civicrecords-ai v1.4.3`** - the shipping product for public-records and FOIA workflow. Repo: &lt;https://github.com/CivicSuite/civicrecords-ai&gt;</w:t>
         <w:br/>
-        <w:t>- **civiccore v0.3.0** — the shared "platform" package that every module uses. It now ships migrations, the shared SQLAlchemy `Base`, the LLM abstraction, hash-chained audit primitives, source/provenance contracts, offline import/export manifests, export-bundle helpers, and local city profile configuration. It is not a product on its own; you only "install" it as a dependency of a module. Repo: &lt;https://github.com/CivicSuite/civiccore&gt;.</w:t>
+        <w:t>- **`civiccore v0.16.0`** - the shared platform package. It currently ships migrations, the shared SQLAlchemy `Base`, the LLM abstraction layer, audit/provenance primitives, export/manifest helpers, city profiles, auth/RBAC helpers, notice-compliance helpers, onboarding profile helpers, search/access helpers, connector/import helpers, release-evidence helpers, and trusted-header config/proxy enforcement helpers. Repo: &lt;https://github.com/CivicSuite/civiccore&gt;</w:t>
         <w:br/>
-        <w:t>- **civicclerk v0.1.1** — a runtime-foundation release for meetings, agendas, packets, minutes, voting, and sunshine-law compliance. It ships the API/schema foundation, compliance guardrails, and live `/staff` workflow screens for intake, packet assembly/export, notice checklist, meeting outcomes, minutes draft, public archive, and connector import; full database persistence/authentication hardening is still planned. Repo: &lt;https://github.com/CivicSuite/civicclerk&gt;.</w:t>
+        <w:t>- **`civicclerk v0.1.11`** - the productizing second-product candidate for meetings, agendas, packets, minutes, voting, and sunshine-law compliance. It already ships meaningful workflow depth, live `/staff` screens, the first `/public` shell, browser QA gates, connector import surfaces, auth readiness, install rehearsal helpers, release handoff helpers, deployment preflight, and shared `civiccore v0.16.0` reuse. Repo: &lt;https://github.com/CivicSuite/civicclerk&gt;</w:t>
         <w:br/>
-        <w:t>- **civiccode v0.1.1** — a runtime-foundation release for municipal code and ordinance access, now aligned to `civiccore==0.3.0`. It ships source registry, section/version lifecycle, search and permalinks, deterministic citations, citation-grounded Q&amp;A, staff notes, plain-language summaries, CivicClerk handoff intake, resident lookup pages, local import connectors, and records-ready exports. It still does not ship legal advice, live LLM calls, live codifier sync, or automatic ordinance codification. Repo: &lt;https://github.com/CivicSuite/civiccode&gt;.</w:t>
-        <w:br/>
-        <w:t>- **civiczone v0.1.1** — a runtime-foundation release for parcel-aware zoning and land-use Q&amp;A, now aligned to `civiccore==0.3.0`. It ships canonical zoning schema, Alembic migrations, sample parcel and rule lookups, citation-grounded sample Q&amp;A, planner escalation, staff-context samples, and a public sample UI at `/civiczone`. It still does not ship live GIS ingestion, live LLM calls, authentication/RBAC, planner review queues, official zoning determinations, or legal advice. Repo: &lt;https://github.com/CivicSuite/civiczone&gt;.</w:t>
-        <w:br/>
-        <w:t>- **civicaccess v0.1.1** — a runtime-foundation release for accessibility, plain-language, multilingual, and ADA review support, now aligned to `civiccore==0.3.0`. It ships deterministic sample accessibility review, plain-language rewrite, multilingual variant, records-ready export checklist, and a public sample UI at `/civicaccess`. It still does not ship certified ADA compliance, legal advice, live LLM calls, production translation workflows, document ingestion, or suite-wide integration APIs. Repo: &lt;https://github.com/CivicSuite/civicaccess&gt;.</w:t>
-        <w:br/>
-        <w:t>- **civicplan v0.1.1** — a runtime-foundation release for comprehensive-plan policy lookup and cited planning analysis support, now aligned to `civiccore==0.3.0`. It ships deterministic sample plan-policy lookup, policy-consistency support, staff-analysis outline helper, records-ready export checklist, and a public sample UI at `/civicplan`. It still does not ship official planning determinations, legal advice, live GIS, live LLM calls, plan document ingestion, permitting-system integrations, or production staff-review queues. Repo: &lt;https://github.com/CivicSuite/civicplan&gt;.</w:t>
-        <w:br/>
-        <w:t>- **civicpermit v0.1.1** - a runtime-foundation release for permit pre-application and intake-readiness support, now aligned to `civiccore==0.3.0`. It ships deterministic sample permit requirement lookup, intake-readiness review, submittal outline helper, records-ready export checklist, and a public sample UI at `/civicpermit`. It still does not ship permit approvals, legal advice, live GIS, live LLM calls, plan ingestion, production permitting-system integrations, or system-of-record behavior. Repo: &lt;https://github.com/CivicSuite/civicpermit&gt;.</w:t>
-        <w:br/>
-        <w:t>- **civicinspect v0.1.1** - a runtime-foundation release for inspection support, now aligned to `civiccore==0.3.0`. It ships deterministic sample repeat-case lookup, inspector-owned report draft helper, notice draft helper, records-ready export checklist, and a public sample UI at `/civicinspect`. It still does not ship official findings, citations, fines, notices, inspection scheduling, legal advice, live photo analysis, live LLM calls, or system-of-record integrations. Repo: &lt;https://github.com/CivicSuite/civicinspect&gt;.</w:t>
-        <w:br/>
-        <w:t>- **civicgrants v0.1.1** - a runtime-foundation release for grant opportunity and compliance support, now aligned to `civiccore==0.3.0`. It ships deterministic sample opportunity triage, eligibility-factor matching, application outline helper, compliance calendar helper, audit-ready export checklist, and a public sample UI at `/civicgrants`. It still does not ship live funder feeds, official eligibility decisions, legal advice, live LLM calls, submission portals, or grant system-of-record integrations. Repo: &lt;https://github.com/CivicSuite/civicgrants&gt;.</w:t>
-        <w:br/>
-        <w:t>- **civicprocure v0.1.1** — a runtime-foundation release for procurement drafting and award-packet support, now aligned to `civiccore==0.3.0`. It ships deterministic sample RFP drafting, proposal comparison, exception extraction, scoring summary helper, award-packet checklist, and a public sample UI at `/civicprocure`. It still does not ship live vendor portals, official vendor evaluation decisions, legal advice, live LLM calls, e-procurement submission portals, or procurement system-of-record integrations. Repo: &lt;https://github.com/CivicSuite/civicprocure&gt;.</w:t>
-        <w:br/>
-        <w:t>- **civiccontracts v0.1.1** - a runtime-foundation release for contract repository and renewal visibility support, now aligned to `civiccore==0.3.0`. It ships deterministic sample contract registry, clause topic lookup, expiration tracking, renewal visibility, public-records export checklist, and a public sample UI at `/civiccontracts`. It still does not ship live contract management platforms, official legal interpretation, legal advice, renewal approvals, contract execution workflows, live LLM calls, or contract system-of-record integrations. Repo: &lt;https://github.com/CivicSuite/civiccontracts&gt;.</w:t>
-        <w:br/>
-        <w:t>- **civicboards v0.1.1** - a runtime-foundation release for board and commission administration, now aligned to `civiccore==0.3.0`. It ships deterministic sample board registry, term review plans, vacancy checklists, attendance summaries, notice/records export checklist, and a public sample UI at `/civicboards`. It still does not ship live agenda systems, appointment decisions, legal advice, official notice publication, meeting system write-back, live LLM calls, or board system-of-record integrations. Repo: &lt;https://github.com/CivicSuite/civicboards&gt;.</w:t>
-        <w:br/>
-        <w:t>- **civicnotice v0.1.1** - a runtime-foundation release for public notice compliance support, now aligned to `civiccore==0.3.0`. It ships deterministic sample notice registry, statutory deadline plans, publication-readiness checklists, channel planning, notice/records export checklist, and a public sample UI at /civicnotice. It still does not ship legal sufficiency decisions, legal advice, live LLM calls, official notice publication, publication-system write-back, or notice system-of-record integrations. Repo: &lt;https://github.com/CivicSuite/civicnotice&gt;.</w:t>
-        <w:br/>
-        <w:t>- **civic311 v0.1.1** - a runtime-foundation release for resident service request support, now aligned to `civiccore==0.3.0`. It ships deterministic sample request intake, triage suggestions, duplicate-candidate review, department routing checklists, Open311-compatible export helper, and a public sample UI at /civic311. It still does not ship official dispatch, work-order creation, emergency response, legal advice, live LLM calls, 311 system write-back, or 311 system-of-record integrations. Repo: &lt;https://github.com/CivicSuite/civic311&gt;.</w:t>
-        <w:br/>
-        <w:t>- **civiccomms v0.1.1** - a runtime-foundation release for public communications support. It ships source-readiness review, meeting summary drafts, ordinance explainers, newsletter scaffolds, FAQ prompts, audience-variant drafts, and a public sample UI at /civiccomms. It still does not ship autonomous publication, campaign or advocacy content, legal advice, certified translation, live LLM calls, social media posting, or communications system-of-record integrations, now aligned to `civiccore==0.3.0`. Repo: &lt;https://github.com/CivicSuite/civiccomms&gt;.</w:t>
-        <w:br/>
-        <w:t>- **civicdata v0.1.1** - a runtime-foundation release for open-data and transparency publishing support. It ships dataset normalization, data-dictionary drafts, CKAN package metadata drafts, PII/exemption preflight, archive-bundle checklists, publication planning, and a public sample UI at /civicdata. It still does not ship live CKAN publication, BI dashboards, data warehouse storage, autonomous redaction, or external connector runtime, now aligned to `civiccore==0.3.0`. Repo: &lt;https://github.com/CivicSuite/civicdata&gt;.</w:t>
-        <w:br/>
-        <w:t>- **civichr v0.1.1** - a runtime-foundation release for HR policy support. It ships policy lookup outlines, handbook summaries, job-description drafts, classification references, onboarding/training checklists, intake templates, source review, and sensitive-topic preflight. It still does not ship HRIS, payroll, benefits administration, personnel records management, employment-law advice, personnel-file ingestion, live LLM calls, or external HR/payroll connectors, now aligned to `civiccore==0.3.0`. Repo: &lt;https://github.com/CivicSuite/civichr&gt;.</w:t>
-        <w:br/>
-        <w:t>- **civicbudget v0.1.1** - budget narrative and transparency support foundation. Ships line-item variance analysis, budget narrative drafts, department memo drafts, hearing packet checklists, resident summaries, optional GFOA checklist support, and accessible public sample UI at `/civicbudget`. ERP, budgeting system, accounting, payroll, fund accounting, budget adoption, official approvals, live LLM calls, and live finance-system connector runtime are still not shipped, now aligned to `civiccore==0.3.0`. Repo: &lt;https://github.com/CivicSuite/civicbudget&gt;.</w:t>
-        <w:br/>
-        <w:t>- **civiclegal v0.1.1** - internal legal-record research support foundation. Ships privilege-aware corpus filtering, citation-first city-record search, prior-action lookup, attorney-reviewed memo scaffolds, ordinance comparison checklists, litigation-hold candidate flags, authority citation tracking, and accessible public sample UI at `/civiclegal`. Legal advice, Westlaw/Lexis replacement, autonomous legal conclusions, court filing, e-discovery management, live LLM calls, live privileged corpus ingestion, and external legal-system connector runtime are still not shipped, now aligned to `civiccore==0.3.0`. Repo: &lt;https://github.com/CivicSuite/civiclegal&gt;.</w:t>
-        <w:br/>
-        <w:t>- **civicelections v0.1.1** - election administration support foundation. Ships cited voter guidance, candidate filing checklists, worker training Q&amp;A, ballot-summary drafts, campaign-finance summaries, canvass checklists, accessibility review, and accessible public sample UI at `/civicelections`. Voter registration, ballot marking, tabulation, election conduct automation, campaign finance system of record, official certification, live LLM calls, and election-system connector runtime are still not shipped, now aligned to `civiccore==0.3.0`. Repo: &lt;https://github.com/CivicSuite/civicelections&gt;.</w:t>
-      </w:r>
-    </w:p>
-    <w:p>
-      <w:pPr>
-        <w:pStyle w:val="Heading3"/>
-      </w:pPr>
-      <w:r>
-        <w:t>What's planned but not started</w:t>
+        <w:t>- **`CivicRegWatch` and `CivicAPI`** - newly added planned modules. CivicRegWatch is the federal regulatory intelligence module. CivicAPI is the public read-only data gateway over human-approved CivicSuite publication records. Their implementation specs live in [specs/05_civicregwatch.md](specs/05_civicregwatch.md) and [specs/06_civicapi.md](specs/06_civicapi.md).</w:t>
       </w:r>
     </w:p>
     <w:p>
       <w:r>
-        <w:t>- 0 additional modules remain uncreated; all 26 catalog repos now exist. See the [module catalog](specs/01_catalog.md) for scope and planned depth.</w:t>
+        <w:t>Selected foundation modules have also advanced beyond the original `civiccore==0.3.0` baseline. The authoritative truth for each module-to-platform pairing lives in the umbrella compatibility matrix, not in static prose snapshots:</w:t>
       </w:r>
     </w:p>
     <w:p>
       <w:r>
-        <w:t>Every catalog module now has a repo and a version number. Specs still distinguish shipped foundations from planned production-depth behavior.</w:t>
+        <w:t>- Compatibility matrix: [docs/compatibility/index.md](docs/compatibility/index.md)</w:t>
       </w:r>
     </w:p>
     <w:p>
@@ -141,15 +110,61 @@
     </w:p>
     <w:p>
       <w:r>
-        <w:t>- **No vendor lock-in.** You install on your own hardware. If a maintainer disappears, the code is yours. The code license (Apache 2.0) and documentation license (CC BY 4.0) both allow you to fork, modify, and continue using the software indefinitely.</w:t>
+        <w:t>- **No vendor lock-in.** You run the software on your own hardware. If a maintainer disappears, your city still has the code and the right to keep using it.</w:t>
         <w:br/>
-        <w:t>- **No cloud dependency.** Modules are designed to run with no outbound network calls. The default LLM (Gemma 4, served locally via [Ollama](https://ollama.com/)) runs on the city's own machine.</w:t>
+        <w:t>- **No mandatory cloud dependency.** CivicSuite is designed around local-first and sovereign deployment.</w:t>
         <w:br/>
-        <w:t>- **No per-seat billing.** You add as many users as you need at no marginal cost.</w:t>
+        <w:t>- **No per-seat billing.** The licensing model does not meter users.</w:t>
         <w:br/>
-        <w:t>- **You evaluate one module at a time.** Don't install the suite — install records-ai, see if it solves a real problem in your clerk's office, and decide whether to install another module later.</w:t>
+        <w:t>- **Evaluate one module at a time.** A city does not need to adopt the whole suite at once.</w:t>
         <w:br/>
-        <w:t>- **You are responsible for hosting and operations.** This is not a SaaS product. Your IT staff (or a contractor) operates the server. The user manual for each module documents what's required.</w:t>
+        <w:t>- **You still own operations.** This is not a managed SaaS product. Your IT team, or a contractor you choose, is responsible for installation, upgrades, and recovery.</w:t>
+      </w:r>
+    </w:p>
+    <w:p>
+      <w:pPr>
+        <w:pStyle w:val="Heading3"/>
+      </w:pPr>
+      <w:r>
+        <w:t>The current suite tiers</w:t>
+      </w:r>
+    </w:p>
+    <w:p>
+      <w:r>
+        <w:t>| Tier | Count | Meaning today |</w:t>
+        <w:br/>
+        <w:t>|---|---:|---|</w:t>
+        <w:br/>
+        <w:t>| Shipping | 1 of 28 product modules | `civicrecords-ai` is the current production-usable module. |</w:t>
+        <w:br/>
+        <w:t>| Productizing | 1 of 28 product modules | `civicclerk` has real product depth but still needs full app, portal, installer, identity, backup/restore, and live-sync hardening. |</w:t>
+        <w:br/>
+        <w:t>| Foundation / planned | 26 of 28 product modules | The rest of the catalog has real runtime foundations or new implementation specs, but not yet full product depth. |</w:t>
+      </w:r>
+    </w:p>
+    <w:p>
+      <w:pPr>
+        <w:pStyle w:val="Heading3"/>
+      </w:pPr>
+      <w:r>
+        <w:t>Foundation-tier module catalog</w:t>
+      </w:r>
+    </w:p>
+    <w:p>
+      <w:r>
+        <w:t>The rest of the catalog exists as real repositories with released runtime foundations. Their exact current versions and `civiccore` pairings should always be checked in:</w:t>
+      </w:r>
+    </w:p>
+    <w:p>
+      <w:r>
+        <w:t>- [docs/compatibility/index.md](docs/compatibility/index.md)</w:t>
+        <w:br/>
+        <w:t>- [specs/01_catalog.md](specs/01_catalog.md)</w:t>
+      </w:r>
+    </w:p>
+    <w:p>
+      <w:r>
+        <w:t>Each foundation-tier module is explicit about what is shipped and what is still planned. The right mental model is "real foundations, not yet full products."</w:t>
       </w:r>
     </w:p>
     <w:p>
@@ -162,13 +177,13 @@
     </w:p>
     <w:p>
       <w:r>
-        <w:t>- **FOIA** — Freedom of Information Act; the federal and state laws that govern public records requests.</w:t>
+        <w:t>- **FOIA** - Freedom of Information Act and related public-records laws.</w:t>
         <w:br/>
-        <w:t>- **LLM** — Large language model; the AI technology used for things like classifying requests, suggesting redactions, and drafting responses.</w:t>
+        <w:t>- **LLM** - Large language model.</w:t>
         <w:br/>
-        <w:t>- **Open source** — software whose code is published publicly under a license that allows anyone to read, modify, or redistribute it.</w:t>
+        <w:t>- **Open source** - software whose code is publicly available under a license that allows use, modification, and redistribution.</w:t>
         <w:br/>
-        <w:t>- **Sovereign deployment** — software that runs entirely on hardware the city controls, with no required outbound calls to a vendor.</w:t>
+        <w:t>- **Sovereign deployment** - software that runs on infrastructure the city controls.</w:t>
       </w:r>
     </w:p>
     <w:p>
@@ -181,7 +196,7 @@
         <w:pStyle w:val="Heading2"/>
       </w:pPr>
       <w:r>
-        <w:t>Part 2 — For developers and IT staff</w:t>
+        <w:t>Part 2 - For developers and IT staff</w:t>
       </w:r>
     </w:p>
     <w:p>
@@ -189,32 +204,34 @@
         <w:pStyle w:val="Heading3"/>
       </w:pPr>
       <w:r>
-        <w:t>How the umbrella works</w:t>
+        <w:t>What lives in the umbrella repo?</w:t>
       </w:r>
     </w:p>
     <w:p>
       <w:r>
-        <w:t>The `civicsuite` repo (this one) is **documentation-only**. It contains:</w:t>
+        <w:t>The `civicsuite` repo is **documentation-first and coordination-first**. It contains:</w:t>
       </w:r>
     </w:p>
     <w:p>
       <w:r>
-        <w:t>- The [Charter](CHARTER.md) — the project's founding document.</w:t>
+        <w:t>- the [Charter](CHARTER.md)</w:t>
         <w:br/>
-        <w:t>- The [Consistency reference](CONSISTENCY.md) — the audit table of every cross-reference and count, treated as the truth-source.</w:t>
+        <w:t>- the [Continuity plan](SUCCESSION.md)</w:t>
         <w:br/>
-        <w:t>- Specs for the catalog, civiccore extraction, civicclerk, and civiczone in `specs/`.</w:t>
+        <w:t>- the [Compatibility matrix](docs/compatibility/index.md)</w:t>
         <w:br/>
-        <w:t>- ADRs (Architecture Decision Records) under `docs/architecture/`.</w:t>
+        <w:t>- the [Roadmap](docs/roadmap/index.md)</w:t>
         <w:br/>
-        <w:t>- The [compatibility matrix](docs/compatibility/index.md) — which civicrecords-ai version pins to which civiccore version.</w:t>
+        <w:t>- the [Shared extraction consumer rollout playbook](docs/roadmap/shared-extraction-consumer-rollout.md)</w:t>
         <w:br/>
-        <w:t>- The [GitHub Pages landing site](docs/index.html).</w:t>
+        <w:t>- the unified suite specification and module catalog under `docs/` and `specs/`</w:t>
+        <w:br/>
+        <w:t>- suite-level governance and ADRs</w:t>
       </w:r>
     </w:p>
     <w:p>
       <w:r>
-        <w:t>There is no runtime code in this repo. Each module lives in its own repo.</w:t>
+        <w:t>It does **not** contain the runtime code for the individual products.</w:t>
       </w:r>
     </w:p>
     <w:p>
@@ -227,53 +244,37 @@
     </w:p>
     <w:p>
       <w:r>
-        <w:t>| Module | Repo | Status |</w:t>
+        <w:t>| Repo | Status |</w:t>
         <w:br/>
-        <w:t>|---|---|---|</w:t>
+        <w:t>|---|---|</w:t>
         <w:br/>
-        <w:t>| civicrecords-ai | &lt;https://github.com/CivicSuite/civicrecords-ai&gt; | Shipping v1.4.1, aligned to `civiccore==0.3.0`. Transferred to the `CivicSuite` GitHub org on 2026-04-25; this is now the canonical home. |</w:t>
+        <w:t>| `civicrecords-ai` | Shipping `v1.4.3` flagship product |</w:t>
         <w:br/>
-        <w:t>| civiccore | &lt;https://github.com/CivicSuite/civiccore&gt; | Shipping v0.3.0 shared primitives: migrations, db.Base, LLM, audit, provenance, manifests, exports, and city profiles. |</w:t>
+        <w:t>| `civiccore` | Shipping `v0.16.0` shared platform package |</w:t>
         <w:br/>
-        <w:t>| civicclerk | &lt;https://github.com/CivicSuite/civicclerk&gt; | Shipping v0.1.1 runtime foundation with live `/staff` workflow screens for intake, packet export, notice, outcomes, minutes, archive, and connector import. |</w:t>
+        <w:t>| `civicclerk` | Productizing `v0.1.11` second-product candidate |</w:t>
         <w:br/>
-        <w:t>| civiccode | &lt;https://github.com/CivicSuite/civiccode&gt; | Shipping v0.1.1 for municipal-code lookup, citations, local imports, records-ready exports, and `civiccore==0.3.0` alignment. |</w:t>
+        <w:t>| `civicregwatch` | Planned module; spec exists, repo not scaffolded yet |</w:t>
         <w:br/>
-        <w:t>| civiczone | &lt;https://github.com/CivicSuite/civiczone&gt; | Shipping v0.1.1 for parcel-aware zoning samples, public UI foundation, and `civiccore==0.3.0` alignment. |</w:t>
+        <w:t>| `civicapi` | Planned module; spec exists, repo not scaffolded yet |</w:t>
         <w:br/>
-        <w:t>| civicaccess | &lt;https://github.com/CivicSuite/civicaccess&gt; | Shipping v0.1.1 for accessibility review, public UI foundation, and `civiccore==0.3.0` alignment. |</w:t>
+        <w:t>| Remaining catalog repos | Foundation-tier runtime releases with bounded shipped surfaces |</w:t>
+      </w:r>
+    </w:p>
+    <w:p>
+      <w:r>
+        <w:t>Canonical GitHub locations:</w:t>
+      </w:r>
+    </w:p>
+    <w:p>
+      <w:r>
+        <w:t>- CivicSuite org: &lt;https://github.com/CivicSuite&gt;</w:t>
         <w:br/>
-        <w:t>| civicplan | &lt;https://github.com/CivicSuite/civicplan&gt; | Shipping v0.1.1 for cited plan-policy lookup, public UI foundation, and `civiccore==0.3.0` alignment. |</w:t>
+        <w:t>- `civicrecords-ai`: &lt;https://github.com/CivicSuite/civicrecords-ai&gt;</w:t>
         <w:br/>
-        <w:t>| civicpermit | &lt;https://github.com/CivicSuite/civicpermit&gt; | Shipping v0.1.1 for permit requirement lookup, intake-readiness review, public UI foundation, and `civiccore==0.3.0` alignment. |</w:t>
+        <w:t>- `civiccore`: &lt;https://github.com/CivicSuite/civiccore&gt;</w:t>
         <w:br/>
-        <w:t>| civicinspect | &lt;https://github.com/CivicSuite/civicinspect&gt; | Shipping v0.1.1 for repeat-case lookup, report drafts, notice drafts, public UI foundation, and `civiccore==0.3.0` alignment. |</w:t>
-        <w:br/>
-        <w:t>| civicgrants | &lt;https://github.com/CivicSuite/civicgrants&gt; | Shipping v0.1.1 for opportunity triage, eligibility matching, compliance calendars, public UI foundation, and `civiccore==0.3.0` alignment. |</w:t>
-        <w:br/>
-        <w:t>| civicprocure | &lt;https://github.com/CivicSuite/civicprocure&gt; | Shipping v0.1.1 for RFP drafting, proposal comparison, exception extraction, scoring summaries, award-packet checklists, public UI foundation, and `civiccore==0.3.0` alignment. |</w:t>
-        <w:br/>
-        <w:t>| civiccontracts | &lt;https://github.com/CivicSuite/civiccontracts&gt; | Shipping v0.1.1 for contract registry, clause topic lookup, expiration tracking, renewal visibility, public-records exports, public UI foundation, and `civiccore==0.3.0` alignment. |</w:t>
-        <w:br/>
-        <w:t>| civicboards | &lt;https://github.com/CivicSuite/civicboards&gt; | Shipping v0.1.1 runtime foundation for board registry, term tracking, vacancy tracking, attendance review, notice/records exports, public UI foundation, and `civiccore==0.3.0` alignment. |</w:t>
-        <w:br/>
-        <w:t>| civicnotice | &lt;https://github.com/CivicSuite/civicnotice&gt; | Shipping v0.1.1 runtime foundation for notice registry, statutory deadlines, publication-readiness checks, channel planning, notice records exports, public UI foundation, and `civiccore==0.3.0` alignment. |</w:t>
-        <w:br/>
-        <w:t>| civic311 | &lt;https://github.com/CivicSuite/civic311&gt; | Shipping v0.1.1 runtime foundation for request intake, triage suggestions, duplicate-candidate review, department routing, Open311-compatible exports, public UI foundation, and `civiccore==0.3.0` alignment. |</w:t>
-        <w:br/>
-        <w:t>| civiccomms | &lt;https://github.com/CivicSuite/civiccomms&gt; | Shipping v0.1.1 runtime foundation for source-readiness review, meeting summaries, ordinance explainers, newsletters, FAQs, audience variants, and public UI foundation. |</w:t>
-        <w:br/>
-        <w:t>| civicdata | &lt;https://github.com/CivicSuite/civicdata&gt; | Shipping v0.1.1 runtime foundation for dataset normalization, data dictionaries, CKAN metadata drafts, redaction preflight, archive checklists, publication planning, and public UI foundation. |</w:t>
-        <w:br/>
-        <w:t>| civichr | &lt;https://github.com/CivicSuite/civichr&gt; | Shipping v0.1.1 runtime foundation for HR policy lookup, handbook summaries, job descriptions, classification references, onboarding/training checklists, and intake templates. |</w:t>
-        <w:br/>
-        <w:t>| civicbudget | &lt;https://github.com/CivicSuite/civicbudget&gt; | Shipping v0.1.1 runtime foundation for line-item analysis, budget narratives, department memos, hearing packet checklists, resident summaries, and GFOA checklist support. |</w:t>
-        <w:br/>
-        <w:t>| civiclegal | &lt;https://github.com/CivicSuite/civiclegal&gt; | Shipping v0.1.1 runtime foundation for privilege-aware legal-record search, prior-action lookup, memo scaffolds, ordinance comparison, litigation-hold flags, and citation tracking. |</w:t>
-        <w:br/>
-        <w:t>| civicelections | &lt;https://github.com/CivicSuite/civicelections&gt; | Shipping v0.1.1 runtime foundation for voter guidance, filing checklists, worker training, ballot summaries, campaign-finance summaries, canvass checklists, and accessibility review. |</w:t>
-        <w:br/>
-        <w:t>| future module depth | planned per module | Production integrations, connectors, persistence hardening, auth/RBAC, and cross-module workflow depth land through module-specific releases. |</w:t>
+        <w:t>- `civicclerk`: &lt;https://github.com/CivicSuite/civicclerk&gt;</w:t>
       </w:r>
     </w:p>
     <w:p>
@@ -281,16 +282,22 @@
         <w:pStyle w:val="Heading3"/>
       </w:pPr>
       <w:r>
-        <w:t>Dependency direction</w:t>
+        <w:t>Dependency rule</w:t>
       </w:r>
     </w:p>
     <w:p>
       <w:r>
-        <w:t>- Modules depend on civiccore. **Civiccore never depends on a module.**</w:t>
-        <w:br/>
-        <w:t>- This is enforced in CI in the civiccore repo and is documented in the [extraction spec](specs/02_CivicCore.md) section 5.2.</w:t>
-        <w:br/>
-        <w:t>- Modules are pinned to a civiccore version in their package manifest. The compatibility matrix is the truth-source for which pin is required for which module version.</w:t>
+        <w:t>The most important architectural rule in the suite is:</w:t>
+      </w:r>
+    </w:p>
+    <w:p>
+      <w:r>
+        <w:t>**Modules depend on `civiccore`. `civiccore` never depends on modules.**</w:t>
+      </w:r>
+    </w:p>
+    <w:p>
+      <w:r>
+        <w:t>That rule prevents hidden coupling between modules and preserves the promise that cities can deploy products independently.</w:t>
       </w:r>
     </w:p>
     <w:p>
@@ -298,31 +305,34 @@
         <w:pStyle w:val="Heading3"/>
       </w:pPr>
       <w:r>
-        <w:t>How civiccore is consumed</w:t>
+        <w:t>How `civiccore` is consumed</w:t>
       </w:r>
     </w:p>
     <w:p>
       <w:r>
-        <w:t>A module like `civicrecords-ai` declares civiccore as a dependency in its `pyproject.toml`:</w:t>
+        <w:t>Modules consume `civiccore` as a released dependency. The exact form depends on the release state:</w:t>
       </w:r>
     </w:p>
     <w:p>
       <w:r>
-        <w:rPr>
-          <w:rFonts w:ascii="Consolas" w:hAnsi="Consolas"/>
-        </w:rPr>
-        <w:t>dependencies = [</w:t>
+        <w:t>- a published package version when available</w:t>
         <w:br/>
-        <w:t xml:space="preserve">  "civiccore==0.3.0",</w:t>
-        <w:br/>
-        <w:t xml:space="preserve">  ...</w:t>
-        <w:br/>
-        <w:t>]</w:t>
+        <w:t>- a GitHub release wheel when that is the suite's current distribution path</w:t>
       </w:r>
     </w:p>
     <w:p>
       <w:r>
-        <w:t>When a city installs a module, civiccore is pulled in as a wheel. There is no monorepo, no submodule, no vendored copy. The example above reflects the current post-v0.3 consumer state: all catalog module releases now publish v0.1.1 with `civiccore==0.3.0`. Civiccore is published to PyPI (or, until publication, distributed as a release wheel from its GitHub repo).</w:t>
+        <w:t>The exact module-to-platform pairing is tracked in:</w:t>
+      </w:r>
+    </w:p>
+    <w:p>
+      <w:r>
+        <w:t>- [docs/compatibility/index.md](docs/compatibility/index.md)</w:t>
+      </w:r>
+    </w:p>
+    <w:p>
+      <w:r>
+        <w:t>Do not rely on static prose in old documents for version truth when the compatibility matrix is available.</w:t>
       </w:r>
     </w:p>
     <w:p>
@@ -330,20 +340,20 @@
         <w:pStyle w:val="Heading3"/>
       </w:pPr>
       <w:r>
-        <w:t>Evaluating a module</w:t>
+        <w:t>How to evaluate a module</w:t>
       </w:r>
     </w:p>
     <w:p>
       <w:r>
-        <w:t>1. Read the module's `README.md` (start with the front-door pitch).</w:t>
+        <w:t>1. Read the module's `README.md`.</w:t>
         <w:br/>
-        <w:t>2. Read its `USER-MANUAL.md` for a non-technical operations walkthrough.</w:t>
+        <w:t>2. Read the module's `USER-MANUAL.md`.</w:t>
         <w:br/>
-        <w:t>3. Check `CHANGELOG.md` to see release cadence and recent breaking changes.</w:t>
+        <w:t>3. Read the module's `CHANGELOG.md`.</w:t>
         <w:br/>
-        <w:t>4. Spin up a local install following the module's `CONTRIBUTING.md` setup steps. The umbrella does not host setup instructions for individual modules — those live with the module.</w:t>
+        <w:t>4. Follow the module's `CONTRIBUTING.md` install steps on a clean machine.</w:t>
         <w:br/>
-        <w:t>5. If the module's tests pass on a clean clone, the project meets the umbrella's minimum bar.</w:t>
+        <w:t>5. Run the module's verification and test gates.</w:t>
       </w:r>
     </w:p>
     <w:p>
@@ -351,14 +361,33 @@
         <w:pStyle w:val="Heading3"/>
       </w:pPr>
       <w:r>
-        <w:t>Contributing</w:t>
+        <w:t>How releases are coordinated</w:t>
       </w:r>
     </w:p>
     <w:p>
       <w:r>
-        <w:t>- **Suite-wide questions, ADRs, governance, roadmap, compatibility matrix** → contribute here. See [CONTRIBUTING.md](CONTRIBUTING.md).</w:t>
+        <w:t>When shared-platform behavior changes:</w:t>
+      </w:r>
+    </w:p>
+    <w:p>
+      <w:r>
+        <w:t>1. `civiccore` ships first.</w:t>
         <w:br/>
-        <w:t>- **Module bugs, module features, module docs** → contribute on the module's repo. The bug-routing decision tree in CONTRIBUTING.md tells you where each kind of bug goes.</w:t>
+        <w:t>2. Consumer modules adopt the new capability through a bounded rollout.</w:t>
+        <w:br/>
+        <w:t>3. The compatibility matrix is updated.</w:t>
+        <w:br/>
+        <w:t>4. Current-facing docs are updated in both the consumer repo and the umbrella repo when suite-level status changes.</w:t>
+      </w:r>
+    </w:p>
+    <w:p>
+      <w:r>
+        <w:t>The current standardized consumer adoption process lives here:</w:t>
+      </w:r>
+    </w:p>
+    <w:p>
+      <w:r>
+        <w:t>- [docs/roadmap/shared-extraction-consumer-rollout.md](docs/roadmap/shared-extraction-consumer-rollout.md)</w:t>
       </w:r>
     </w:p>
     <w:p>
@@ -366,12 +395,26 @@
         <w:pStyle w:val="Heading3"/>
       </w:pPr>
       <w:r>
-        <w:t>Release coordination</w:t>
+        <w:t>How to contribute</w:t>
       </w:r>
     </w:p>
     <w:p>
       <w:r>
-        <w:t>When a module ships a new version, the compatibility matrix on this umbrella must be updated. Cross-cutting changes (e.g. civiccore breaks an API that records-ai uses) require a paired release: civiccore ships first, then records-ai ships pinned to the new civiccore. The release pairing is documented in the matrix.</w:t>
+        <w:t>- Suite-wide roadmap, governance, compatibility, or umbrella documentation work belongs in this repo.</w:t>
+        <w:br/>
+        <w:t>- Product/module bugs and features belong in the relevant module repo.</w:t>
+      </w:r>
+    </w:p>
+    <w:p>
+      <w:r>
+        <w:t>Start with:</w:t>
+      </w:r>
+    </w:p>
+    <w:p>
+      <w:r>
+        <w:t>- [CONTRIBUTING.md](CONTRIBUTING.md)</w:t>
+        <w:br/>
+        <w:t>- [docs/governance/index.md](docs/governance/index.md)</w:t>
       </w:r>
     </w:p>
     <w:p>
@@ -384,7 +427,7 @@
         <w:pStyle w:val="Heading2"/>
       </w:pPr>
       <w:r>
-        <w:t>Part 3 — Architecture reference</w:t>
+        <w:t>Part 3 - Architecture reference</w:t>
       </w:r>
     </w:p>
     <w:p>
@@ -428,7 +471,7 @@
         <w:pStyle w:val="Heading3"/>
       </w:pPr>
       <w:r>
-        <w:t>Suite topology (textual diagram)</w:t>
+        <w:t>Suite topology</w:t>
       </w:r>
     </w:p>
     <w:p>
@@ -440,9 +483,9 @@
         <w:br/>
         <w:t xml:space="preserve">                        |   civicsuite (umbrella)   |</w:t>
         <w:br/>
-        <w:t xml:space="preserve">                        |   docs, ADRs, governance, |</w:t>
+        <w:t xml:space="preserve">                        |   docs, governance, ADRs, |</w:t>
         <w:br/>
-        <w:t xml:space="preserve">                        |   compatibility matrix    |</w:t>
+        <w:t xml:space="preserve">                        |   compatibility, roadmap  |</w:t>
         <w:br/>
         <w:t xml:space="preserve">                        +-------------+-------------+</w:t>
         <w:br/>
@@ -454,9 +497,9 @@
         <w:br/>
         <w:t xml:space="preserve">                        +---------------------------+</w:t>
         <w:br/>
-        <w:t xml:space="preserve">                        |     civiccore (v0.3.0)    |</w:t>
+        <w:t xml:space="preserve">                        |     civiccore (v0.16.0)   |</w:t>
         <w:br/>
-        <w:t xml:space="preserve">                        |  SHIPPING TODAY:          |</w:t>
+        <w:t xml:space="preserve">                        |  shipping today:          |</w:t>
         <w:br/>
         <w:t xml:space="preserve">                        |  migrations, db.Base, llm |</w:t>
         <w:br/>
@@ -464,21 +507,9 @@
         <w:br/>
         <w:t xml:space="preserve">                        |  manifests, exports,      |</w:t>
         <w:br/>
-        <w:t xml:space="preserve">                        |  city profiles            |</w:t>
+        <w:t xml:space="preserve">                        |  city profiles, auth,     |</w:t>
         <w:br/>
-        <w:t xml:space="preserve">                        |                           |</w:t>
-        <w:br/>
-        <w:t xml:space="preserve">                        |  PLANNED / NOT SHIPPED:   |</w:t>
-        <w:br/>
-        <w:t xml:space="preserve">                        |  auth/RBAC, ingestion,    |</w:t>
-        <w:br/>
-        <w:t xml:space="preserve">                        |  search, notifications,   |</w:t>
-        <w:br/>
-        <w:t xml:space="preserve">                        |  onboarding, exemptions,  |</w:t>
-        <w:br/>
-        <w:t xml:space="preserve">                        |  verification, live       |</w:t>
-        <w:br/>
-        <w:t xml:space="preserve">                        |  connector sync           |</w:t>
+        <w:t xml:space="preserve">                        |  notice compliance        |</w:t>
         <w:br/>
         <w:t xml:space="preserve">                        +-------------+-------------+</w:t>
         <w:br/>
@@ -492,21 +523,13 @@
         <w:br/>
         <w:t xml:space="preserve">   +----------+----------+   +--------+---------+   +---------+--------+</w:t>
         <w:br/>
-        <w:t xml:space="preserve">   | civicrecords-ai     |   |   civicclerk     |   |   civiczone      |</w:t>
+        <w:t xml:space="preserve">   | civicrecords-ai     |   | civicclerk       |   | foundation tier  |</w:t>
         <w:br/>
-        <w:t xml:space="preserve">   |   v1.4.0 SHIPPING   |   | v0.1.0 SHIPPING  |   | v0.1.1 SHIPPING |</w:t>
+        <w:t xml:space="preserve">   | v1.4.3 shipping     |   | v0.1.11          |   | civicaccess ...  |</w:t>
         <w:br/>
-        <w:t xml:space="preserve">   |   FOIA / public     |   |  meetings,       |   |  zoning, parcel  |</w:t>
-        <w:br/>
-        <w:t xml:space="preserve">   |   records mgmt      |   |  agendas, votes  |   |  workflows       |</w:t>
+        <w:t xml:space="preserve">   | FOIA / records      |   | productizing     |   | civiczone        |</w:t>
         <w:br/>
         <w:t xml:space="preserve">   +---------------------+   +------------------+   +------------------+</w:t>
-        <w:br/>
-        <w:t xml:space="preserve">              |</w:t>
-        <w:br/>
-        <w:t xml:space="preserve">              | future modules: civiccode, civiccirculate, ...</w:t>
-        <w:br/>
-        <w:t xml:space="preserve">              | (see specs/01_catalog.md — 26 modules across 7 tiers)</w:t>
       </w:r>
     </w:p>
     <w:p>
@@ -514,12 +537,37 @@
         <w:pStyle w:val="Heading3"/>
       </w:pPr>
       <w:r>
-        <w:t>Dependency rule</w:t>
+        <w:t>Upgrade and migration order</w:t>
       </w:r>
     </w:p>
     <w:p>
       <w:r>
-        <w:t>**Modules import from civiccore. Civiccore never imports from modules.** This is the core architectural constraint of the suite. It is enforced by a lint rule in CI in the civiccore repo. Violating it would silently couple modules to each other through civiccore and destroy the modular install promise.</w:t>
+        <w:t>When `civiccore` ships a backward-compatible change:</w:t>
+      </w:r>
+    </w:p>
+    <w:p>
+      <w:r>
+        <w:t>1. `civiccore` releases the new version.</w:t>
+        <w:br/>
+        <w:t>2. The compatibility matrix is updated.</w:t>
+        <w:br/>
+        <w:t>3. Consumer modules adopt the new version using the standard rollout playbook.</w:t>
+      </w:r>
+    </w:p>
+    <w:p>
+      <w:r>
+        <w:t>When `civiccore` ships a breaking change:</w:t>
+      </w:r>
+    </w:p>
+    <w:p>
+      <w:r>
+        <w:t>1. The change is documented in advance.</w:t>
+        <w:br/>
+        <w:t>2. `civiccore` releases first.</w:t>
+        <w:br/>
+        <w:t>3. Consumers ship paired changes.</w:t>
+        <w:br/>
+        <w:t>4. The compatibility matrix records the new pairing.</w:t>
       </w:r>
     </w:p>
     <w:p>
@@ -527,37 +575,27 @@
         <w:pStyle w:val="Heading3"/>
       </w:pPr>
       <w:r>
-        <w:t>Migration / upgrade order</w:t>
+        <w:t>Continuity and governance</w:t>
       </w:r>
     </w:p>
     <w:p>
       <w:r>
-        <w:t>When civiccore ships a backward-compatible version (PATCH or MINOR):</w:t>
+        <w:t>Continuity is now a gate, not a future aspiration. The current continuity baseline is documented in:</w:t>
       </w:r>
     </w:p>
     <w:p>
       <w:r>
-        <w:t>1. civiccore releases the new version.</w:t>
-        <w:br/>
-        <w:t>2. The umbrella's compatibility matrix is updated.</w:t>
-        <w:br/>
-        <w:t>3. Module maintainers update their pin opportunistically (no forced upgrade).</w:t>
+        <w:t>- [SUCCESSION.md](SUCCESSION.md)</w:t>
       </w:r>
     </w:p>
     <w:p>
       <w:r>
-        <w:t>When civiccore ships a breaking version (MAJOR):</w:t>
+        <w:t>The roadmap that governs the rest of the program lives here:</w:t>
       </w:r>
     </w:p>
     <w:p>
       <w:r>
-        <w:t>1. The breaking change is announced in advance via an ADR.</w:t>
-        <w:br/>
-        <w:t>2. civiccore releases the new MAJOR version.</w:t>
-        <w:br/>
-        <w:t>3. Each module that consumes civiccore ships a paired MAJOR release pinned to the new civiccore version.</w:t>
-        <w:br/>
-        <w:t>4. The compatibility matrix is updated to show both the old (still supported) and new pairing during a transition window.</w:t>
+        <w:t>- [docs/roadmap/index.md](docs/roadmap/index.md)</w:t>
       </w:r>
     </w:p>
     <w:p>
@@ -570,15 +608,15 @@
     </w:p>
     <w:p>
       <w:r>
-        <w:t>- **ADR** — Architecture Decision Record; a short, dated document recording a significant architectural decision and its rationale.</w:t>
+        <w:t>- **ADR** - Architecture Decision Record.</w:t>
         <w:br/>
-        <w:t>- **Pinned version** — a specific exact version a module requires of civiccore (for example `==0.3.0` for current foundation modules, or an older exact pin preserved for historical releases), as opposed to a range.</w:t>
+        <w:t>- **CI** - continuous integration.</w:t>
         <w:br/>
-        <w:t>- **Wheel** — the standard Python package distribution format. civiccore is published as a wheel.</w:t>
+        <w:t>- **Pinned version** - a specific exact dependency pairing rather than a range.</w:t>
         <w:br/>
-        <w:t>- **CI** — continuous integration; the automated test pipeline that runs on every commit and pull request.</w:t>
+        <w:t>- **Wheel** - the Python package distribution format used for released artifacts.</w:t>
         <w:br/>
-        <w:t>- **Monorepo** — a single repository containing multiple projects. CivicSuite is deliberately *not* a monorepo; each module has its own repo so cities can install modules independently.</w:t>
+        <w:t>- **Monorepo** - a single repository containing multiple projects. CivicSuite is deliberately not a monorepo.</w:t>
       </w:r>
     </w:p>
     <w:p>
@@ -591,7 +629,7 @@
         <w:pStyle w:val="Heading2"/>
       </w:pPr>
       <w:r>
-        <w:t>What to do when something goes wrong</w:t>
+        <w:t>When something goes wrong</w:t>
       </w:r>
     </w:p>
     <w:p>
@@ -600,15 +638,15 @@
         <w:br/>
         <w:t>|---|---|</w:t>
         <w:br/>
-        <w:t>| Module won't install | The module's `README.md` and `CONTRIBUTING.md` setup steps. Most install errors are resolved by matching the documented Python/PostgreSQL/Redis versions. |</w:t>
+        <w:t>| Module will not install | The module repo's `README.md` and `CONTRIBUTING.md` |</w:t>
         <w:br/>
-        <w:t>| civiccore pin mismatch | The compatibility matrix at [docs/compatibility/index.md](docs/compatibility/index.md). |</w:t>
+        <w:t>| `civiccore` version mismatch | [docs/compatibility/index.md](docs/compatibility/index.md) |</w:t>
         <w:br/>
-        <w:t>| You found a bug, don't know where to file | The bug-routing decision tree in [CONTRIBUTING.md](CONTRIBUTING.md). |</w:t>
+        <w:t>| Unsure where to file a bug | [CONTRIBUTING.md](CONTRIBUTING.md) |</w:t>
         <w:br/>
-        <w:t>| Security issue | [SECURITY.md](SECURITY.md). |</w:t>
+        <w:t>| Security issue | [SECURITY.md](SECURITY.md) |</w:t>
         <w:br/>
-        <w:t>| You have a general question | [SUPPORT.md](SUPPORT.md). |</w:t>
+        <w:t>| General support question | [SUPPORT.md](SUPPORT.md) |</w:t>
       </w:r>
     </w:p>
     <w:sectPr>

</xml_diff>

<commit_message>
Add CivicAPI and CivicRegWatch planning specs (#71)
* docs: add CivicAPI and CivicRegWatch specs

* fix: split local and published suite verification

---------

Co-authored-by: Scott Converse <scott@civicsuite.local>
</commit_message>
<xml_diff>
--- a/USER-MANUAL.docx
+++ b/USER-MANUAL.docx
@@ -7,26 +7,26 @@
         <w:pStyle w:val="Heading1"/>
       </w:pPr>
       <w:r>
-        <w:t>CivicSuite — User Manual</w:t>
+        <w:t>CivicSuite - User Manual</w:t>
       </w:r>
     </w:p>
     <w:p>
       <w:r>
-        <w:t>This is the orientation manual for the CivicSuite umbrella repo. It is written in three parts so different audiences can read only what's relevant to them:</w:t>
+        <w:t>This is the orientation manual for the CivicSuite umbrella repo. It is written in three parts so different audiences can read only what is relevant to them:</w:t>
       </w:r>
     </w:p>
     <w:p>
       <w:r>
-        <w:t>1. **For municipal decision-makers** — non-technical overview of what CivicSuite is, what's available today, and what the licensing and sovereignty posture means for your city.</w:t>
+        <w:t>1. **For municipal decision-makers** - a non-technical overview of what CivicSuite is, what is available today, and what the sovereignty posture means for your city.</w:t>
         <w:br/>
-        <w:t>2. **For developers and IT staff** — how the umbrella works, where each module lives, and how to evaluate or contribute.</w:t>
+        <w:t>2. **For developers and IT staff** - how the umbrella repo works, where each module lives, and how to evaluate or contribute.</w:t>
         <w:br/>
-        <w:t>3. **Architecture reference** — diagrams and dependency rules.</w:t>
+        <w:t>3. **Architecture reference** - the dependency rules, upgrade model, and suite topology.</w:t>
       </w:r>
     </w:p>
     <w:p>
       <w:r>
-        <w:t>A glossary at the end defines every technical term used.</w:t>
+        <w:t>A glossary at the end defines the technical terms used here.</w:t>
       </w:r>
     </w:p>
     <w:p>
@@ -39,7 +39,7 @@
         <w:pStyle w:val="Heading2"/>
       </w:pPr>
       <w:r>
-        <w:t>Part 1 — For municipal decision-makers</w:t>
+        <w:t>Part 1 - For municipal decision-makers</w:t>
       </w:r>
     </w:p>
     <w:p>
@@ -52,12 +52,23 @@
     </w:p>
     <w:p>
       <w:r>
-        <w:t>CivicSuite is an **open-source product family** for municipal records and civic operations. It's not one program — it's a planned collection of modules a city can install one at a time, on its own hardware, on its own schedule. Cities never have to send data to a vendor's cloud, never pay per user, and can read or modify the source code anytime.</w:t>
+        <w:t>CivicSuite is an **open-source municipal product family**. It is not one giant program. It is a planned collection of modules that a city can install one at a time, on its own hardware, on its own schedule. Cities do not need to send operational data to a vendor cloud, do not pay per seat, and can inspect or modify the source code at any time.</w:t>
       </w:r>
     </w:p>
     <w:p>
       <w:r>
-        <w:t>Today, modules are shipping at different maturity levels: CivicRecords AI is production-usable, CivicCore is the shared platform package, and all 26 catalog modules have runtime-foundation releases. all catalog modules have advanced to v0.1.1 for CivicCore v0.3.0 alignment. We say shipped and planned boundaries plainly below — no roadmap inflation, no vaporware.</w:t>
+        <w:t>The suite is intentionally honest about maturity:</w:t>
+      </w:r>
+    </w:p>
+    <w:p>
+      <w:r>
+        <w:t>- `civicrecords-ai` is the current production-usable shipping product.</w:t>
+        <w:br/>
+        <w:t>- `civicclerk` is the active second-product candidate.</w:t>
+        <w:br/>
+        <w:t>- The rest of the catalog is in the foundation/planned tier: real runtime work or implementation specs, not yet end-to-end products.</w:t>
+        <w:br/>
+        <w:t>- `civiccore` is the shared platform package under all of them.</w:t>
       </w:r>
     </w:p>
     <w:p>
@@ -65,70 +76,28 @@
         <w:pStyle w:val="Heading3"/>
       </w:pPr>
       <w:r>
-        <w:t>What's available today (as of 2026-04-28)</w:t>
+        <w:t>What is available today? (as of 2026-04-30)</w:t>
       </w:r>
     </w:p>
     <w:p>
       <w:r>
-        <w:t>- **civicrecords-ai v1.4.1** — a working, shipping module for managing public records / FOIA requests, now aligned to `civiccore==0.3.0`. Cities can install this today. Repo: &lt;https://github.com/CivicSuite/civicrecords-ai&gt;.</w:t>
+        <w:t>- **`civicrecords-ai v1.4.3`** - the shipping product for public-records and FOIA workflow. Repo: &lt;https://github.com/CivicSuite/civicrecords-ai&gt;</w:t>
         <w:br/>
-        <w:t>- **civiccore v0.3.0** — the shared "platform" package that every module uses. It now ships migrations, the shared SQLAlchemy `Base`, the LLM abstraction, hash-chained audit primitives, source/provenance contracts, offline import/export manifests, export-bundle helpers, and local city profile configuration. It is not a product on its own; you only "install" it as a dependency of a module. Repo: &lt;https://github.com/CivicSuite/civiccore&gt;.</w:t>
+        <w:t>- **`civiccore v0.16.0`** - the shared platform package. It currently ships migrations, the shared SQLAlchemy `Base`, the LLM abstraction layer, audit/provenance primitives, export/manifest helpers, city profiles, auth/RBAC helpers, notice-compliance helpers, onboarding profile helpers, search/access helpers, connector/import helpers, release-evidence helpers, and trusted-header config/proxy enforcement helpers. Repo: &lt;https://github.com/CivicSuite/civiccore&gt;</w:t>
         <w:br/>
-        <w:t>- **civicclerk v0.1.1** — a runtime-foundation release for meetings, agendas, packets, minutes, voting, and sunshine-law compliance. It ships the API/schema foundation, compliance guardrails, and live `/staff` workflow screens for intake, packet assembly/export, notice checklist, meeting outcomes, minutes draft, public archive, and connector import; full database persistence/authentication hardening is still planned. Repo: &lt;https://github.com/CivicSuite/civicclerk&gt;.</w:t>
+        <w:t>- **`civicclerk v0.1.11`** - the productizing second-product candidate for meetings, agendas, packets, minutes, voting, and sunshine-law compliance. It already ships meaningful workflow depth, live `/staff` screens, the first `/public` shell, browser QA gates, connector import surfaces, auth readiness, install rehearsal helpers, release handoff helpers, deployment preflight, and shared `civiccore v0.16.0` reuse. Repo: &lt;https://github.com/CivicSuite/civicclerk&gt;</w:t>
         <w:br/>
-        <w:t>- **civiccode v0.1.1** — a runtime-foundation release for municipal code and ordinance access, now aligned to `civiccore==0.3.0`. It ships source registry, section/version lifecycle, search and permalinks, deterministic citations, citation-grounded Q&amp;A, staff notes, plain-language summaries, CivicClerk handoff intake, resident lookup pages, local import connectors, and records-ready exports. It still does not ship legal advice, live LLM calls, live codifier sync, or automatic ordinance codification. Repo: &lt;https://github.com/CivicSuite/civiccode&gt;.</w:t>
-        <w:br/>
-        <w:t>- **civiczone v0.1.1** — a runtime-foundation release for parcel-aware zoning and land-use Q&amp;A, now aligned to `civiccore==0.3.0`. It ships canonical zoning schema, Alembic migrations, sample parcel and rule lookups, citation-grounded sample Q&amp;A, planner escalation, staff-context samples, and a public sample UI at `/civiczone`. It still does not ship live GIS ingestion, live LLM calls, authentication/RBAC, planner review queues, official zoning determinations, or legal advice. Repo: &lt;https://github.com/CivicSuite/civiczone&gt;.</w:t>
-        <w:br/>
-        <w:t>- **civicaccess v0.1.1** — a runtime-foundation release for accessibility, plain-language, multilingual, and ADA review support, now aligned to `civiccore==0.3.0`. It ships deterministic sample accessibility review, plain-language rewrite, multilingual variant, records-ready export checklist, and a public sample UI at `/civicaccess`. It still does not ship certified ADA compliance, legal advice, live LLM calls, production translation workflows, document ingestion, or suite-wide integration APIs. Repo: &lt;https://github.com/CivicSuite/civicaccess&gt;.</w:t>
-        <w:br/>
-        <w:t>- **civicplan v0.1.1** — a runtime-foundation release for comprehensive-plan policy lookup and cited planning analysis support, now aligned to `civiccore==0.3.0`. It ships deterministic sample plan-policy lookup, policy-consistency support, staff-analysis outline helper, records-ready export checklist, and a public sample UI at `/civicplan`. It still does not ship official planning determinations, legal advice, live GIS, live LLM calls, plan document ingestion, permitting-system integrations, or production staff-review queues. Repo: &lt;https://github.com/CivicSuite/civicplan&gt;.</w:t>
-        <w:br/>
-        <w:t>- **civicpermit v0.1.1** - a runtime-foundation release for permit pre-application and intake-readiness support, now aligned to `civiccore==0.3.0`. It ships deterministic sample permit requirement lookup, intake-readiness review, submittal outline helper, records-ready export checklist, and a public sample UI at `/civicpermit`. It still does not ship permit approvals, legal advice, live GIS, live LLM calls, plan ingestion, production permitting-system integrations, or system-of-record behavior. Repo: &lt;https://github.com/CivicSuite/civicpermit&gt;.</w:t>
-        <w:br/>
-        <w:t>- **civicinspect v0.1.1** - a runtime-foundation release for inspection support, now aligned to `civiccore==0.3.0`. It ships deterministic sample repeat-case lookup, inspector-owned report draft helper, notice draft helper, records-ready export checklist, and a public sample UI at `/civicinspect`. It still does not ship official findings, citations, fines, notices, inspection scheduling, legal advice, live photo analysis, live LLM calls, or system-of-record integrations. Repo: &lt;https://github.com/CivicSuite/civicinspect&gt;.</w:t>
-        <w:br/>
-        <w:t>- **civicgrants v0.1.1** - a runtime-foundation release for grant opportunity and compliance support, now aligned to `civiccore==0.3.0`. It ships deterministic sample opportunity triage, eligibility-factor matching, application outline helper, compliance calendar helper, audit-ready export checklist, and a public sample UI at `/civicgrants`. It still does not ship live funder feeds, official eligibility decisions, legal advice, live LLM calls, submission portals, or grant system-of-record integrations. Repo: &lt;https://github.com/CivicSuite/civicgrants&gt;.</w:t>
-        <w:br/>
-        <w:t>- **civicprocure v0.1.1** — a runtime-foundation release for procurement drafting and award-packet support, now aligned to `civiccore==0.3.0`. It ships deterministic sample RFP drafting, proposal comparison, exception extraction, scoring summary helper, award-packet checklist, and a public sample UI at `/civicprocure`. It still does not ship live vendor portals, official vendor evaluation decisions, legal advice, live LLM calls, e-procurement submission portals, or procurement system-of-record integrations. Repo: &lt;https://github.com/CivicSuite/civicprocure&gt;.</w:t>
-        <w:br/>
-        <w:t>- **civiccontracts v0.1.1** - a runtime-foundation release for contract repository and renewal visibility support, now aligned to `civiccore==0.3.0`. It ships deterministic sample contract registry, clause topic lookup, expiration tracking, renewal visibility, public-records export checklist, and a public sample UI at `/civiccontracts`. It still does not ship live contract management platforms, official legal interpretation, legal advice, renewal approvals, contract execution workflows, live LLM calls, or contract system-of-record integrations. Repo: &lt;https://github.com/CivicSuite/civiccontracts&gt;.</w:t>
-        <w:br/>
-        <w:t>- **civicboards v0.1.1** - a runtime-foundation release for board and commission administration, now aligned to `civiccore==0.3.0`. It ships deterministic sample board registry, term review plans, vacancy checklists, attendance summaries, notice/records export checklist, and a public sample UI at `/civicboards`. It still does not ship live agenda systems, appointment decisions, legal advice, official notice publication, meeting system write-back, live LLM calls, or board system-of-record integrations. Repo: &lt;https://github.com/CivicSuite/civicboards&gt;.</w:t>
-        <w:br/>
-        <w:t>- **civicnotice v0.1.1** - a runtime-foundation release for public notice compliance support, now aligned to `civiccore==0.3.0`. It ships deterministic sample notice registry, statutory deadline plans, publication-readiness checklists, channel planning, notice/records export checklist, and a public sample UI at /civicnotice. It still does not ship legal sufficiency decisions, legal advice, live LLM calls, official notice publication, publication-system write-back, or notice system-of-record integrations. Repo: &lt;https://github.com/CivicSuite/civicnotice&gt;.</w:t>
-        <w:br/>
-        <w:t>- **civic311 v0.1.1** - a runtime-foundation release for resident service request support, now aligned to `civiccore==0.3.0`. It ships deterministic sample request intake, triage suggestions, duplicate-candidate review, department routing checklists, Open311-compatible export helper, and a public sample UI at /civic311. It still does not ship official dispatch, work-order creation, emergency response, legal advice, live LLM calls, 311 system write-back, or 311 system-of-record integrations. Repo: &lt;https://github.com/CivicSuite/civic311&gt;.</w:t>
-        <w:br/>
-        <w:t>- **civiccomms v0.1.1** - a runtime-foundation release for public communications support. It ships source-readiness review, meeting summary drafts, ordinance explainers, newsletter scaffolds, FAQ prompts, audience-variant drafts, and a public sample UI at /civiccomms. It still does not ship autonomous publication, campaign or advocacy content, legal advice, certified translation, live LLM calls, social media posting, or communications system-of-record integrations, now aligned to `civiccore==0.3.0`. Repo: &lt;https://github.com/CivicSuite/civiccomms&gt;.</w:t>
-        <w:br/>
-        <w:t>- **civicdata v0.1.1** - a runtime-foundation release for open-data and transparency publishing support. It ships dataset normalization, data-dictionary drafts, CKAN package metadata drafts, PII/exemption preflight, archive-bundle checklists, publication planning, and a public sample UI at /civicdata. It still does not ship live CKAN publication, BI dashboards, data warehouse storage, autonomous redaction, or external connector runtime, now aligned to `civiccore==0.3.0`. Repo: &lt;https://github.com/CivicSuite/civicdata&gt;.</w:t>
-        <w:br/>
-        <w:t>- **civichr v0.1.1** - a runtime-foundation release for HR policy support. It ships policy lookup outlines, handbook summaries, job-description drafts, classification references, onboarding/training checklists, intake templates, source review, and sensitive-topic preflight. It still does not ship HRIS, payroll, benefits administration, personnel records management, employment-law advice, personnel-file ingestion, live LLM calls, or external HR/payroll connectors, now aligned to `civiccore==0.3.0`. Repo: &lt;https://github.com/CivicSuite/civichr&gt;.</w:t>
-        <w:br/>
-        <w:t>- **civicbudget v0.1.1** - budget narrative and transparency support foundation. Ships line-item variance analysis, budget narrative drafts, department memo drafts, hearing packet checklists, resident summaries, optional GFOA checklist support, and accessible public sample UI at `/civicbudget`. ERP, budgeting system, accounting, payroll, fund accounting, budget adoption, official approvals, live LLM calls, and live finance-system connector runtime are still not shipped, now aligned to `civiccore==0.3.0`. Repo: &lt;https://github.com/CivicSuite/civicbudget&gt;.</w:t>
-        <w:br/>
-        <w:t>- **civiclegal v0.1.1** - internal legal-record research support foundation. Ships privilege-aware corpus filtering, citation-first city-record search, prior-action lookup, attorney-reviewed memo scaffolds, ordinance comparison checklists, litigation-hold candidate flags, authority citation tracking, and accessible public sample UI at `/civiclegal`. Legal advice, Westlaw/Lexis replacement, autonomous legal conclusions, court filing, e-discovery management, live LLM calls, live privileged corpus ingestion, and external legal-system connector runtime are still not shipped, now aligned to `civiccore==0.3.0`. Repo: &lt;https://github.com/CivicSuite/civiclegal&gt;.</w:t>
-        <w:br/>
-        <w:t>- **civicelections v0.1.1** - election administration support foundation. Ships cited voter guidance, candidate filing checklists, worker training Q&amp;A, ballot-summary drafts, campaign-finance summaries, canvass checklists, accessibility review, and accessible public sample UI at `/civicelections`. Voter registration, ballot marking, tabulation, election conduct automation, campaign finance system of record, official certification, live LLM calls, and election-system connector runtime are still not shipped, now aligned to `civiccore==0.3.0`. Repo: &lt;https://github.com/CivicSuite/civicelections&gt;.</w:t>
-      </w:r>
-    </w:p>
-    <w:p>
-      <w:pPr>
-        <w:pStyle w:val="Heading3"/>
-      </w:pPr>
-      <w:r>
-        <w:t>What's planned but not started</w:t>
+        <w:t>- **`CivicRegWatch` and `CivicAPI`** - newly added planned modules. CivicRegWatch is the federal regulatory intelligence module. CivicAPI is the public read-only data gateway over human-approved CivicSuite publication records. Their implementation specs live in [specs/05_civicregwatch.md](specs/05_civicregwatch.md) and [specs/06_civicapi.md](specs/06_civicapi.md).</w:t>
       </w:r>
     </w:p>
     <w:p>
       <w:r>
-        <w:t>- 0 additional modules remain uncreated; all 26 catalog repos now exist. See the [module catalog](specs/01_catalog.md) for scope and planned depth.</w:t>
+        <w:t>Selected foundation modules have also advanced beyond the original `civiccore==0.3.0` baseline. The authoritative truth for each module-to-platform pairing lives in the umbrella compatibility matrix, not in static prose snapshots:</w:t>
       </w:r>
     </w:p>
     <w:p>
       <w:r>
-        <w:t>Every catalog module now has a repo and a version number. Specs still distinguish shipped foundations from planned production-depth behavior.</w:t>
+        <w:t>- Compatibility matrix: [docs/compatibility/index.md](docs/compatibility/index.md)</w:t>
       </w:r>
     </w:p>
     <w:p>
@@ -141,15 +110,61 @@
     </w:p>
     <w:p>
       <w:r>
-        <w:t>- **No vendor lock-in.** You install on your own hardware. If a maintainer disappears, the code is yours. The code license (Apache 2.0) and documentation license (CC BY 4.0) both allow you to fork, modify, and continue using the software indefinitely.</w:t>
+        <w:t>- **No vendor lock-in.** You run the software on your own hardware. If a maintainer disappears, your city still has the code and the right to keep using it.</w:t>
         <w:br/>
-        <w:t>- **No cloud dependency.** Modules are designed to run with no outbound network calls. The default LLM (Gemma 4, served locally via [Ollama](https://ollama.com/)) runs on the city's own machine.</w:t>
+        <w:t>- **No mandatory cloud dependency.** CivicSuite is designed around local-first and sovereign deployment.</w:t>
         <w:br/>
-        <w:t>- **No per-seat billing.** You add as many users as you need at no marginal cost.</w:t>
+        <w:t>- **No per-seat billing.** The licensing model does not meter users.</w:t>
         <w:br/>
-        <w:t>- **You evaluate one module at a time.** Don't install the suite — install records-ai, see if it solves a real problem in your clerk's office, and decide whether to install another module later.</w:t>
+        <w:t>- **Evaluate one module at a time.** A city does not need to adopt the whole suite at once.</w:t>
         <w:br/>
-        <w:t>- **You are responsible for hosting and operations.** This is not a SaaS product. Your IT staff (or a contractor) operates the server. The user manual for each module documents what's required.</w:t>
+        <w:t>- **You still own operations.** This is not a managed SaaS product. Your IT team, or a contractor you choose, is responsible for installation, upgrades, and recovery.</w:t>
+      </w:r>
+    </w:p>
+    <w:p>
+      <w:pPr>
+        <w:pStyle w:val="Heading3"/>
+      </w:pPr>
+      <w:r>
+        <w:t>The current suite tiers</w:t>
+      </w:r>
+    </w:p>
+    <w:p>
+      <w:r>
+        <w:t>| Tier | Count | Meaning today |</w:t>
+        <w:br/>
+        <w:t>|---|---:|---|</w:t>
+        <w:br/>
+        <w:t>| Shipping | 1 of 28 product modules | `civicrecords-ai` is the current production-usable module. |</w:t>
+        <w:br/>
+        <w:t>| Productizing | 1 of 28 product modules | `civicclerk` has real product depth but still needs full app, portal, installer, identity, backup/restore, and live-sync hardening. |</w:t>
+        <w:br/>
+        <w:t>| Foundation / planned | 26 of 28 product modules | The rest of the catalog has real runtime foundations or new implementation specs, but not yet full product depth. |</w:t>
+      </w:r>
+    </w:p>
+    <w:p>
+      <w:pPr>
+        <w:pStyle w:val="Heading3"/>
+      </w:pPr>
+      <w:r>
+        <w:t>Foundation-tier module catalog</w:t>
+      </w:r>
+    </w:p>
+    <w:p>
+      <w:r>
+        <w:t>The rest of the catalog exists as real repositories with released runtime foundations. Their exact current versions and `civiccore` pairings should always be checked in:</w:t>
+      </w:r>
+    </w:p>
+    <w:p>
+      <w:r>
+        <w:t>- [docs/compatibility/index.md](docs/compatibility/index.md)</w:t>
+        <w:br/>
+        <w:t>- [specs/01_catalog.md](specs/01_catalog.md)</w:t>
+      </w:r>
+    </w:p>
+    <w:p>
+      <w:r>
+        <w:t>Each foundation-tier module is explicit about what is shipped and what is still planned. The right mental model is "real foundations, not yet full products."</w:t>
       </w:r>
     </w:p>
     <w:p>
@@ -162,13 +177,13 @@
     </w:p>
     <w:p>
       <w:r>
-        <w:t>- **FOIA** — Freedom of Information Act; the federal and state laws that govern public records requests.</w:t>
+        <w:t>- **FOIA** - Freedom of Information Act and related public-records laws.</w:t>
         <w:br/>
-        <w:t>- **LLM** — Large language model; the AI technology used for things like classifying requests, suggesting redactions, and drafting responses.</w:t>
+        <w:t>- **LLM** - Large language model.</w:t>
         <w:br/>
-        <w:t>- **Open source** — software whose code is published publicly under a license that allows anyone to read, modify, or redistribute it.</w:t>
+        <w:t>- **Open source** - software whose code is publicly available under a license that allows use, modification, and redistribution.</w:t>
         <w:br/>
-        <w:t>- **Sovereign deployment** — software that runs entirely on hardware the city controls, with no required outbound calls to a vendor.</w:t>
+        <w:t>- **Sovereign deployment** - software that runs on infrastructure the city controls.</w:t>
       </w:r>
     </w:p>
     <w:p>
@@ -181,7 +196,7 @@
         <w:pStyle w:val="Heading2"/>
       </w:pPr>
       <w:r>
-        <w:t>Part 2 — For developers and IT staff</w:t>
+        <w:t>Part 2 - For developers and IT staff</w:t>
       </w:r>
     </w:p>
     <w:p>
@@ -189,32 +204,34 @@
         <w:pStyle w:val="Heading3"/>
       </w:pPr>
       <w:r>
-        <w:t>How the umbrella works</w:t>
+        <w:t>What lives in the umbrella repo?</w:t>
       </w:r>
     </w:p>
     <w:p>
       <w:r>
-        <w:t>The `civicsuite` repo (this one) is **documentation-only**. It contains:</w:t>
+        <w:t>The `civicsuite` repo is **documentation-first and coordination-first**. It contains:</w:t>
       </w:r>
     </w:p>
     <w:p>
       <w:r>
-        <w:t>- The [Charter](CHARTER.md) — the project's founding document.</w:t>
+        <w:t>- the [Charter](CHARTER.md)</w:t>
         <w:br/>
-        <w:t>- The [Consistency reference](CONSISTENCY.md) — the audit table of every cross-reference and count, treated as the truth-source.</w:t>
+        <w:t>- the [Continuity plan](SUCCESSION.md)</w:t>
         <w:br/>
-        <w:t>- Specs for the catalog, civiccore extraction, civicclerk, and civiczone in `specs/`.</w:t>
+        <w:t>- the [Compatibility matrix](docs/compatibility/index.md)</w:t>
         <w:br/>
-        <w:t>- ADRs (Architecture Decision Records) under `docs/architecture/`.</w:t>
+        <w:t>- the [Roadmap](docs/roadmap/index.md)</w:t>
         <w:br/>
-        <w:t>- The [compatibility matrix](docs/compatibility/index.md) — which civicrecords-ai version pins to which civiccore version.</w:t>
+        <w:t>- the [Shared extraction consumer rollout playbook](docs/roadmap/shared-extraction-consumer-rollout.md)</w:t>
         <w:br/>
-        <w:t>- The [GitHub Pages landing site](docs/index.html).</w:t>
+        <w:t>- the unified suite specification and module catalog under `docs/` and `specs/`</w:t>
+        <w:br/>
+        <w:t>- suite-level governance and ADRs</w:t>
       </w:r>
     </w:p>
     <w:p>
       <w:r>
-        <w:t>There is no runtime code in this repo. Each module lives in its own repo.</w:t>
+        <w:t>It does **not** contain the runtime code for the individual products.</w:t>
       </w:r>
     </w:p>
     <w:p>
@@ -227,53 +244,37 @@
     </w:p>
     <w:p>
       <w:r>
-        <w:t>| Module | Repo | Status |</w:t>
+        <w:t>| Repo | Status |</w:t>
         <w:br/>
-        <w:t>|---|---|---|</w:t>
+        <w:t>|---|---|</w:t>
         <w:br/>
-        <w:t>| civicrecords-ai | &lt;https://github.com/CivicSuite/civicrecords-ai&gt; | Shipping v1.4.1, aligned to `civiccore==0.3.0`. Transferred to the `CivicSuite` GitHub org on 2026-04-25; this is now the canonical home. |</w:t>
+        <w:t>| `civicrecords-ai` | Shipping `v1.4.3` flagship product |</w:t>
         <w:br/>
-        <w:t>| civiccore | &lt;https://github.com/CivicSuite/civiccore&gt; | Shipping v0.3.0 shared primitives: migrations, db.Base, LLM, audit, provenance, manifests, exports, and city profiles. |</w:t>
+        <w:t>| `civiccore` | Shipping `v0.16.0` shared platform package |</w:t>
         <w:br/>
-        <w:t>| civicclerk | &lt;https://github.com/CivicSuite/civicclerk&gt; | Shipping v0.1.1 runtime foundation with live `/staff` workflow screens for intake, packet export, notice, outcomes, minutes, archive, and connector import. |</w:t>
+        <w:t>| `civicclerk` | Productizing `v0.1.11` second-product candidate |</w:t>
         <w:br/>
-        <w:t>| civiccode | &lt;https://github.com/CivicSuite/civiccode&gt; | Shipping v0.1.1 for municipal-code lookup, citations, local imports, records-ready exports, and `civiccore==0.3.0` alignment. |</w:t>
+        <w:t>| `civicregwatch` | Planned module; spec exists, repo not scaffolded yet |</w:t>
         <w:br/>
-        <w:t>| civiczone | &lt;https://github.com/CivicSuite/civiczone&gt; | Shipping v0.1.1 for parcel-aware zoning samples, public UI foundation, and `civiccore==0.3.0` alignment. |</w:t>
+        <w:t>| `civicapi` | Planned module; spec exists, repo not scaffolded yet |</w:t>
         <w:br/>
-        <w:t>| civicaccess | &lt;https://github.com/CivicSuite/civicaccess&gt; | Shipping v0.1.1 for accessibility review, public UI foundation, and `civiccore==0.3.0` alignment. |</w:t>
+        <w:t>| Remaining catalog repos | Foundation-tier runtime releases with bounded shipped surfaces |</w:t>
+      </w:r>
+    </w:p>
+    <w:p>
+      <w:r>
+        <w:t>Canonical GitHub locations:</w:t>
+      </w:r>
+    </w:p>
+    <w:p>
+      <w:r>
+        <w:t>- CivicSuite org: &lt;https://github.com/CivicSuite&gt;</w:t>
         <w:br/>
-        <w:t>| civicplan | &lt;https://github.com/CivicSuite/civicplan&gt; | Shipping v0.1.1 for cited plan-policy lookup, public UI foundation, and `civiccore==0.3.0` alignment. |</w:t>
+        <w:t>- `civicrecords-ai`: &lt;https://github.com/CivicSuite/civicrecords-ai&gt;</w:t>
         <w:br/>
-        <w:t>| civicpermit | &lt;https://github.com/CivicSuite/civicpermit&gt; | Shipping v0.1.1 for permit requirement lookup, intake-readiness review, public UI foundation, and `civiccore==0.3.0` alignment. |</w:t>
+        <w:t>- `civiccore`: &lt;https://github.com/CivicSuite/civiccore&gt;</w:t>
         <w:br/>
-        <w:t>| civicinspect | &lt;https://github.com/CivicSuite/civicinspect&gt; | Shipping v0.1.1 for repeat-case lookup, report drafts, notice drafts, public UI foundation, and `civiccore==0.3.0` alignment. |</w:t>
-        <w:br/>
-        <w:t>| civicgrants | &lt;https://github.com/CivicSuite/civicgrants&gt; | Shipping v0.1.1 for opportunity triage, eligibility matching, compliance calendars, public UI foundation, and `civiccore==0.3.0` alignment. |</w:t>
-        <w:br/>
-        <w:t>| civicprocure | &lt;https://github.com/CivicSuite/civicprocure&gt; | Shipping v0.1.1 for RFP drafting, proposal comparison, exception extraction, scoring summaries, award-packet checklists, public UI foundation, and `civiccore==0.3.0` alignment. |</w:t>
-        <w:br/>
-        <w:t>| civiccontracts | &lt;https://github.com/CivicSuite/civiccontracts&gt; | Shipping v0.1.1 for contract registry, clause topic lookup, expiration tracking, renewal visibility, public-records exports, public UI foundation, and `civiccore==0.3.0` alignment. |</w:t>
-        <w:br/>
-        <w:t>| civicboards | &lt;https://github.com/CivicSuite/civicboards&gt; | Shipping v0.1.1 runtime foundation for board registry, term tracking, vacancy tracking, attendance review, notice/records exports, public UI foundation, and `civiccore==0.3.0` alignment. |</w:t>
-        <w:br/>
-        <w:t>| civicnotice | &lt;https://github.com/CivicSuite/civicnotice&gt; | Shipping v0.1.1 runtime foundation for notice registry, statutory deadlines, publication-readiness checks, channel planning, notice records exports, public UI foundation, and `civiccore==0.3.0` alignment. |</w:t>
-        <w:br/>
-        <w:t>| civic311 | &lt;https://github.com/CivicSuite/civic311&gt; | Shipping v0.1.1 runtime foundation for request intake, triage suggestions, duplicate-candidate review, department routing, Open311-compatible exports, public UI foundation, and `civiccore==0.3.0` alignment. |</w:t>
-        <w:br/>
-        <w:t>| civiccomms | &lt;https://github.com/CivicSuite/civiccomms&gt; | Shipping v0.1.1 runtime foundation for source-readiness review, meeting summaries, ordinance explainers, newsletters, FAQs, audience variants, and public UI foundation. |</w:t>
-        <w:br/>
-        <w:t>| civicdata | &lt;https://github.com/CivicSuite/civicdata&gt; | Shipping v0.1.1 runtime foundation for dataset normalization, data dictionaries, CKAN metadata drafts, redaction preflight, archive checklists, publication planning, and public UI foundation. |</w:t>
-        <w:br/>
-        <w:t>| civichr | &lt;https://github.com/CivicSuite/civichr&gt; | Shipping v0.1.1 runtime foundation for HR policy lookup, handbook summaries, job descriptions, classification references, onboarding/training checklists, and intake templates. |</w:t>
-        <w:br/>
-        <w:t>| civicbudget | &lt;https://github.com/CivicSuite/civicbudget&gt; | Shipping v0.1.1 runtime foundation for line-item analysis, budget narratives, department memos, hearing packet checklists, resident summaries, and GFOA checklist support. |</w:t>
-        <w:br/>
-        <w:t>| civiclegal | &lt;https://github.com/CivicSuite/civiclegal&gt; | Shipping v0.1.1 runtime foundation for privilege-aware legal-record search, prior-action lookup, memo scaffolds, ordinance comparison, litigation-hold flags, and citation tracking. |</w:t>
-        <w:br/>
-        <w:t>| civicelections | &lt;https://github.com/CivicSuite/civicelections&gt; | Shipping v0.1.1 runtime foundation for voter guidance, filing checklists, worker training, ballot summaries, campaign-finance summaries, canvass checklists, and accessibility review. |</w:t>
-        <w:br/>
-        <w:t>| future module depth | planned per module | Production integrations, connectors, persistence hardening, auth/RBAC, and cross-module workflow depth land through module-specific releases. |</w:t>
+        <w:t>- `civicclerk`: &lt;https://github.com/CivicSuite/civicclerk&gt;</w:t>
       </w:r>
     </w:p>
     <w:p>
@@ -281,16 +282,22 @@
         <w:pStyle w:val="Heading3"/>
       </w:pPr>
       <w:r>
-        <w:t>Dependency direction</w:t>
+        <w:t>Dependency rule</w:t>
       </w:r>
     </w:p>
     <w:p>
       <w:r>
-        <w:t>- Modules depend on civiccore. **Civiccore never depends on a module.**</w:t>
-        <w:br/>
-        <w:t>- This is enforced in CI in the civiccore repo and is documented in the [extraction spec](specs/02_CivicCore.md) section 5.2.</w:t>
-        <w:br/>
-        <w:t>- Modules are pinned to a civiccore version in their package manifest. The compatibility matrix is the truth-source for which pin is required for which module version.</w:t>
+        <w:t>The most important architectural rule in the suite is:</w:t>
+      </w:r>
+    </w:p>
+    <w:p>
+      <w:r>
+        <w:t>**Modules depend on `civiccore`. `civiccore` never depends on modules.**</w:t>
+      </w:r>
+    </w:p>
+    <w:p>
+      <w:r>
+        <w:t>That rule prevents hidden coupling between modules and preserves the promise that cities can deploy products independently.</w:t>
       </w:r>
     </w:p>
     <w:p>
@@ -298,31 +305,34 @@
         <w:pStyle w:val="Heading3"/>
       </w:pPr>
       <w:r>
-        <w:t>How civiccore is consumed</w:t>
+        <w:t>How `civiccore` is consumed</w:t>
       </w:r>
     </w:p>
     <w:p>
       <w:r>
-        <w:t>A module like `civicrecords-ai` declares civiccore as a dependency in its `pyproject.toml`:</w:t>
+        <w:t>Modules consume `civiccore` as a released dependency. The exact form depends on the release state:</w:t>
       </w:r>
     </w:p>
     <w:p>
       <w:r>
-        <w:rPr>
-          <w:rFonts w:ascii="Consolas" w:hAnsi="Consolas"/>
-        </w:rPr>
-        <w:t>dependencies = [</w:t>
+        <w:t>- a published package version when available</w:t>
         <w:br/>
-        <w:t xml:space="preserve">  "civiccore==0.3.0",</w:t>
-        <w:br/>
-        <w:t xml:space="preserve">  ...</w:t>
-        <w:br/>
-        <w:t>]</w:t>
+        <w:t>- a GitHub release wheel when that is the suite's current distribution path</w:t>
       </w:r>
     </w:p>
     <w:p>
       <w:r>
-        <w:t>When a city installs a module, civiccore is pulled in as a wheel. There is no monorepo, no submodule, no vendored copy. The example above reflects the current post-v0.3 consumer state: all catalog module releases now publish v0.1.1 with `civiccore==0.3.0`. Civiccore is published to PyPI (or, until publication, distributed as a release wheel from its GitHub repo).</w:t>
+        <w:t>The exact module-to-platform pairing is tracked in:</w:t>
+      </w:r>
+    </w:p>
+    <w:p>
+      <w:r>
+        <w:t>- [docs/compatibility/index.md](docs/compatibility/index.md)</w:t>
+      </w:r>
+    </w:p>
+    <w:p>
+      <w:r>
+        <w:t>Do not rely on static prose in old documents for version truth when the compatibility matrix is available.</w:t>
       </w:r>
     </w:p>
     <w:p>
@@ -330,20 +340,20 @@
         <w:pStyle w:val="Heading3"/>
       </w:pPr>
       <w:r>
-        <w:t>Evaluating a module</w:t>
+        <w:t>How to evaluate a module</w:t>
       </w:r>
     </w:p>
     <w:p>
       <w:r>
-        <w:t>1. Read the module's `README.md` (start with the front-door pitch).</w:t>
+        <w:t>1. Read the module's `README.md`.</w:t>
         <w:br/>
-        <w:t>2. Read its `USER-MANUAL.md` for a non-technical operations walkthrough.</w:t>
+        <w:t>2. Read the module's `USER-MANUAL.md`.</w:t>
         <w:br/>
-        <w:t>3. Check `CHANGELOG.md` to see release cadence and recent breaking changes.</w:t>
+        <w:t>3. Read the module's `CHANGELOG.md`.</w:t>
         <w:br/>
-        <w:t>4. Spin up a local install following the module's `CONTRIBUTING.md` setup steps. The umbrella does not host setup instructions for individual modules — those live with the module.</w:t>
+        <w:t>4. Follow the module's `CONTRIBUTING.md` install steps on a clean machine.</w:t>
         <w:br/>
-        <w:t>5. If the module's tests pass on a clean clone, the project meets the umbrella's minimum bar.</w:t>
+        <w:t>5. Run the module's verification and test gates.</w:t>
       </w:r>
     </w:p>
     <w:p>
@@ -351,14 +361,33 @@
         <w:pStyle w:val="Heading3"/>
       </w:pPr>
       <w:r>
-        <w:t>Contributing</w:t>
+        <w:t>How releases are coordinated</w:t>
       </w:r>
     </w:p>
     <w:p>
       <w:r>
-        <w:t>- **Suite-wide questions, ADRs, governance, roadmap, compatibility matrix** → contribute here. See [CONTRIBUTING.md](CONTRIBUTING.md).</w:t>
+        <w:t>When shared-platform behavior changes:</w:t>
+      </w:r>
+    </w:p>
+    <w:p>
+      <w:r>
+        <w:t>1. `civiccore` ships first.</w:t>
         <w:br/>
-        <w:t>- **Module bugs, module features, module docs** → contribute on the module's repo. The bug-routing decision tree in CONTRIBUTING.md tells you where each kind of bug goes.</w:t>
+        <w:t>2. Consumer modules adopt the new capability through a bounded rollout.</w:t>
+        <w:br/>
+        <w:t>3. The compatibility matrix is updated.</w:t>
+        <w:br/>
+        <w:t>4. Current-facing docs are updated in both the consumer repo and the umbrella repo when suite-level status changes.</w:t>
+      </w:r>
+    </w:p>
+    <w:p>
+      <w:r>
+        <w:t>The current standardized consumer adoption process lives here:</w:t>
+      </w:r>
+    </w:p>
+    <w:p>
+      <w:r>
+        <w:t>- [docs/roadmap/shared-extraction-consumer-rollout.md](docs/roadmap/shared-extraction-consumer-rollout.md)</w:t>
       </w:r>
     </w:p>
     <w:p>
@@ -366,12 +395,26 @@
         <w:pStyle w:val="Heading3"/>
       </w:pPr>
       <w:r>
-        <w:t>Release coordination</w:t>
+        <w:t>How to contribute</w:t>
       </w:r>
     </w:p>
     <w:p>
       <w:r>
-        <w:t>When a module ships a new version, the compatibility matrix on this umbrella must be updated. Cross-cutting changes (e.g. civiccore breaks an API that records-ai uses) require a paired release: civiccore ships first, then records-ai ships pinned to the new civiccore. The release pairing is documented in the matrix.</w:t>
+        <w:t>- Suite-wide roadmap, governance, compatibility, or umbrella documentation work belongs in this repo.</w:t>
+        <w:br/>
+        <w:t>- Product/module bugs and features belong in the relevant module repo.</w:t>
+      </w:r>
+    </w:p>
+    <w:p>
+      <w:r>
+        <w:t>Start with:</w:t>
+      </w:r>
+    </w:p>
+    <w:p>
+      <w:r>
+        <w:t>- [CONTRIBUTING.md](CONTRIBUTING.md)</w:t>
+        <w:br/>
+        <w:t>- [docs/governance/index.md](docs/governance/index.md)</w:t>
       </w:r>
     </w:p>
     <w:p>
@@ -384,7 +427,7 @@
         <w:pStyle w:val="Heading2"/>
       </w:pPr>
       <w:r>
-        <w:t>Part 3 — Architecture reference</w:t>
+        <w:t>Part 3 - Architecture reference</w:t>
       </w:r>
     </w:p>
     <w:p>
@@ -428,7 +471,7 @@
         <w:pStyle w:val="Heading3"/>
       </w:pPr>
       <w:r>
-        <w:t>Suite topology (textual diagram)</w:t>
+        <w:t>Suite topology</w:t>
       </w:r>
     </w:p>
     <w:p>
@@ -440,9 +483,9 @@
         <w:br/>
         <w:t xml:space="preserve">                        |   civicsuite (umbrella)   |</w:t>
         <w:br/>
-        <w:t xml:space="preserve">                        |   docs, ADRs, governance, |</w:t>
+        <w:t xml:space="preserve">                        |   docs, governance, ADRs, |</w:t>
         <w:br/>
-        <w:t xml:space="preserve">                        |   compatibility matrix    |</w:t>
+        <w:t xml:space="preserve">                        |   compatibility, roadmap  |</w:t>
         <w:br/>
         <w:t xml:space="preserve">                        +-------------+-------------+</w:t>
         <w:br/>
@@ -454,9 +497,9 @@
         <w:br/>
         <w:t xml:space="preserve">                        +---------------------------+</w:t>
         <w:br/>
-        <w:t xml:space="preserve">                        |     civiccore (v0.3.0)    |</w:t>
+        <w:t xml:space="preserve">                        |     civiccore (v0.16.0)   |</w:t>
         <w:br/>
-        <w:t xml:space="preserve">                        |  SHIPPING TODAY:          |</w:t>
+        <w:t xml:space="preserve">                        |  shipping today:          |</w:t>
         <w:br/>
         <w:t xml:space="preserve">                        |  migrations, db.Base, llm |</w:t>
         <w:br/>
@@ -464,21 +507,9 @@
         <w:br/>
         <w:t xml:space="preserve">                        |  manifests, exports,      |</w:t>
         <w:br/>
-        <w:t xml:space="preserve">                        |  city profiles            |</w:t>
+        <w:t xml:space="preserve">                        |  city profiles, auth,     |</w:t>
         <w:br/>
-        <w:t xml:space="preserve">                        |                           |</w:t>
-        <w:br/>
-        <w:t xml:space="preserve">                        |  PLANNED / NOT SHIPPED:   |</w:t>
-        <w:br/>
-        <w:t xml:space="preserve">                        |  auth/RBAC, ingestion,    |</w:t>
-        <w:br/>
-        <w:t xml:space="preserve">                        |  search, notifications,   |</w:t>
-        <w:br/>
-        <w:t xml:space="preserve">                        |  onboarding, exemptions,  |</w:t>
-        <w:br/>
-        <w:t xml:space="preserve">                        |  verification, live       |</w:t>
-        <w:br/>
-        <w:t xml:space="preserve">                        |  connector sync           |</w:t>
+        <w:t xml:space="preserve">                        |  notice compliance        |</w:t>
         <w:br/>
         <w:t xml:space="preserve">                        +-------------+-------------+</w:t>
         <w:br/>
@@ -492,21 +523,13 @@
         <w:br/>
         <w:t xml:space="preserve">   +----------+----------+   +--------+---------+   +---------+--------+</w:t>
         <w:br/>
-        <w:t xml:space="preserve">   | civicrecords-ai     |   |   civicclerk     |   |   civiczone      |</w:t>
+        <w:t xml:space="preserve">   | civicrecords-ai     |   | civicclerk       |   | foundation tier  |</w:t>
         <w:br/>
-        <w:t xml:space="preserve">   |   v1.4.0 SHIPPING   |   | v0.1.0 SHIPPING  |   | v0.1.1 SHIPPING |</w:t>
+        <w:t xml:space="preserve">   | v1.4.3 shipping     |   | v0.1.11          |   | civicaccess ...  |</w:t>
         <w:br/>
-        <w:t xml:space="preserve">   |   FOIA / public     |   |  meetings,       |   |  zoning, parcel  |</w:t>
-        <w:br/>
-        <w:t xml:space="preserve">   |   records mgmt      |   |  agendas, votes  |   |  workflows       |</w:t>
+        <w:t xml:space="preserve">   | FOIA / records      |   | productizing     |   | civiczone        |</w:t>
         <w:br/>
         <w:t xml:space="preserve">   +---------------------+   +------------------+   +------------------+</w:t>
-        <w:br/>
-        <w:t xml:space="preserve">              |</w:t>
-        <w:br/>
-        <w:t xml:space="preserve">              | future modules: civiccode, civiccirculate, ...</w:t>
-        <w:br/>
-        <w:t xml:space="preserve">              | (see specs/01_catalog.md — 26 modules across 7 tiers)</w:t>
       </w:r>
     </w:p>
     <w:p>
@@ -514,12 +537,37 @@
         <w:pStyle w:val="Heading3"/>
       </w:pPr>
       <w:r>
-        <w:t>Dependency rule</w:t>
+        <w:t>Upgrade and migration order</w:t>
       </w:r>
     </w:p>
     <w:p>
       <w:r>
-        <w:t>**Modules import from civiccore. Civiccore never imports from modules.** This is the core architectural constraint of the suite. It is enforced by a lint rule in CI in the civiccore repo. Violating it would silently couple modules to each other through civiccore and destroy the modular install promise.</w:t>
+        <w:t>When `civiccore` ships a backward-compatible change:</w:t>
+      </w:r>
+    </w:p>
+    <w:p>
+      <w:r>
+        <w:t>1. `civiccore` releases the new version.</w:t>
+        <w:br/>
+        <w:t>2. The compatibility matrix is updated.</w:t>
+        <w:br/>
+        <w:t>3. Consumer modules adopt the new version using the standard rollout playbook.</w:t>
+      </w:r>
+    </w:p>
+    <w:p>
+      <w:r>
+        <w:t>When `civiccore` ships a breaking change:</w:t>
+      </w:r>
+    </w:p>
+    <w:p>
+      <w:r>
+        <w:t>1. The change is documented in advance.</w:t>
+        <w:br/>
+        <w:t>2. `civiccore` releases first.</w:t>
+        <w:br/>
+        <w:t>3. Consumers ship paired changes.</w:t>
+        <w:br/>
+        <w:t>4. The compatibility matrix records the new pairing.</w:t>
       </w:r>
     </w:p>
     <w:p>
@@ -527,37 +575,27 @@
         <w:pStyle w:val="Heading3"/>
       </w:pPr>
       <w:r>
-        <w:t>Migration / upgrade order</w:t>
+        <w:t>Continuity and governance</w:t>
       </w:r>
     </w:p>
     <w:p>
       <w:r>
-        <w:t>When civiccore ships a backward-compatible version (PATCH or MINOR):</w:t>
+        <w:t>Continuity is now a gate, not a future aspiration. The current continuity baseline is documented in:</w:t>
       </w:r>
     </w:p>
     <w:p>
       <w:r>
-        <w:t>1. civiccore releases the new version.</w:t>
-        <w:br/>
-        <w:t>2. The umbrella's compatibility matrix is updated.</w:t>
-        <w:br/>
-        <w:t>3. Module maintainers update their pin opportunistically (no forced upgrade).</w:t>
+        <w:t>- [SUCCESSION.md](SUCCESSION.md)</w:t>
       </w:r>
     </w:p>
     <w:p>
       <w:r>
-        <w:t>When civiccore ships a breaking version (MAJOR):</w:t>
+        <w:t>The roadmap that governs the rest of the program lives here:</w:t>
       </w:r>
     </w:p>
     <w:p>
       <w:r>
-        <w:t>1. The breaking change is announced in advance via an ADR.</w:t>
-        <w:br/>
-        <w:t>2. civiccore releases the new MAJOR version.</w:t>
-        <w:br/>
-        <w:t>3. Each module that consumes civiccore ships a paired MAJOR release pinned to the new civiccore version.</w:t>
-        <w:br/>
-        <w:t>4. The compatibility matrix is updated to show both the old (still supported) and new pairing during a transition window.</w:t>
+        <w:t>- [docs/roadmap/index.md](docs/roadmap/index.md)</w:t>
       </w:r>
     </w:p>
     <w:p>
@@ -570,15 +608,15 @@
     </w:p>
     <w:p>
       <w:r>
-        <w:t>- **ADR** — Architecture Decision Record; a short, dated document recording a significant architectural decision and its rationale.</w:t>
+        <w:t>- **ADR** - Architecture Decision Record.</w:t>
         <w:br/>
-        <w:t>- **Pinned version** — a specific exact version a module requires of civiccore (for example `==0.3.0` for current foundation modules, or an older exact pin preserved for historical releases), as opposed to a range.</w:t>
+        <w:t>- **CI** - continuous integration.</w:t>
         <w:br/>
-        <w:t>- **Wheel** — the standard Python package distribution format. civiccore is published as a wheel.</w:t>
+        <w:t>- **Pinned version** - a specific exact dependency pairing rather than a range.</w:t>
         <w:br/>
-        <w:t>- **CI** — continuous integration; the automated test pipeline that runs on every commit and pull request.</w:t>
+        <w:t>- **Wheel** - the Python package distribution format used for released artifacts.</w:t>
         <w:br/>
-        <w:t>- **Monorepo** — a single repository containing multiple projects. CivicSuite is deliberately *not* a monorepo; each module has its own repo so cities can install modules independently.</w:t>
+        <w:t>- **Monorepo** - a single repository containing multiple projects. CivicSuite is deliberately not a monorepo.</w:t>
       </w:r>
     </w:p>
     <w:p>
@@ -591,7 +629,7 @@
         <w:pStyle w:val="Heading2"/>
       </w:pPr>
       <w:r>
-        <w:t>What to do when something goes wrong</w:t>
+        <w:t>When something goes wrong</w:t>
       </w:r>
     </w:p>
     <w:p>
@@ -600,15 +638,15 @@
         <w:br/>
         <w:t>|---|---|</w:t>
         <w:br/>
-        <w:t>| Module won't install | The module's `README.md` and `CONTRIBUTING.md` setup steps. Most install errors are resolved by matching the documented Python/PostgreSQL/Redis versions. |</w:t>
+        <w:t>| Module will not install | The module repo's `README.md` and `CONTRIBUTING.md` |</w:t>
         <w:br/>
-        <w:t>| civiccore pin mismatch | The compatibility matrix at [docs/compatibility/index.md](docs/compatibility/index.md). |</w:t>
+        <w:t>| `civiccore` version mismatch | [docs/compatibility/index.md](docs/compatibility/index.md) |</w:t>
         <w:br/>
-        <w:t>| You found a bug, don't know where to file | The bug-routing decision tree in [CONTRIBUTING.md](CONTRIBUTING.md). |</w:t>
+        <w:t>| Unsure where to file a bug | [CONTRIBUTING.md](CONTRIBUTING.md) |</w:t>
         <w:br/>
-        <w:t>| Security issue | [SECURITY.md](SECURITY.md). |</w:t>
+        <w:t>| Security issue | [SECURITY.md](SECURITY.md) |</w:t>
         <w:br/>
-        <w:t>| You have a general question | [SUPPORT.md](SUPPORT.md). |</w:t>
+        <w:t>| General support question | [SUPPORT.md](SUPPORT.md) |</w:t>
       </w:r>
     </w:p>
     <w:sectPr>

</xml_diff>

<commit_message>
docs: publish CivicCore 0.18.1 suite sync
</commit_message>
<xml_diff>
--- a/USER-MANUAL.docx
+++ b/USER-MANUAL.docx
@@ -76,16 +76,16 @@
         <w:pStyle w:val="Heading3"/>
       </w:pPr>
       <w:r>
-        <w:t>What is available today? (as of 2026-04-30)</w:t>
+        <w:t>What is available today? (as of 2026-05-02)</w:t>
       </w:r>
     </w:p>
     <w:p>
       <w:r>
-        <w:t>- **`civicrecords-ai v1.4.3`** - the shipping product for public-records and FOIA workflow. Repo: &lt;https://github.com/CivicSuite/civicrecords-ai&gt;</w:t>
+        <w:t>- **`civicrecords-ai v1.4.5`** - the shipping product for public-records and FOIA workflow. Repo: &lt;https://github.com/CivicSuite/civicrecords-ai&gt;</w:t>
         <w:br/>
-        <w:t>- **`civiccore v0.16.0`** - the shared platform package. It currently ships migrations, the shared SQLAlchemy `Base`, the LLM abstraction layer, audit/provenance primitives, export/manifest helpers, city profiles, auth/RBAC helpers, notice-compliance helpers, onboarding profile helpers, search/access helpers, connector/import helpers, release-evidence helpers, and trusted-header config/proxy enforcement helpers. Repo: &lt;https://github.com/CivicSuite/civiccore&gt;</w:t>
+        <w:t>- **`civiccore v0.18.1`** - the shared platform package. It currently ships migrations, the shared SQLAlchemy `Base`, the LLM abstraction layer, audit/provenance primitives, export/manifest helpers, city profiles, auth/RBAC helpers, notice-compliance helpers, onboarding profile helpers, search/access helpers, connector/import helpers, live-sync retry/circuit primitives, release-evidence helpers, and trusted-header config/proxy enforcement helpers. Repo: &lt;https://github.com/CivicSuite/civiccore&gt;</w:t>
         <w:br/>
-        <w:t>- **`civicclerk v0.1.11`** - the productizing second-product candidate for meetings, agendas, packets, minutes, voting, and sunshine-law compliance. It already ships meaningful workflow depth, live `/staff` screens, the first `/public` shell, browser QA gates, connector import surfaces, auth readiness, install rehearsal helpers, release handoff helpers, deployment preflight, and shared `civiccore v0.16.0` reuse. Repo: &lt;https://github.com/CivicSuite/civicclerk&gt;</w:t>
+        <w:t>- **`civicclerk v0.1.15`** - the productizing second-product candidate for meetings, agendas, packets, minutes, voting, and sunshine-law compliance. It now ships all four MVP workflow surfaces in React, the resident public portal, Docker Compose product rehearsal, seeded Brookfield demo data, OIDC browser-session foundations, backup/restore rehearsal, vendor-network live sync with shared CivicCore retry/circuit primitives, scheduled local connector import sync, installer source packaging, enterprise signing readiness, and shared `civiccore v0.18.1` reuse. Repo: &lt;https://github.com/CivicSuite/civicclerk&gt;</w:t>
         <w:br/>
         <w:t>- **`CivicRegWatch` and `CivicAPI`** - newly added planned modules. CivicRegWatch is the federal regulatory intelligence module. CivicAPI is the public read-only data gateway over human-approved CivicSuite publication records. Their implementation specs live in [specs/05_civicregwatch.md](specs/05_civicregwatch.md) and [specs/06_civicapi.md](specs/06_civicapi.md).</w:t>
       </w:r>
@@ -137,9 +137,14 @@
         <w:br/>
         <w:t>| Shipping | 1 of 28 product modules | `civicrecords-ai` is the current production-usable module. |</w:t>
         <w:br/>
-        <w:t>| Productizing | 1 of 28 product modules | `civicclerk` has real product depth but still needs full app, portal, installer, identity, backup/restore, and live-sync hardening. |</w:t>
+        <w:t>| Productizing | 1 of 28 product modules | `civicclerk` has real React product depth, Docker Compose product rehearsal, install rehearsal, backup/restore rehearsal, release handoff, OIDC browser-session foundations, vendor-network live sync, installer source packaging, and enterprise signing readiness. It still needs production deployment hardening before production city use. |</w:t>
         <w:br/>
         <w:t>| Foundation / planned | 26 of 28 product modules | The rest of the catalog has real runtime foundations or new implementation specs, but not yet full product depth. |</w:t>
+      </w:r>
+    </w:p>
+    <w:p>
+      <w:r>
+        <w:t>During the developer process, Windows installers should be treated as unsigned unless a module explicitly says otherwise. A first install can show a Windows SmartScreen or untrusted-publisher warning because code-signing certificates are not available for the whole developer cycle.</w:t>
       </w:r>
     </w:p>
     <w:p>
@@ -248,11 +253,11 @@
         <w:br/>
         <w:t>|---|---|</w:t>
         <w:br/>
-        <w:t>| `civicrecords-ai` | Shipping `v1.4.3` flagship product |</w:t>
+        <w:t>| `civicrecords-ai` | Shipping `v1.4.5` flagship product |</w:t>
         <w:br/>
-        <w:t>| `civiccore` | Shipping `v0.16.0` shared platform package |</w:t>
+        <w:t>| `civiccore` | Shipping `v0.18.1` shared platform package |</w:t>
         <w:br/>
-        <w:t>| `civicclerk` | Productizing `v0.1.11` second-product candidate |</w:t>
+        <w:t>| `civicclerk` | Productizing `v0.1.15` second-product candidate |</w:t>
         <w:br/>
         <w:t>| `civicregwatch` | Planned module; spec exists, repo not scaffolded yet |</w:t>
         <w:br/>
@@ -497,7 +502,7 @@
         <w:br/>
         <w:t xml:space="preserve">                        +---------------------------+</w:t>
         <w:br/>
-        <w:t xml:space="preserve">                        |     civiccore (v0.16.0)   |</w:t>
+        <w:t xml:space="preserve">                        |     civiccore (v0.18.1)   |</w:t>
         <w:br/>
         <w:t xml:space="preserve">                        |  shipping today:          |</w:t>
         <w:br/>
@@ -525,7 +530,7 @@
         <w:br/>
         <w:t xml:space="preserve">   | civicrecords-ai     |   | civicclerk       |   | foundation tier  |</w:t>
         <w:br/>
-        <w:t xml:space="preserve">   | v1.4.3 shipping     |   | v0.1.11          |   | civicaccess ...  |</w:t>
+        <w:t xml:space="preserve">   | v1.4.5 shipping     |   | v0.1.15          |   | civicaccess ...  |</w:t>
         <w:br/>
         <w:t xml:space="preserve">   | FOIA / records      |   | productizing     |   | civiczone        |</w:t>
         <w:br/>

</xml_diff>

<commit_message>
docs: publish CivicCore 0.18.1 suite sync (#77)
Co-authored-by: Scott Converse <scott@civicsuite.local>
</commit_message>
<xml_diff>
--- a/USER-MANUAL.docx
+++ b/USER-MANUAL.docx
@@ -76,16 +76,16 @@
         <w:pStyle w:val="Heading3"/>
       </w:pPr>
       <w:r>
-        <w:t>What is available today? (as of 2026-04-30)</w:t>
+        <w:t>What is available today? (as of 2026-05-02)</w:t>
       </w:r>
     </w:p>
     <w:p>
       <w:r>
-        <w:t>- **`civicrecords-ai v1.4.3`** - the shipping product for public-records and FOIA workflow. Repo: &lt;https://github.com/CivicSuite/civicrecords-ai&gt;</w:t>
+        <w:t>- **`civicrecords-ai v1.4.5`** - the shipping product for public-records and FOIA workflow. Repo: &lt;https://github.com/CivicSuite/civicrecords-ai&gt;</w:t>
         <w:br/>
-        <w:t>- **`civiccore v0.16.0`** - the shared platform package. It currently ships migrations, the shared SQLAlchemy `Base`, the LLM abstraction layer, audit/provenance primitives, export/manifest helpers, city profiles, auth/RBAC helpers, notice-compliance helpers, onboarding profile helpers, search/access helpers, connector/import helpers, release-evidence helpers, and trusted-header config/proxy enforcement helpers. Repo: &lt;https://github.com/CivicSuite/civiccore&gt;</w:t>
+        <w:t>- **`civiccore v0.18.1`** - the shared platform package. It currently ships migrations, the shared SQLAlchemy `Base`, the LLM abstraction layer, audit/provenance primitives, export/manifest helpers, city profiles, auth/RBAC helpers, notice-compliance helpers, onboarding profile helpers, search/access helpers, connector/import helpers, live-sync retry/circuit primitives, release-evidence helpers, and trusted-header config/proxy enforcement helpers. Repo: &lt;https://github.com/CivicSuite/civiccore&gt;</w:t>
         <w:br/>
-        <w:t>- **`civicclerk v0.1.11`** - the productizing second-product candidate for meetings, agendas, packets, minutes, voting, and sunshine-law compliance. It already ships meaningful workflow depth, live `/staff` screens, the first `/public` shell, browser QA gates, connector import surfaces, auth readiness, install rehearsal helpers, release handoff helpers, deployment preflight, and shared `civiccore v0.16.0` reuse. Repo: &lt;https://github.com/CivicSuite/civicclerk&gt;</w:t>
+        <w:t>- **`civicclerk v0.1.15`** - the productizing second-product candidate for meetings, agendas, packets, minutes, voting, and sunshine-law compliance. It now ships all four MVP workflow surfaces in React, the resident public portal, Docker Compose product rehearsal, seeded Brookfield demo data, OIDC browser-session foundations, backup/restore rehearsal, vendor-network live sync with shared CivicCore retry/circuit primitives, scheduled local connector import sync, installer source packaging, enterprise signing readiness, and shared `civiccore v0.18.1` reuse. Repo: &lt;https://github.com/CivicSuite/civicclerk&gt;</w:t>
         <w:br/>
         <w:t>- **`CivicRegWatch` and `CivicAPI`** - newly added planned modules. CivicRegWatch is the federal regulatory intelligence module. CivicAPI is the public read-only data gateway over human-approved CivicSuite publication records. Their implementation specs live in [specs/05_civicregwatch.md](specs/05_civicregwatch.md) and [specs/06_civicapi.md](specs/06_civicapi.md).</w:t>
       </w:r>
@@ -137,9 +137,14 @@
         <w:br/>
         <w:t>| Shipping | 1 of 28 product modules | `civicrecords-ai` is the current production-usable module. |</w:t>
         <w:br/>
-        <w:t>| Productizing | 1 of 28 product modules | `civicclerk` has real product depth but still needs full app, portal, installer, identity, backup/restore, and live-sync hardening. |</w:t>
+        <w:t>| Productizing | 1 of 28 product modules | `civicclerk` has real React product depth, Docker Compose product rehearsal, install rehearsal, backup/restore rehearsal, release handoff, OIDC browser-session foundations, vendor-network live sync, installer source packaging, and enterprise signing readiness. It still needs production deployment hardening before production city use. |</w:t>
         <w:br/>
         <w:t>| Foundation / planned | 26 of 28 product modules | The rest of the catalog has real runtime foundations or new implementation specs, but not yet full product depth. |</w:t>
+      </w:r>
+    </w:p>
+    <w:p>
+      <w:r>
+        <w:t>During the developer process, Windows installers should be treated as unsigned unless a module explicitly says otherwise. A first install can show a Windows SmartScreen or untrusted-publisher warning because code-signing certificates are not available for the whole developer cycle.</w:t>
       </w:r>
     </w:p>
     <w:p>
@@ -248,11 +253,11 @@
         <w:br/>
         <w:t>|---|---|</w:t>
         <w:br/>
-        <w:t>| `civicrecords-ai` | Shipping `v1.4.3` flagship product |</w:t>
+        <w:t>| `civicrecords-ai` | Shipping `v1.4.5` flagship product |</w:t>
         <w:br/>
-        <w:t>| `civiccore` | Shipping `v0.16.0` shared platform package |</w:t>
+        <w:t>| `civiccore` | Shipping `v0.18.1` shared platform package |</w:t>
         <w:br/>
-        <w:t>| `civicclerk` | Productizing `v0.1.11` second-product candidate |</w:t>
+        <w:t>| `civicclerk` | Productizing `v0.1.15` second-product candidate |</w:t>
         <w:br/>
         <w:t>| `civicregwatch` | Planned module; spec exists, repo not scaffolded yet |</w:t>
         <w:br/>
@@ -497,7 +502,7 @@
         <w:br/>
         <w:t xml:space="preserve">                        +---------------------------+</w:t>
         <w:br/>
-        <w:t xml:space="preserve">                        |     civiccore (v0.16.0)   |</w:t>
+        <w:t xml:space="preserve">                        |     civiccore (v0.18.1)   |</w:t>
         <w:br/>
         <w:t xml:space="preserve">                        |  shipping today:          |</w:t>
         <w:br/>
@@ -525,7 +530,7 @@
         <w:br/>
         <w:t xml:space="preserve">   | civicrecords-ai     |   | civicclerk       |   | foundation tier  |</w:t>
         <w:br/>
-        <w:t xml:space="preserve">   | v1.4.3 shipping     |   | v0.1.11          |   | civicaccess ...  |</w:t>
+        <w:t xml:space="preserve">   | v1.4.5 shipping     |   | v0.1.15          |   | civicaccess ...  |</w:t>
         <w:br/>
         <w:t xml:space="preserve">   | FOIA / records      |   | productizing     |   | civiczone        |</w:t>
         <w:br/>

</xml_diff>

<commit_message>
docs: publish CivicCore 0.19 suite sync
</commit_message>
<xml_diff>
--- a/USER-MANUAL.docx
+++ b/USER-MANUAL.docx
@@ -81,11 +81,11 @@
     </w:p>
     <w:p>
       <w:r>
-        <w:t>- **`civicrecords-ai v1.4.5`** - the shipping product for public-records and FOIA workflow. Repo: &lt;https://github.com/CivicSuite/civicrecords-ai&gt;</w:t>
+        <w:t>- **`civicrecords-ai v1.4.6`** - the shipping product for public-records and FOIA workflow. Repo: &lt;https://github.com/CivicSuite/civicrecords-ai&gt;</w:t>
         <w:br/>
-        <w:t>- **`civiccore v0.18.1`** - the shared platform package. It currently ships migrations, the shared SQLAlchemy `Base`, the LLM abstraction layer, audit/provenance primitives, export/manifest helpers, city profiles, auth/RBAC helpers, notice-compliance helpers, onboarding profile helpers, search/access helpers, connector/import helpers, live-sync retry/circuit primitives, release-evidence helpers, and trusted-header config/proxy enforcement helpers. Repo: &lt;https://github.com/CivicSuite/civiccore&gt;</w:t>
+        <w:t>- **`civiccore v0.19.0`** - the shared platform package. It currently ships migrations, the shared SQLAlchemy `Base`, the LLM abstraction layer, audit/provenance primitives, export/manifest helpers, city profiles, auth/RBAC helpers, notice-compliance helpers, onboarding profile helpers, search/access helpers, connector/import helpers, live-sync retry/circuit primitives, reusable vendor-delta planning, reusable mock-city vendor/IdP/backup-retention contracts, release-evidence helpers, and trusted-header config/proxy enforcement helpers. Repo: &lt;https://github.com/CivicSuite/civiccore&gt;</w:t>
         <w:br/>
-        <w:t>- **`civicclerk v0.1.15`** - the productizing second-product candidate for meetings, agendas, packets, minutes, voting, and sunshine-law compliance. It now ships all four MVP workflow surfaces in React, the resident public portal, Docker Compose product rehearsal, seeded Brookfield demo data, OIDC browser-session foundations, backup/restore rehearsal, vendor-network live sync with shared CivicCore retry/circuit primitives, scheduled local connector import sync, installer source packaging, enterprise signing readiness, and shared `civiccore v0.18.1` reuse. Repo: &lt;https://github.com/CivicSuite/civicclerk&gt;</w:t>
+        <w:t>- **`civicclerk v0.1.17`** - the productizing second-product candidate for meetings, agendas, packets, minutes, voting, and sunshine-law compliance. It now ships all four MVP workflow surfaces in React, the resident public portal, Docker Compose product rehearsal, seeded Brookfield demo data, OIDC browser-session foundations, backup/restore rehearsal, vendor-network live sync, reusable CivicCore-backed mock municipal IdP and backup-retention contract suites, scheduled local connector import sync, installer source packaging, enterprise signing readiness, and shared `civiccore v0.19.0` reuse. Repo: &lt;https://github.com/CivicSuite/civicclerk&gt;</w:t>
         <w:br/>
         <w:t>- **`CivicRegWatch` and `CivicAPI`** - newly added planned modules. CivicRegWatch is the federal regulatory intelligence module. CivicAPI is the public read-only data gateway over human-approved CivicSuite publication records. Their implementation specs live in [specs/05_civicregwatch.md](specs/05_civicregwatch.md) and [specs/06_civicapi.md](specs/06_civicapi.md).</w:t>
       </w:r>
@@ -253,11 +253,11 @@
         <w:br/>
         <w:t>|---|---|</w:t>
         <w:br/>
-        <w:t>| `civicrecords-ai` | Shipping `v1.4.5` flagship product |</w:t>
+        <w:t>| `civicrecords-ai` | Shipping `v1.4.6` flagship product |</w:t>
         <w:br/>
-        <w:t>| `civiccore` | Shipping `v0.18.1` shared platform package |</w:t>
+        <w:t>| `civiccore` | Shipping `v0.19.0` shared platform package |</w:t>
         <w:br/>
-        <w:t>| `civicclerk` | Productizing `v0.1.15` second-product candidate |</w:t>
+        <w:t>| `civicclerk` | Productizing `v0.1.17` second-product candidate |</w:t>
         <w:br/>
         <w:t>| `civicregwatch` | Planned module; spec exists, repo not scaffolded yet |</w:t>
         <w:br/>
@@ -502,7 +502,7 @@
         <w:br/>
         <w:t xml:space="preserve">                        +---------------------------+</w:t>
         <w:br/>
-        <w:t xml:space="preserve">                        |     civiccore (v0.18.1)   |</w:t>
+        <w:t xml:space="preserve">                        |     civiccore (v0.19.0)   |</w:t>
         <w:br/>
         <w:t xml:space="preserve">                        |  shipping today:          |</w:t>
         <w:br/>
@@ -530,7 +530,7 @@
         <w:br/>
         <w:t xml:space="preserve">   | civicrecords-ai     |   | civicclerk       |   | foundation tier  |</w:t>
         <w:br/>
-        <w:t xml:space="preserve">   | v1.4.5 shipping     |   | v0.1.15          |   | civicaccess ...  |</w:t>
+        <w:t xml:space="preserve">   | v1.4.6 shipping     |   | v0.1.17          |   | civicaccess ...  |</w:t>
         <w:br/>
         <w:t xml:space="preserve">   | FOIA / records      |   | productizing     |   | civiczone        |</w:t>
         <w:br/>

</xml_diff>